<commit_message>
Progreso IPE II - DIW
</commit_message>
<xml_diff>
--- a/Trabajos/Diseño de Interfaces Web/Act1_UD1_IvanMarinViadero.docx
+++ b/Trabajos/Diseño de Interfaces Web/Act1_UD1_IvanMarinViadero.docx
@@ -10,7 +10,6 @@
           <w:docPartUnique/>
         </w:docPartObj>
       </w:sdtPr>
-      <w:sdtEndPr/>
       <w:sdtContent>
         <w:p>
           <w:pPr>
@@ -117,7 +116,6 @@
                                     <w:dataBinding w:prefixMappings="xmlns:ns0='http://purl.org/dc/elements/1.1/' xmlns:ns1='http://schemas.openxmlformats.org/package/2006/metadata/core-properties' " w:xpath="/ns1:coreProperties[1]/ns0:title[1]" w:storeItemID="{6C3C8BC8-F283-45AE-878A-BAB7291924A1}"/>
                                     <w:text/>
                                   </w:sdtPr>
-                                  <w:sdtEndPr/>
                                   <w:sdtContent>
                                     <w:r>
                                       <w:rPr>
@@ -125,7 +123,7 @@
                                         <w:sz w:val="72"/>
                                         <w:szCs w:val="72"/>
                                       </w:rPr>
-                                      <w:t>Tarea 1 - Crear Logotipo - Isotipo - Imagotipo - Isologotipo</w:t>
+                                      <w:t>Manual de Marcas</w:t>
                                     </w:r>
                                   </w:sdtContent>
                                 </w:sdt>
@@ -144,7 +142,6 @@
                                   <w:dataBinding w:prefixMappings="xmlns:ns0='http://purl.org/dc/elements/1.1/' xmlns:ns1='http://schemas.openxmlformats.org/package/2006/metadata/core-properties' " w:xpath="/ns1:coreProperties[1]/ns0:subject[1]" w:storeItemID="{6C3C8BC8-F283-45AE-878A-BAB7291924A1}"/>
                                   <w:text/>
                                 </w:sdtPr>
-                                <w:sdtEndPr/>
                                 <w:sdtContent>
                                   <w:p>
                                     <w:pPr>
@@ -183,7 +180,6 @@
                                   <w:dataBinding w:prefixMappings="xmlns:ns0='http://purl.org/dc/elements/1.1/' xmlns:ns1='http://schemas.openxmlformats.org/package/2006/metadata/core-properties' " w:xpath="/ns1:coreProperties[1]/ns0:creator[1]" w:storeItemID="{6C3C8BC8-F283-45AE-878A-BAB7291924A1}"/>
                                   <w:text/>
                                 </w:sdtPr>
-                                <w:sdtEndPr/>
                                 <w:sdtContent>
                                   <w:p>
                                     <w:pPr>
@@ -260,7 +256,6 @@
                               <w:dataBinding w:prefixMappings="xmlns:ns0='http://purl.org/dc/elements/1.1/' xmlns:ns1='http://schemas.openxmlformats.org/package/2006/metadata/core-properties' " w:xpath="/ns1:coreProperties[1]/ns0:title[1]" w:storeItemID="{6C3C8BC8-F283-45AE-878A-BAB7291924A1}"/>
                               <w:text/>
                             </w:sdtPr>
-                            <w:sdtEndPr/>
                             <w:sdtContent>
                               <w:r>
                                 <w:rPr>
@@ -268,7 +263,7 @@
                                   <w:sz w:val="72"/>
                                   <w:szCs w:val="72"/>
                                 </w:rPr>
-                                <w:t>Tarea 1 - Crear Logotipo - Isotipo - Imagotipo - Isologotipo</w:t>
+                                <w:t>Manual de Marcas</w:t>
                               </w:r>
                             </w:sdtContent>
                           </w:sdt>
@@ -287,7 +282,6 @@
                             <w:dataBinding w:prefixMappings="xmlns:ns0='http://purl.org/dc/elements/1.1/' xmlns:ns1='http://schemas.openxmlformats.org/package/2006/metadata/core-properties' " w:xpath="/ns1:coreProperties[1]/ns0:subject[1]" w:storeItemID="{6C3C8BC8-F283-45AE-878A-BAB7291924A1}"/>
                             <w:text/>
                           </w:sdtPr>
-                          <w:sdtEndPr/>
                           <w:sdtContent>
                             <w:p>
                               <w:pPr>
@@ -326,7 +320,6 @@
                             <w:dataBinding w:prefixMappings="xmlns:ns0='http://purl.org/dc/elements/1.1/' xmlns:ns1='http://schemas.openxmlformats.org/package/2006/metadata/core-properties' " w:xpath="/ns1:coreProperties[1]/ns0:creator[1]" w:storeItemID="{6C3C8BC8-F283-45AE-878A-BAB7291924A1}"/>
                             <w:text/>
                           </w:sdtPr>
-                          <w:sdtEndPr/>
                           <w:sdtContent>
                             <w:p>
                               <w:pPr>
@@ -445,7 +438,6 @@
                                     <w:calendar w:val="gregorian"/>
                                   </w:date>
                                 </w:sdtPr>
-                                <w:sdtEndPr/>
                                 <w:sdtContent>
                                   <w:p>
                                     <w:pPr>
@@ -513,7 +505,6 @@
                               <w:calendar w:val="gregorian"/>
                             </w:date>
                           </w:sdtPr>
-                          <w:sdtEndPr/>
                           <w:sdtContent>
                             <w:p>
                               <w:pPr>
@@ -609,7 +600,7 @@
           <w:r>
             <w:fldChar w:fldCharType="separate"/>
           </w:r>
-          <w:hyperlink w:anchor="_Toc240655326" w:history="1">
+          <w:hyperlink w:anchor="_Toc241165404" w:history="1">
             <w:r>
               <w:rPr>
                 <w:rStyle w:val="Hipervnculo"/>
@@ -636,7 +627,7 @@
                 <w:noProof/>
                 <w:webHidden/>
               </w:rPr>
-              <w:instrText xml:space="preserve"> PAGEREF _Toc240655326 \h </w:instrText>
+              <w:instrText xml:space="preserve"> PAGEREF _Toc241165404 \h </w:instrText>
             </w:r>
             <w:r>
               <w:rPr>
@@ -679,12 +670,82 @@
               <w:lang w:eastAsia="es-ES"/>
             </w:rPr>
           </w:pPr>
-          <w:hyperlink w:anchor="_Toc240655327" w:history="1">
+          <w:hyperlink w:anchor="_Toc241165405" w:history="1">
             <w:r>
               <w:rPr>
                 <w:rStyle w:val="Hipervnculo"/>
                 <w:noProof/>
               </w:rPr>
+              <w:t>Presentación del logotipo</w:t>
+            </w:r>
+            <w:r>
+              <w:rPr>
+                <w:noProof/>
+                <w:webHidden/>
+              </w:rPr>
+              <w:tab/>
+            </w:r>
+            <w:r>
+              <w:rPr>
+                <w:noProof/>
+                <w:webHidden/>
+              </w:rPr>
+              <w:fldChar w:fldCharType="begin"/>
+            </w:r>
+            <w:r>
+              <w:rPr>
+                <w:noProof/>
+                <w:webHidden/>
+              </w:rPr>
+              <w:instrText xml:space="preserve"> PAGEREF _Toc241165405 \h </w:instrText>
+            </w:r>
+            <w:r>
+              <w:rPr>
+                <w:noProof/>
+                <w:webHidden/>
+              </w:rPr>
+            </w:r>
+            <w:r>
+              <w:rPr>
+                <w:noProof/>
+                <w:webHidden/>
+              </w:rPr>
+              <w:fldChar w:fldCharType="separate"/>
+            </w:r>
+            <w:r>
+              <w:rPr>
+                <w:noProof/>
+                <w:webHidden/>
+              </w:rPr>
+              <w:t>3</w:t>
+            </w:r>
+            <w:r>
+              <w:rPr>
+                <w:noProof/>
+                <w:webHidden/>
+              </w:rPr>
+              <w:fldChar w:fldCharType="end"/>
+            </w:r>
+          </w:hyperlink>
+        </w:p>
+        <w:p>
+          <w:pPr>
+            <w:pStyle w:val="TDC2"/>
+            <w:tabs>
+              <w:tab w:val="right" w:leader="dot" w:pos="8494"/>
+            </w:tabs>
+            <w:rPr>
+              <w:rFonts w:eastAsiaTheme="minorEastAsia"/>
+              <w:noProof/>
+              <w:lang w:eastAsia="es-ES"/>
+            </w:rPr>
+          </w:pPr>
+          <w:hyperlink w:anchor="_Toc241165406" w:history="1">
+            <w:r>
+              <w:rPr>
+                <w:rStyle w:val="Hipervnculo"/>
+                <w:noProof/>
+              </w:rPr>
               <w:t>Logotipo</w:t>
             </w:r>
             <w:r>
@@ -706,7 +767,7 @@
                 <w:noProof/>
                 <w:webHidden/>
               </w:rPr>
-              <w:instrText xml:space="preserve"> PAGEREF _Toc240655327 \h </w:instrText>
+              <w:instrText xml:space="preserve"> PAGEREF _Toc241165406 \h </w:instrText>
             </w:r>
             <w:r>
               <w:rPr>
@@ -727,6 +788,286 @@
                 <w:webHidden/>
               </w:rPr>
               <w:t>3</w:t>
+            </w:r>
+            <w:r>
+              <w:rPr>
+                <w:noProof/>
+                <w:webHidden/>
+              </w:rPr>
+              <w:fldChar w:fldCharType="end"/>
+            </w:r>
+          </w:hyperlink>
+        </w:p>
+        <w:p>
+          <w:pPr>
+            <w:pStyle w:val="TDC2"/>
+            <w:tabs>
+              <w:tab w:val="right" w:leader="dot" w:pos="8494"/>
+            </w:tabs>
+            <w:rPr>
+              <w:rFonts w:eastAsiaTheme="minorEastAsia"/>
+              <w:noProof/>
+              <w:lang w:eastAsia="es-ES"/>
+            </w:rPr>
+          </w:pPr>
+          <w:hyperlink w:anchor="_Toc241165407" w:history="1">
+            <w:r>
+              <w:rPr>
+                <w:rStyle w:val="Hipervnculo"/>
+                <w:noProof/>
+              </w:rPr>
+              <w:t>Isotipo</w:t>
+            </w:r>
+            <w:r>
+              <w:rPr>
+                <w:noProof/>
+                <w:webHidden/>
+              </w:rPr>
+              <w:tab/>
+            </w:r>
+            <w:r>
+              <w:rPr>
+                <w:noProof/>
+                <w:webHidden/>
+              </w:rPr>
+              <w:fldChar w:fldCharType="begin"/>
+            </w:r>
+            <w:r>
+              <w:rPr>
+                <w:noProof/>
+                <w:webHidden/>
+              </w:rPr>
+              <w:instrText xml:space="preserve"> PAGEREF _Toc241165407 \h </w:instrText>
+            </w:r>
+            <w:r>
+              <w:rPr>
+                <w:noProof/>
+                <w:webHidden/>
+              </w:rPr>
+            </w:r>
+            <w:r>
+              <w:rPr>
+                <w:noProof/>
+                <w:webHidden/>
+              </w:rPr>
+              <w:fldChar w:fldCharType="separate"/>
+            </w:r>
+            <w:r>
+              <w:rPr>
+                <w:noProof/>
+                <w:webHidden/>
+              </w:rPr>
+              <w:t>3</w:t>
+            </w:r>
+            <w:r>
+              <w:rPr>
+                <w:noProof/>
+                <w:webHidden/>
+              </w:rPr>
+              <w:fldChar w:fldCharType="end"/>
+            </w:r>
+          </w:hyperlink>
+        </w:p>
+        <w:p>
+          <w:pPr>
+            <w:pStyle w:val="TDC2"/>
+            <w:tabs>
+              <w:tab w:val="right" w:leader="dot" w:pos="8494"/>
+            </w:tabs>
+            <w:rPr>
+              <w:rFonts w:eastAsiaTheme="minorEastAsia"/>
+              <w:noProof/>
+              <w:lang w:eastAsia="es-ES"/>
+            </w:rPr>
+          </w:pPr>
+          <w:hyperlink w:anchor="_Toc241165408" w:history="1">
+            <w:r>
+              <w:rPr>
+                <w:rStyle w:val="Hipervnculo"/>
+                <w:noProof/>
+              </w:rPr>
+              <w:t>Imagotipo</w:t>
+            </w:r>
+            <w:r>
+              <w:rPr>
+                <w:noProof/>
+                <w:webHidden/>
+              </w:rPr>
+              <w:tab/>
+            </w:r>
+            <w:r>
+              <w:rPr>
+                <w:noProof/>
+                <w:webHidden/>
+              </w:rPr>
+              <w:fldChar w:fldCharType="begin"/>
+            </w:r>
+            <w:r>
+              <w:rPr>
+                <w:noProof/>
+                <w:webHidden/>
+              </w:rPr>
+              <w:instrText xml:space="preserve"> PAGEREF _Toc241165408 \h </w:instrText>
+            </w:r>
+            <w:r>
+              <w:rPr>
+                <w:noProof/>
+                <w:webHidden/>
+              </w:rPr>
+            </w:r>
+            <w:r>
+              <w:rPr>
+                <w:noProof/>
+                <w:webHidden/>
+              </w:rPr>
+              <w:fldChar w:fldCharType="separate"/>
+            </w:r>
+            <w:r>
+              <w:rPr>
+                <w:noProof/>
+                <w:webHidden/>
+              </w:rPr>
+              <w:t>4</w:t>
+            </w:r>
+            <w:r>
+              <w:rPr>
+                <w:noProof/>
+                <w:webHidden/>
+              </w:rPr>
+              <w:fldChar w:fldCharType="end"/>
+            </w:r>
+          </w:hyperlink>
+        </w:p>
+        <w:p>
+          <w:pPr>
+            <w:pStyle w:val="TDC2"/>
+            <w:tabs>
+              <w:tab w:val="right" w:leader="dot" w:pos="8494"/>
+            </w:tabs>
+            <w:rPr>
+              <w:rFonts w:eastAsiaTheme="minorEastAsia"/>
+              <w:noProof/>
+              <w:lang w:eastAsia="es-ES"/>
+            </w:rPr>
+          </w:pPr>
+          <w:hyperlink w:anchor="_Toc241165409" w:history="1">
+            <w:r>
+              <w:rPr>
+                <w:rStyle w:val="Hipervnculo"/>
+                <w:noProof/>
+              </w:rPr>
+              <w:t>Isologotipo</w:t>
+            </w:r>
+            <w:r>
+              <w:rPr>
+                <w:noProof/>
+                <w:webHidden/>
+              </w:rPr>
+              <w:tab/>
+            </w:r>
+            <w:r>
+              <w:rPr>
+                <w:noProof/>
+                <w:webHidden/>
+              </w:rPr>
+              <w:fldChar w:fldCharType="begin"/>
+            </w:r>
+            <w:r>
+              <w:rPr>
+                <w:noProof/>
+                <w:webHidden/>
+              </w:rPr>
+              <w:instrText xml:space="preserve"> PAGEREF _Toc241165409 \h </w:instrText>
+            </w:r>
+            <w:r>
+              <w:rPr>
+                <w:noProof/>
+                <w:webHidden/>
+              </w:rPr>
+            </w:r>
+            <w:r>
+              <w:rPr>
+                <w:noProof/>
+                <w:webHidden/>
+              </w:rPr>
+              <w:fldChar w:fldCharType="separate"/>
+            </w:r>
+            <w:r>
+              <w:rPr>
+                <w:noProof/>
+                <w:webHidden/>
+              </w:rPr>
+              <w:t>4</w:t>
+            </w:r>
+            <w:r>
+              <w:rPr>
+                <w:noProof/>
+                <w:webHidden/>
+              </w:rPr>
+              <w:fldChar w:fldCharType="end"/>
+            </w:r>
+          </w:hyperlink>
+        </w:p>
+        <w:p>
+          <w:pPr>
+            <w:pStyle w:val="TDC2"/>
+            <w:tabs>
+              <w:tab w:val="right" w:leader="dot" w:pos="8494"/>
+            </w:tabs>
+            <w:rPr>
+              <w:rFonts w:eastAsiaTheme="minorEastAsia"/>
+              <w:noProof/>
+              <w:lang w:eastAsia="es-ES"/>
+            </w:rPr>
+          </w:pPr>
+          <w:hyperlink w:anchor="_Toc241165410" w:history="1">
+            <w:r>
+              <w:rPr>
+                <w:rStyle w:val="Hipervnculo"/>
+                <w:noProof/>
+              </w:rPr>
+              <w:t>Teoría de color</w:t>
+            </w:r>
+            <w:r>
+              <w:rPr>
+                <w:noProof/>
+                <w:webHidden/>
+              </w:rPr>
+              <w:tab/>
+            </w:r>
+            <w:r>
+              <w:rPr>
+                <w:noProof/>
+                <w:webHidden/>
+              </w:rPr>
+              <w:fldChar w:fldCharType="begin"/>
+            </w:r>
+            <w:r>
+              <w:rPr>
+                <w:noProof/>
+                <w:webHidden/>
+              </w:rPr>
+              <w:instrText xml:space="preserve"> PAGEREF _Toc241165410 \h </w:instrText>
+            </w:r>
+            <w:r>
+              <w:rPr>
+                <w:noProof/>
+                <w:webHidden/>
+              </w:rPr>
+            </w:r>
+            <w:r>
+              <w:rPr>
+                <w:noProof/>
+                <w:webHidden/>
+              </w:rPr>
+              <w:fldChar w:fldCharType="separate"/>
+            </w:r>
+            <w:r>
+              <w:rPr>
+                <w:noProof/>
+                <w:webHidden/>
+              </w:rPr>
+              <w:t>5</w:t>
             </w:r>
             <w:r>
               <w:rPr>
@@ -749,13 +1090,13 @@
               <w:lang w:eastAsia="es-ES"/>
             </w:rPr>
           </w:pPr>
-          <w:hyperlink w:anchor="_Toc240655328" w:history="1">
+          <w:hyperlink w:anchor="_Toc241165411" w:history="1">
             <w:r>
               <w:rPr>
                 <w:rStyle w:val="Hipervnculo"/>
                 <w:noProof/>
               </w:rPr>
-              <w:t>Isotipo</w:t>
+              <w:t>Estructura y composición</w:t>
             </w:r>
             <w:r>
               <w:rPr>
@@ -776,7 +1117,7 @@
                 <w:noProof/>
                 <w:webHidden/>
               </w:rPr>
-              <w:instrText xml:space="preserve"> PAGEREF _Toc240655328 \h </w:instrText>
+              <w:instrText xml:space="preserve"> PAGEREF _Toc241165411 \h </w:instrText>
             </w:r>
             <w:r>
               <w:rPr>
@@ -796,7 +1137,7 @@
                 <w:noProof/>
                 <w:webHidden/>
               </w:rPr>
-              <w:t>3</w:t>
+              <w:t>6</w:t>
             </w:r>
             <w:r>
               <w:rPr>
@@ -819,13 +1160,13 @@
               <w:lang w:eastAsia="es-ES"/>
             </w:rPr>
           </w:pPr>
-          <w:hyperlink w:anchor="_Toc240655329" w:history="1">
+          <w:hyperlink w:anchor="_Toc241165412" w:history="1">
             <w:r>
               <w:rPr>
                 <w:rStyle w:val="Hipervnculo"/>
                 <w:noProof/>
               </w:rPr>
-              <w:t>Imagotipo</w:t>
+              <w:t>Área de protección</w:t>
             </w:r>
             <w:r>
               <w:rPr>
@@ -846,7 +1187,7 @@
                 <w:noProof/>
                 <w:webHidden/>
               </w:rPr>
-              <w:instrText xml:space="preserve"> PAGEREF _Toc240655329 \h </w:instrText>
+              <w:instrText xml:space="preserve"> PAGEREF _Toc241165412 \h </w:instrText>
             </w:r>
             <w:r>
               <w:rPr>
@@ -866,7 +1207,7 @@
                 <w:noProof/>
                 <w:webHidden/>
               </w:rPr>
-              <w:t>4</w:t>
+              <w:t>6</w:t>
             </w:r>
             <w:r>
               <w:rPr>
@@ -889,13 +1230,13 @@
               <w:lang w:eastAsia="es-ES"/>
             </w:rPr>
           </w:pPr>
-          <w:hyperlink w:anchor="_Toc240655330" w:history="1">
+          <w:hyperlink w:anchor="_Toc241165413" w:history="1">
             <w:r>
               <w:rPr>
                 <w:rStyle w:val="Hipervnculo"/>
                 <w:noProof/>
               </w:rPr>
-              <w:t>Isologotipo</w:t>
+              <w:t>Tipografías</w:t>
             </w:r>
             <w:r>
               <w:rPr>
@@ -916,7 +1257,7 @@
                 <w:noProof/>
                 <w:webHidden/>
               </w:rPr>
-              <w:instrText xml:space="preserve"> PAGEREF _Toc240655330 \h </w:instrText>
+              <w:instrText xml:space="preserve"> PAGEREF _Toc241165413 \h </w:instrText>
             </w:r>
             <w:r>
               <w:rPr>
@@ -936,7 +1277,147 @@
                 <w:noProof/>
                 <w:webHidden/>
               </w:rPr>
-              <w:t>4</w:t>
+              <w:t>6</w:t>
+            </w:r>
+            <w:r>
+              <w:rPr>
+                <w:noProof/>
+                <w:webHidden/>
+              </w:rPr>
+              <w:fldChar w:fldCharType="end"/>
+            </w:r>
+          </w:hyperlink>
+        </w:p>
+        <w:p>
+          <w:pPr>
+            <w:pStyle w:val="TDC2"/>
+            <w:tabs>
+              <w:tab w:val="right" w:leader="dot" w:pos="8494"/>
+            </w:tabs>
+            <w:rPr>
+              <w:rFonts w:eastAsiaTheme="minorEastAsia"/>
+              <w:noProof/>
+              <w:lang w:eastAsia="es-ES"/>
+            </w:rPr>
+          </w:pPr>
+          <w:hyperlink w:anchor="_Toc241165414" w:history="1">
+            <w:r>
+              <w:rPr>
+                <w:rStyle w:val="Hipervnculo"/>
+                <w:noProof/>
+              </w:rPr>
+              <w:t>Principales</w:t>
+            </w:r>
+            <w:r>
+              <w:rPr>
+                <w:noProof/>
+                <w:webHidden/>
+              </w:rPr>
+              <w:tab/>
+            </w:r>
+            <w:r>
+              <w:rPr>
+                <w:noProof/>
+                <w:webHidden/>
+              </w:rPr>
+              <w:fldChar w:fldCharType="begin"/>
+            </w:r>
+            <w:r>
+              <w:rPr>
+                <w:noProof/>
+                <w:webHidden/>
+              </w:rPr>
+              <w:instrText xml:space="preserve"> PAGEREF _Toc241165414 \h </w:instrText>
+            </w:r>
+            <w:r>
+              <w:rPr>
+                <w:noProof/>
+                <w:webHidden/>
+              </w:rPr>
+            </w:r>
+            <w:r>
+              <w:rPr>
+                <w:noProof/>
+                <w:webHidden/>
+              </w:rPr>
+              <w:fldChar w:fldCharType="separate"/>
+            </w:r>
+            <w:r>
+              <w:rPr>
+                <w:noProof/>
+                <w:webHidden/>
+              </w:rPr>
+              <w:t>6</w:t>
+            </w:r>
+            <w:r>
+              <w:rPr>
+                <w:noProof/>
+                <w:webHidden/>
+              </w:rPr>
+              <w:fldChar w:fldCharType="end"/>
+            </w:r>
+          </w:hyperlink>
+        </w:p>
+        <w:p>
+          <w:pPr>
+            <w:pStyle w:val="TDC2"/>
+            <w:tabs>
+              <w:tab w:val="right" w:leader="dot" w:pos="8494"/>
+            </w:tabs>
+            <w:rPr>
+              <w:rFonts w:eastAsiaTheme="minorEastAsia"/>
+              <w:noProof/>
+              <w:lang w:eastAsia="es-ES"/>
+            </w:rPr>
+          </w:pPr>
+          <w:hyperlink w:anchor="_Toc241165415" w:history="1">
+            <w:r>
+              <w:rPr>
+                <w:rStyle w:val="Hipervnculo"/>
+                <w:noProof/>
+              </w:rPr>
+              <w:t>Secundarias</w:t>
+            </w:r>
+            <w:r>
+              <w:rPr>
+                <w:noProof/>
+                <w:webHidden/>
+              </w:rPr>
+              <w:tab/>
+            </w:r>
+            <w:r>
+              <w:rPr>
+                <w:noProof/>
+                <w:webHidden/>
+              </w:rPr>
+              <w:fldChar w:fldCharType="begin"/>
+            </w:r>
+            <w:r>
+              <w:rPr>
+                <w:noProof/>
+                <w:webHidden/>
+              </w:rPr>
+              <w:instrText xml:space="preserve"> PAGEREF _Toc241165415 \h </w:instrText>
+            </w:r>
+            <w:r>
+              <w:rPr>
+                <w:noProof/>
+                <w:webHidden/>
+              </w:rPr>
+            </w:r>
+            <w:r>
+              <w:rPr>
+                <w:noProof/>
+                <w:webHidden/>
+              </w:rPr>
+              <w:fldChar w:fldCharType="separate"/>
+            </w:r>
+            <w:r>
+              <w:rPr>
+                <w:noProof/>
+                <w:webHidden/>
+              </w:rPr>
+              <w:t>6</w:t>
             </w:r>
             <w:r>
               <w:rPr>
@@ -959,12 +1440,502 @@
               <w:lang w:eastAsia="es-ES"/>
             </w:rPr>
           </w:pPr>
-          <w:hyperlink w:anchor="_Toc240655331" w:history="1">
+          <w:hyperlink w:anchor="_Toc241165416" w:history="1">
             <w:r>
               <w:rPr>
                 <w:rStyle w:val="Hipervnculo"/>
                 <w:noProof/>
               </w:rPr>
+              <w:t>Colores institucionales</w:t>
+            </w:r>
+            <w:r>
+              <w:rPr>
+                <w:noProof/>
+                <w:webHidden/>
+              </w:rPr>
+              <w:tab/>
+            </w:r>
+            <w:r>
+              <w:rPr>
+                <w:noProof/>
+                <w:webHidden/>
+              </w:rPr>
+              <w:fldChar w:fldCharType="begin"/>
+            </w:r>
+            <w:r>
+              <w:rPr>
+                <w:noProof/>
+                <w:webHidden/>
+              </w:rPr>
+              <w:instrText xml:space="preserve"> PAGEREF _Toc241165416 \h </w:instrText>
+            </w:r>
+            <w:r>
+              <w:rPr>
+                <w:noProof/>
+                <w:webHidden/>
+              </w:rPr>
+            </w:r>
+            <w:r>
+              <w:rPr>
+                <w:noProof/>
+                <w:webHidden/>
+              </w:rPr>
+              <w:fldChar w:fldCharType="separate"/>
+            </w:r>
+            <w:r>
+              <w:rPr>
+                <w:noProof/>
+                <w:webHidden/>
+              </w:rPr>
+              <w:t>6</w:t>
+            </w:r>
+            <w:r>
+              <w:rPr>
+                <w:noProof/>
+                <w:webHidden/>
+              </w:rPr>
+              <w:fldChar w:fldCharType="end"/>
+            </w:r>
+          </w:hyperlink>
+        </w:p>
+        <w:p>
+          <w:pPr>
+            <w:pStyle w:val="TDC1"/>
+            <w:tabs>
+              <w:tab w:val="right" w:leader="dot" w:pos="8494"/>
+            </w:tabs>
+            <w:rPr>
+              <w:rFonts w:eastAsiaTheme="minorEastAsia"/>
+              <w:noProof/>
+              <w:lang w:eastAsia="es-ES"/>
+            </w:rPr>
+          </w:pPr>
+          <w:hyperlink w:anchor="_Toc241165417" w:history="1">
+            <w:r>
+              <w:rPr>
+                <w:rStyle w:val="Hipervnculo"/>
+                <w:noProof/>
+              </w:rPr>
+              <w:t>Colores secundarios</w:t>
+            </w:r>
+            <w:r>
+              <w:rPr>
+                <w:noProof/>
+                <w:webHidden/>
+              </w:rPr>
+              <w:tab/>
+            </w:r>
+            <w:r>
+              <w:rPr>
+                <w:noProof/>
+                <w:webHidden/>
+              </w:rPr>
+              <w:fldChar w:fldCharType="begin"/>
+            </w:r>
+            <w:r>
+              <w:rPr>
+                <w:noProof/>
+                <w:webHidden/>
+              </w:rPr>
+              <w:instrText xml:space="preserve"> PAGEREF _Toc241165417 \h </w:instrText>
+            </w:r>
+            <w:r>
+              <w:rPr>
+                <w:noProof/>
+                <w:webHidden/>
+              </w:rPr>
+            </w:r>
+            <w:r>
+              <w:rPr>
+                <w:noProof/>
+                <w:webHidden/>
+              </w:rPr>
+              <w:fldChar w:fldCharType="separate"/>
+            </w:r>
+            <w:r>
+              <w:rPr>
+                <w:noProof/>
+                <w:webHidden/>
+              </w:rPr>
+              <w:t>6</w:t>
+            </w:r>
+            <w:r>
+              <w:rPr>
+                <w:noProof/>
+                <w:webHidden/>
+              </w:rPr>
+              <w:fldChar w:fldCharType="end"/>
+            </w:r>
+          </w:hyperlink>
+        </w:p>
+        <w:p>
+          <w:pPr>
+            <w:pStyle w:val="TDC1"/>
+            <w:tabs>
+              <w:tab w:val="right" w:leader="dot" w:pos="8494"/>
+            </w:tabs>
+            <w:rPr>
+              <w:rFonts w:eastAsiaTheme="minorEastAsia"/>
+              <w:noProof/>
+              <w:lang w:eastAsia="es-ES"/>
+            </w:rPr>
+          </w:pPr>
+          <w:hyperlink w:anchor="_Toc241165418" w:history="1">
+            <w:r>
+              <w:rPr>
+                <w:rStyle w:val="Hipervnculo"/>
+                <w:noProof/>
+              </w:rPr>
+              <w:t>Colores complementarios</w:t>
+            </w:r>
+            <w:r>
+              <w:rPr>
+                <w:noProof/>
+                <w:webHidden/>
+              </w:rPr>
+              <w:tab/>
+            </w:r>
+            <w:r>
+              <w:rPr>
+                <w:noProof/>
+                <w:webHidden/>
+              </w:rPr>
+              <w:fldChar w:fldCharType="begin"/>
+            </w:r>
+            <w:r>
+              <w:rPr>
+                <w:noProof/>
+                <w:webHidden/>
+              </w:rPr>
+              <w:instrText xml:space="preserve"> PAGEREF _Toc241165418 \h </w:instrText>
+            </w:r>
+            <w:r>
+              <w:rPr>
+                <w:noProof/>
+                <w:webHidden/>
+              </w:rPr>
+            </w:r>
+            <w:r>
+              <w:rPr>
+                <w:noProof/>
+                <w:webHidden/>
+              </w:rPr>
+              <w:fldChar w:fldCharType="separate"/>
+            </w:r>
+            <w:r>
+              <w:rPr>
+                <w:noProof/>
+                <w:webHidden/>
+              </w:rPr>
+              <w:t>6</w:t>
+            </w:r>
+            <w:r>
+              <w:rPr>
+                <w:noProof/>
+                <w:webHidden/>
+              </w:rPr>
+              <w:fldChar w:fldCharType="end"/>
+            </w:r>
+          </w:hyperlink>
+        </w:p>
+        <w:p>
+          <w:pPr>
+            <w:pStyle w:val="TDC1"/>
+            <w:tabs>
+              <w:tab w:val="right" w:leader="dot" w:pos="8494"/>
+            </w:tabs>
+            <w:rPr>
+              <w:rFonts w:eastAsiaTheme="minorEastAsia"/>
+              <w:noProof/>
+              <w:lang w:eastAsia="es-ES"/>
+            </w:rPr>
+          </w:pPr>
+          <w:hyperlink w:anchor="_Toc241165419" w:history="1">
+            <w:r>
+              <w:rPr>
+                <w:rStyle w:val="Hipervnculo"/>
+                <w:noProof/>
+              </w:rPr>
+              <w:t>Positivos y negativos</w:t>
+            </w:r>
+            <w:r>
+              <w:rPr>
+                <w:noProof/>
+                <w:webHidden/>
+              </w:rPr>
+              <w:tab/>
+            </w:r>
+            <w:r>
+              <w:rPr>
+                <w:noProof/>
+                <w:webHidden/>
+              </w:rPr>
+              <w:fldChar w:fldCharType="begin"/>
+            </w:r>
+            <w:r>
+              <w:rPr>
+                <w:noProof/>
+                <w:webHidden/>
+              </w:rPr>
+              <w:instrText xml:space="preserve"> PAGEREF _Toc241165419 \h </w:instrText>
+            </w:r>
+            <w:r>
+              <w:rPr>
+                <w:noProof/>
+                <w:webHidden/>
+              </w:rPr>
+            </w:r>
+            <w:r>
+              <w:rPr>
+                <w:noProof/>
+                <w:webHidden/>
+              </w:rPr>
+              <w:fldChar w:fldCharType="separate"/>
+            </w:r>
+            <w:r>
+              <w:rPr>
+                <w:noProof/>
+                <w:webHidden/>
+              </w:rPr>
+              <w:t>6</w:t>
+            </w:r>
+            <w:r>
+              <w:rPr>
+                <w:noProof/>
+                <w:webHidden/>
+              </w:rPr>
+              <w:fldChar w:fldCharType="end"/>
+            </w:r>
+          </w:hyperlink>
+        </w:p>
+        <w:p>
+          <w:pPr>
+            <w:pStyle w:val="TDC2"/>
+            <w:tabs>
+              <w:tab w:val="right" w:leader="dot" w:pos="8494"/>
+            </w:tabs>
+            <w:rPr>
+              <w:rFonts w:eastAsiaTheme="minorEastAsia"/>
+              <w:noProof/>
+              <w:lang w:eastAsia="es-ES"/>
+            </w:rPr>
+          </w:pPr>
+          <w:hyperlink w:anchor="_Toc241165420" w:history="1">
+            <w:r>
+              <w:rPr>
+                <w:rStyle w:val="Hipervnculo"/>
+                <w:noProof/>
+              </w:rPr>
+              <w:t>B/N</w:t>
+            </w:r>
+            <w:r>
+              <w:rPr>
+                <w:noProof/>
+                <w:webHidden/>
+              </w:rPr>
+              <w:tab/>
+            </w:r>
+            <w:r>
+              <w:rPr>
+                <w:noProof/>
+                <w:webHidden/>
+              </w:rPr>
+              <w:fldChar w:fldCharType="begin"/>
+            </w:r>
+            <w:r>
+              <w:rPr>
+                <w:noProof/>
+                <w:webHidden/>
+              </w:rPr>
+              <w:instrText xml:space="preserve"> PAGEREF _Toc241165420 \h </w:instrText>
+            </w:r>
+            <w:r>
+              <w:rPr>
+                <w:noProof/>
+                <w:webHidden/>
+              </w:rPr>
+            </w:r>
+            <w:r>
+              <w:rPr>
+                <w:noProof/>
+                <w:webHidden/>
+              </w:rPr>
+              <w:fldChar w:fldCharType="separate"/>
+            </w:r>
+            <w:r>
+              <w:rPr>
+                <w:noProof/>
+                <w:webHidden/>
+              </w:rPr>
+              <w:t>6</w:t>
+            </w:r>
+            <w:r>
+              <w:rPr>
+                <w:noProof/>
+                <w:webHidden/>
+              </w:rPr>
+              <w:fldChar w:fldCharType="end"/>
+            </w:r>
+          </w:hyperlink>
+        </w:p>
+        <w:p>
+          <w:pPr>
+            <w:pStyle w:val="TDC2"/>
+            <w:tabs>
+              <w:tab w:val="right" w:leader="dot" w:pos="8494"/>
+            </w:tabs>
+            <w:rPr>
+              <w:rFonts w:eastAsiaTheme="minorEastAsia"/>
+              <w:noProof/>
+              <w:lang w:eastAsia="es-ES"/>
+            </w:rPr>
+          </w:pPr>
+          <w:hyperlink w:anchor="_Toc241165421" w:history="1">
+            <w:r>
+              <w:rPr>
+                <w:rStyle w:val="Hipervnculo"/>
+                <w:noProof/>
+              </w:rPr>
+              <w:t>Color positivo/Color negativo</w:t>
+            </w:r>
+            <w:r>
+              <w:rPr>
+                <w:noProof/>
+                <w:webHidden/>
+              </w:rPr>
+              <w:tab/>
+            </w:r>
+            <w:r>
+              <w:rPr>
+                <w:noProof/>
+                <w:webHidden/>
+              </w:rPr>
+              <w:fldChar w:fldCharType="begin"/>
+            </w:r>
+            <w:r>
+              <w:rPr>
+                <w:noProof/>
+                <w:webHidden/>
+              </w:rPr>
+              <w:instrText xml:space="preserve"> PAGEREF _Toc241165421 \h </w:instrText>
+            </w:r>
+            <w:r>
+              <w:rPr>
+                <w:noProof/>
+                <w:webHidden/>
+              </w:rPr>
+            </w:r>
+            <w:r>
+              <w:rPr>
+                <w:noProof/>
+                <w:webHidden/>
+              </w:rPr>
+              <w:fldChar w:fldCharType="separate"/>
+            </w:r>
+            <w:r>
+              <w:rPr>
+                <w:noProof/>
+                <w:webHidden/>
+              </w:rPr>
+              <w:t>6</w:t>
+            </w:r>
+            <w:r>
+              <w:rPr>
+                <w:noProof/>
+                <w:webHidden/>
+              </w:rPr>
+              <w:fldChar w:fldCharType="end"/>
+            </w:r>
+          </w:hyperlink>
+        </w:p>
+        <w:p>
+          <w:pPr>
+            <w:pStyle w:val="TDC2"/>
+            <w:tabs>
+              <w:tab w:val="right" w:leader="dot" w:pos="8494"/>
+            </w:tabs>
+            <w:rPr>
+              <w:rFonts w:eastAsiaTheme="minorEastAsia"/>
+              <w:noProof/>
+              <w:lang w:eastAsia="es-ES"/>
+            </w:rPr>
+          </w:pPr>
+          <w:hyperlink w:anchor="_Toc241165422" w:history="1">
+            <w:r>
+              <w:rPr>
+                <w:rStyle w:val="Hipervnculo"/>
+                <w:noProof/>
+              </w:rPr>
+              <w:t>Otra tonalidad</w:t>
+            </w:r>
+            <w:r>
+              <w:rPr>
+                <w:noProof/>
+                <w:webHidden/>
+              </w:rPr>
+              <w:tab/>
+            </w:r>
+            <w:r>
+              <w:rPr>
+                <w:noProof/>
+                <w:webHidden/>
+              </w:rPr>
+              <w:fldChar w:fldCharType="begin"/>
+            </w:r>
+            <w:r>
+              <w:rPr>
+                <w:noProof/>
+                <w:webHidden/>
+              </w:rPr>
+              <w:instrText xml:space="preserve"> PAGEREF _Toc241165422 \h </w:instrText>
+            </w:r>
+            <w:r>
+              <w:rPr>
+                <w:noProof/>
+                <w:webHidden/>
+              </w:rPr>
+            </w:r>
+            <w:r>
+              <w:rPr>
+                <w:noProof/>
+                <w:webHidden/>
+              </w:rPr>
+              <w:fldChar w:fldCharType="separate"/>
+            </w:r>
+            <w:r>
+              <w:rPr>
+                <w:noProof/>
+                <w:webHidden/>
+              </w:rPr>
+              <w:t>6</w:t>
+            </w:r>
+            <w:r>
+              <w:rPr>
+                <w:noProof/>
+                <w:webHidden/>
+              </w:rPr>
+              <w:fldChar w:fldCharType="end"/>
+            </w:r>
+          </w:hyperlink>
+        </w:p>
+        <w:p>
+          <w:pPr>
+            <w:pStyle w:val="TDC1"/>
+            <w:tabs>
+              <w:tab w:val="right" w:leader="dot" w:pos="8494"/>
+            </w:tabs>
+            <w:rPr>
+              <w:rFonts w:eastAsiaTheme="minorEastAsia"/>
+              <w:noProof/>
+              <w:lang w:eastAsia="es-ES"/>
+            </w:rPr>
+          </w:pPr>
+          <w:hyperlink w:anchor="_Toc241165423" w:history="1">
+            <w:r>
+              <w:rPr>
+                <w:rStyle w:val="Hipervnculo"/>
+                <w:noProof/>
+              </w:rPr>
               <w:t>Bibliografía</w:t>
             </w:r>
             <w:r>
@@ -986,7 +1957,7 @@
                 <w:noProof/>
                 <w:webHidden/>
               </w:rPr>
-              <w:instrText xml:space="preserve"> PAGEREF _Toc240655331 \h </w:instrText>
+              <w:instrText xml:space="preserve"> PAGEREF _Toc241165423 \h </w:instrText>
             </w:r>
             <w:r>
               <w:rPr>
@@ -1006,7 +1977,7 @@
                 <w:noProof/>
                 <w:webHidden/>
               </w:rPr>
-              <w:t>5</w:t>
+              <w:t>7</w:t>
             </w:r>
             <w:r>
               <w:rPr>
@@ -1048,7 +2019,7 @@
         <w:pStyle w:val="Ttulo1"/>
         <w:spacing w:after="240"/>
       </w:pPr>
-      <w:bookmarkStart w:id="0" w:name="_Toc240655326"/>
+      <w:bookmarkStart w:id="0" w:name="_Toc241165404"/>
       <w:r>
         <w:lastRenderedPageBreak/>
         <w:t>Descripción de empresa</w:t>
@@ -1099,7 +2070,7 @@
           <w:lang w:eastAsia="es-ES"/>
         </w:rPr>
         <w:drawing>
-          <wp:inline distT="0" distB="0" distL="0" distR="0" wp14:anchorId="5B24F1B3" wp14:editId="33593A3E">
+          <wp:inline distT="0" distB="0" distL="0" distR="0" wp14:anchorId="6F7B833A" wp14:editId="70663FE1">
             <wp:extent cx="5400040" cy="6751955"/>
             <wp:effectExtent l="0" t="0" r="0" b="0"/>
             <wp:docPr id="5" name="Imagen 5"/>
@@ -1140,12 +2111,25 @@
         <w:pStyle w:val="Ttulo1"/>
         <w:spacing w:after="240"/>
       </w:pPr>
-      <w:bookmarkStart w:id="1" w:name="_Toc240655327"/>
+      <w:bookmarkStart w:id="1" w:name="_Toc241165405"/>
       <w:r>
         <w:lastRenderedPageBreak/>
+        <w:t>Presentación del l</w:t>
+      </w:r>
+      <w:r>
+        <w:t>ogotipo</w:t>
+      </w:r>
+      <w:bookmarkEnd w:id="1"/>
+    </w:p>
+    <w:p>
+      <w:pPr>
+        <w:pStyle w:val="Ttulo2"/>
+      </w:pPr>
+      <w:bookmarkStart w:id="2" w:name="_Toc241165406"/>
+      <w:r>
         <w:t>Logotipo</w:t>
       </w:r>
-      <w:bookmarkEnd w:id="1"/>
+      <w:bookmarkEnd w:id="2"/>
     </w:p>
     <w:p>
       <w:r>
@@ -1163,15 +2147,11 @@
         <w:jc w:val="center"/>
       </w:pPr>
       <w:r>
-        <w:rPr>
-          <w:noProof/>
-          <w:lang w:eastAsia="es-ES"/>
-        </w:rPr>
         <w:drawing>
-          <wp:inline distT="0" distB="0" distL="0" distR="0" wp14:anchorId="011C2AAE" wp14:editId="309DF3A2">
-            <wp:extent cx="4076700" cy="734670"/>
-            <wp:effectExtent l="0" t="0" r="0" b="8890"/>
-            <wp:docPr id="1" name="Imagen 1" descr="C:\Users\daw2\AppData\Local\Microsoft\Windows\INetCache\Content.Word\SnoutCore_Logotipo.png"/>
+          <wp:inline distT="0" distB="0" distL="0" distR="0" wp14:anchorId="27027123" wp14:editId="2A28DCD0">
+            <wp:extent cx="5400040" cy="1800225"/>
+            <wp:effectExtent l="0" t="0" r="0" b="9525"/>
+            <wp:docPr id="1" name="Imagen 1"/>
             <wp:cNvGraphicFramePr>
               <a:graphicFrameLocks xmlns:a="http://schemas.openxmlformats.org/drawingml/2006/main" noChangeAspect="1"/>
             </wp:cNvGraphicFramePr>
@@ -1179,36 +2159,23 @@
               <a:graphicData uri="http://schemas.openxmlformats.org/drawingml/2006/picture">
                 <pic:pic xmlns:pic="http://schemas.openxmlformats.org/drawingml/2006/picture">
                   <pic:nvPicPr>
-                    <pic:cNvPr id="0" name="Picture 15" descr="C:\Users\daw2\AppData\Local\Microsoft\Windows\INetCache\Content.Word\SnoutCore_Logotipo.png"/>
-                    <pic:cNvPicPr>
-                      <a:picLocks noChangeAspect="1" noChangeArrowheads="1"/>
-                    </pic:cNvPicPr>
+                    <pic:cNvPr id="1" name=""/>
+                    <pic:cNvPicPr/>
                   </pic:nvPicPr>
                   <pic:blipFill>
-                    <a:blip r:embed="rId10">
-                      <a:extLst>
-                        <a:ext uri="{28A0092B-C50C-407E-A947-70E740481C1C}">
-                          <a14:useLocalDpi xmlns:a14="http://schemas.microsoft.com/office/drawing/2010/main" val="0"/>
-                        </a:ext>
-                      </a:extLst>
-                    </a:blip>
-                    <a:srcRect/>
+                    <a:blip r:embed="rId10"/>
                     <a:stretch>
                       <a:fillRect/>
                     </a:stretch>
                   </pic:blipFill>
-                  <pic:spPr bwMode="auto">
+                  <pic:spPr>
                     <a:xfrm>
                       <a:off x="0" y="0"/>
-                      <a:ext cx="4106467" cy="740034"/>
+                      <a:ext cx="5400040" cy="1800225"/>
                     </a:xfrm>
                     <a:prstGeom prst="rect">
                       <a:avLst/>
                     </a:prstGeom>
-                    <a:noFill/>
-                    <a:ln>
-                      <a:noFill/>
-                    </a:ln>
                   </pic:spPr>
                 </pic:pic>
               </a:graphicData>
@@ -1219,14 +2186,13 @@
     </w:p>
     <w:p>
       <w:pPr>
-        <w:pStyle w:val="Ttulo1"/>
-        <w:spacing w:after="240"/>
-      </w:pPr>
-      <w:bookmarkStart w:id="2" w:name="_Toc240655328"/>
+        <w:pStyle w:val="Ttulo2"/>
+      </w:pPr>
+      <w:bookmarkStart w:id="3" w:name="_Toc241165407"/>
       <w:r>
         <w:t>Isotipo</w:t>
       </w:r>
-      <w:bookmarkEnd w:id="2"/>
+      <w:bookmarkEnd w:id="3"/>
     </w:p>
     <w:p>
       <w:r>
@@ -1238,15 +2204,11 @@
         <w:jc w:val="center"/>
       </w:pPr>
       <w:r>
-        <w:rPr>
-          <w:noProof/>
-          <w:lang w:eastAsia="es-ES"/>
-        </w:rPr>
         <w:drawing>
-          <wp:inline distT="0" distB="0" distL="0" distR="0" wp14:anchorId="36985DF4" wp14:editId="0E591F4A">
-            <wp:extent cx="4048125" cy="3378090"/>
-            <wp:effectExtent l="0" t="0" r="0" b="0"/>
-            <wp:docPr id="2" name="Imagen 2" descr="C:\Users\daw2\AppData\Local\Microsoft\Windows\INetCache\Content.Word\SnoutCore_Isotipo.png"/>
+          <wp:inline distT="0" distB="0" distL="0" distR="0" wp14:anchorId="118B2511" wp14:editId="529DC344">
+            <wp:extent cx="5400040" cy="4321810"/>
+            <wp:effectExtent l="0" t="0" r="0" b="2540"/>
+            <wp:docPr id="8" name="Imagen 8"/>
             <wp:cNvGraphicFramePr>
               <a:graphicFrameLocks xmlns:a="http://schemas.openxmlformats.org/drawingml/2006/main" noChangeAspect="1"/>
             </wp:cNvGraphicFramePr>
@@ -1254,36 +2216,23 @@
               <a:graphicData uri="http://schemas.openxmlformats.org/drawingml/2006/picture">
                 <pic:pic xmlns:pic="http://schemas.openxmlformats.org/drawingml/2006/picture">
                   <pic:nvPicPr>
-                    <pic:cNvPr id="0" name="Picture 17" descr="C:\Users\daw2\AppData\Local\Microsoft\Windows\INetCache\Content.Word\SnoutCore_Isotipo.png"/>
-                    <pic:cNvPicPr>
-                      <a:picLocks noChangeAspect="1" noChangeArrowheads="1"/>
-                    </pic:cNvPicPr>
+                    <pic:cNvPr id="1" name=""/>
+                    <pic:cNvPicPr/>
                   </pic:nvPicPr>
                   <pic:blipFill>
-                    <a:blip r:embed="rId11">
-                      <a:extLst>
-                        <a:ext uri="{28A0092B-C50C-407E-A947-70E740481C1C}">
-                          <a14:useLocalDpi xmlns:a14="http://schemas.microsoft.com/office/drawing/2010/main" val="0"/>
-                        </a:ext>
-                      </a:extLst>
-                    </a:blip>
-                    <a:srcRect/>
+                    <a:blip r:embed="rId11"/>
                     <a:stretch>
                       <a:fillRect/>
                     </a:stretch>
                   </pic:blipFill>
-                  <pic:spPr bwMode="auto">
+                  <pic:spPr>
                     <a:xfrm>
                       <a:off x="0" y="0"/>
-                      <a:ext cx="4054409" cy="3383334"/>
+                      <a:ext cx="5400040" cy="4321810"/>
                     </a:xfrm>
                     <a:prstGeom prst="rect">
                       <a:avLst/>
                     </a:prstGeom>
-                    <a:noFill/>
-                    <a:ln>
-                      <a:noFill/>
-                    </a:ln>
                   </pic:spPr>
                 </pic:pic>
               </a:graphicData>
@@ -1307,15 +2256,14 @@
     </w:p>
     <w:p>
       <w:pPr>
-        <w:pStyle w:val="Ttulo1"/>
-        <w:spacing w:after="240"/>
-      </w:pPr>
-      <w:bookmarkStart w:id="3" w:name="_Toc240655329"/>
+        <w:pStyle w:val="Ttulo2"/>
+      </w:pPr>
+      <w:bookmarkStart w:id="4" w:name="_Toc241165408"/>
       <w:r>
         <w:lastRenderedPageBreak/>
         <w:t>Imagotipo</w:t>
       </w:r>
-      <w:bookmarkEnd w:id="3"/>
+      <w:bookmarkEnd w:id="4"/>
     </w:p>
     <w:p>
       <w:r>
@@ -1347,7 +2295,7 @@
             <v:path o:extrusionok="f" gradientshapeok="t" o:connecttype="rect"/>
             <o:lock v:ext="edit" aspectratio="t"/>
           </v:shapetype>
-          <v:shape id="_x0000_i1025" type="#_x0000_t75" style="width:324pt;height:259.5pt">
+          <v:shape id="_x0000_i1105" type="#_x0000_t75" style="width:323.95pt;height:259.65pt">
             <v:imagedata r:id="rId12" o:title="SnoutCore_Imagotipo"/>
           </v:shape>
         </w:pict>
@@ -1355,17 +2303,16 @@
     </w:p>
     <w:p>
       <w:pPr>
-        <w:pStyle w:val="Ttulo1"/>
-        <w:spacing w:after="240"/>
-      </w:pPr>
-      <w:bookmarkStart w:id="4" w:name="_Toc240655330"/>
+        <w:pStyle w:val="Ttulo2"/>
+      </w:pPr>
+      <w:bookmarkStart w:id="5" w:name="_Toc241165409"/>
       <w:r>
         <w:t>I</w:t>
       </w:r>
       <w:r>
         <w:t>sologotipo</w:t>
       </w:r>
-      <w:bookmarkEnd w:id="4"/>
+      <w:bookmarkEnd w:id="5"/>
     </w:p>
     <w:p>
       <w:r>
@@ -1377,31 +2324,118 @@
         <w:jc w:val="center"/>
       </w:pPr>
       <w:r>
-        <w:pict>
-          <v:shape id="_x0000_i1026" type="#_x0000_t75" style="width:319.5pt;height:240pt">
-            <v:imagedata r:id="rId13" o:title="ChatGPT Image 18 sept 2026, 20_04_19"/>
-          </v:shape>
-        </w:pict>
-      </w:r>
-    </w:p>
-    <w:p>
-      <w:r>
+        <w:drawing>
+          <wp:inline distT="0" distB="0" distL="0" distR="0" wp14:anchorId="60FD0C78" wp14:editId="4888950E">
+            <wp:extent cx="5400040" cy="4050030"/>
+            <wp:effectExtent l="0" t="0" r="0" b="7620"/>
+            <wp:docPr id="13" name="Imagen 13"/>
+            <wp:cNvGraphicFramePr>
+              <a:graphicFrameLocks xmlns:a="http://schemas.openxmlformats.org/drawingml/2006/main" noChangeAspect="1"/>
+            </wp:cNvGraphicFramePr>
+            <a:graphic xmlns:a="http://schemas.openxmlformats.org/drawingml/2006/main">
+              <a:graphicData uri="http://schemas.openxmlformats.org/drawingml/2006/picture">
+                <pic:pic xmlns:pic="http://schemas.openxmlformats.org/drawingml/2006/picture">
+                  <pic:nvPicPr>
+                    <pic:cNvPr id="1" name=""/>
+                    <pic:cNvPicPr/>
+                  </pic:nvPicPr>
+                  <pic:blipFill>
+                    <a:blip r:embed="rId13"/>
+                    <a:stretch>
+                      <a:fillRect/>
+                    </a:stretch>
+                  </pic:blipFill>
+                  <pic:spPr>
+                    <a:xfrm>
+                      <a:off x="0" y="0"/>
+                      <a:ext cx="5400040" cy="4050030"/>
+                    </a:xfrm>
+                    <a:prstGeom prst="rect">
+                      <a:avLst/>
+                    </a:prstGeom>
+                  </pic:spPr>
+                </pic:pic>
+              </a:graphicData>
+            </a:graphic>
+          </wp:inline>
+        </w:drawing>
+      </w:r>
+    </w:p>
+    <w:p>
+      <w:bookmarkStart w:id="6" w:name="_GoBack"/>
+      <w:bookmarkEnd w:id="6"/>
+      <w:r>
+        <w:lastRenderedPageBreak/>
         <w:br w:type="page"/>
       </w:r>
     </w:p>
     <w:p>
       <w:pPr>
-        <w:pStyle w:val="Ttulo1"/>
-        <w:spacing w:after="240"/>
-      </w:pPr>
+        <w:pStyle w:val="Ttulo2"/>
+      </w:pPr>
+      <w:bookmarkStart w:id="7" w:name="_Toc241165410"/>
       <w:r>
         <w:lastRenderedPageBreak/>
         <w:t>Teoría de color</w:t>
       </w:r>
-    </w:p>
-    <w:p>
-      <w:r>
-        <w:t>Los colores principales de la imagen de marca de SnoutCore son el azul como color principal y el blanco como color secundario/de fondo. Según la teoría de color, estos colores denotan:</w:t>
+      <w:bookmarkEnd w:id="7"/>
+    </w:p>
+    <w:p>
+      <w:r>
+        <w:t xml:space="preserve">Los colores principales de la imagen de marca de SnoutCore son el azul como color principal y el blanco </w:t>
+      </w:r>
+      <w:r>
+        <w:t>como color secundario/de fondo.</w:t>
+      </w:r>
+    </w:p>
+    <w:p>
+      <w:r>
+        <w:drawing>
+          <wp:inline distT="0" distB="0" distL="0" distR="0" wp14:anchorId="2D09B307" wp14:editId="32AA671F">
+            <wp:extent cx="5400040" cy="2219960"/>
+            <wp:effectExtent l="0" t="0" r="0" b="8890"/>
+            <wp:docPr id="7" name="Imagen 7"/>
+            <wp:cNvGraphicFramePr>
+              <a:graphicFrameLocks xmlns:a="http://schemas.openxmlformats.org/drawingml/2006/main" noChangeAspect="1"/>
+            </wp:cNvGraphicFramePr>
+            <a:graphic xmlns:a="http://schemas.openxmlformats.org/drawingml/2006/main">
+              <a:graphicData uri="http://schemas.openxmlformats.org/drawingml/2006/picture">
+                <pic:pic xmlns:pic="http://schemas.openxmlformats.org/drawingml/2006/picture">
+                  <pic:nvPicPr>
+                    <pic:cNvPr id="1" name=""/>
+                    <pic:cNvPicPr/>
+                  </pic:nvPicPr>
+                  <pic:blipFill>
+                    <a:blip r:embed="rId14"/>
+                    <a:stretch>
+                      <a:fillRect/>
+                    </a:stretch>
+                  </pic:blipFill>
+                  <pic:spPr>
+                    <a:xfrm>
+                      <a:off x="0" y="0"/>
+                      <a:ext cx="5400040" cy="2219960"/>
+                    </a:xfrm>
+                    <a:prstGeom prst="rect">
+                      <a:avLst/>
+                    </a:prstGeom>
+                  </pic:spPr>
+                </pic:pic>
+              </a:graphicData>
+            </a:graphic>
+          </wp:inline>
+        </w:drawing>
+      </w:r>
+    </w:p>
+    <w:p>
+      <w:r>
+        <w:t>Según la teoría de color, estos colores</w:t>
+      </w:r>
+      <w:r>
+        <w:t xml:space="preserve"> evocan las siguientes sensaciones</w:t>
+      </w:r>
+      <w:r>
+        <w:t>:</w:t>
       </w:r>
     </w:p>
     <w:p>
@@ -1430,15 +2464,160 @@
     </w:p>
     <w:p>
       <w:r>
-        <w:t xml:space="preserve">Todos estos atributos se corresponden con la imagen que SnoutCore pretende dar de su propia marca: una empresa leal a sus clientes, que transmita confianza, estabilidad y seguridad y que proporcione, ante todo, calma y paz con sus productos, manteniendo una estética pura y sencilla. </w:t>
-      </w:r>
-      <w:bookmarkStart w:id="5" w:name="_GoBack"/>
-      <w:bookmarkEnd w:id="5"/>
-    </w:p>
-    <w:p>
-      <w:pPr>
-        <w:spacing w:after="240"/>
-      </w:pPr>
+        <w:t>Todos estos atributos se corresponden con la imagen que SnoutCore pretende dar de su propia marca: una empresa leal a sus clientes, que transmita confianza, estabilidad y seguridad y que proporcione, ante todo, calma y paz con sus productos, manteniend</w:t>
+      </w:r>
+      <w:r>
+        <w:t>o una estética pura y sencilla.</w:t>
+      </w:r>
+    </w:p>
+    <w:p>
+      <w:r>
+        <w:br w:type="page"/>
+      </w:r>
+    </w:p>
+    <w:p>
+      <w:pPr>
+        <w:pStyle w:val="Ttulo1"/>
+      </w:pPr>
+      <w:bookmarkStart w:id="8" w:name="_Toc241165411"/>
+      <w:r>
+        <w:lastRenderedPageBreak/>
+        <w:t>Estructura y composición</w:t>
+      </w:r>
+      <w:bookmarkEnd w:id="8"/>
+    </w:p>
+    <w:p>
+      <w:pPr>
+        <w:pStyle w:val="Ttulo1"/>
+      </w:pPr>
+      <w:bookmarkStart w:id="9" w:name="_Toc241165412"/>
+      <w:r>
+        <w:t>Área de protección</w:t>
+      </w:r>
+      <w:bookmarkEnd w:id="9"/>
+    </w:p>
+    <w:p>
+      <w:pPr>
+        <w:pStyle w:val="Ttulo1"/>
+      </w:pPr>
+      <w:bookmarkStart w:id="10" w:name="_Toc241165413"/>
+      <w:r>
+        <w:t>Tipografías</w:t>
+      </w:r>
+      <w:bookmarkEnd w:id="10"/>
+    </w:p>
+    <w:p>
+      <w:pPr>
+        <w:pStyle w:val="Ttulo2"/>
+      </w:pPr>
+      <w:bookmarkStart w:id="11" w:name="_Toc241165414"/>
+      <w:r>
+        <w:t>Principales</w:t>
+      </w:r>
+      <w:bookmarkEnd w:id="11"/>
+    </w:p>
+    <w:p>
+      <w:pPr>
+        <w:pStyle w:val="Ttulo2"/>
+      </w:pPr>
+      <w:bookmarkStart w:id="12" w:name="_Toc241165415"/>
+      <w:r>
+        <w:t>Secundarias</w:t>
+      </w:r>
+      <w:bookmarkEnd w:id="12"/>
+    </w:p>
+    <w:p>
+      <w:pPr>
+        <w:pStyle w:val="Ttulo1"/>
+      </w:pPr>
+      <w:bookmarkStart w:id="13" w:name="_Toc241165416"/>
+      <w:r>
+        <w:t>Colores institucionales</w:t>
+      </w:r>
+      <w:bookmarkEnd w:id="13"/>
+    </w:p>
+    <w:p>
+      <w:r>
+        <w:t>Al menos 3 colores</w:t>
+      </w:r>
+    </w:p>
+    <w:p>
+      <w:pPr>
+        <w:pStyle w:val="Ttulo1"/>
+      </w:pPr>
+      <w:bookmarkStart w:id="14" w:name="_Toc241165417"/>
+      <w:r>
+        <w:t>Colores secundarios</w:t>
+      </w:r>
+      <w:bookmarkEnd w:id="14"/>
+    </w:p>
+    <w:p>
+      <w:r>
+        <w:t>Similares a los institucionales, modificando intensidad o saturación. Deben destacar menos</w:t>
+      </w:r>
+      <w:r>
+        <w:t>.</w:t>
+      </w:r>
+    </w:p>
+    <w:p>
+      <w:pPr>
+        <w:pStyle w:val="Ttulo1"/>
+      </w:pPr>
+      <w:bookmarkStart w:id="15" w:name="_Toc241165418"/>
+      <w:r>
+        <w:t>Colores complementarios</w:t>
+      </w:r>
+      <w:bookmarkEnd w:id="15"/>
+    </w:p>
+    <w:p>
+      <w:r>
+        <w:t>Al menos 6 (nunca van a ocupar más de un 20% de la gama cromática de la página)</w:t>
+      </w:r>
+    </w:p>
+    <w:p>
+      <w:pPr>
+        <w:pStyle w:val="Ttulo1"/>
+      </w:pPr>
+      <w:bookmarkStart w:id="16" w:name="_Toc241165419"/>
+      <w:r>
+        <w:t>Positivos y negativos</w:t>
+      </w:r>
+      <w:bookmarkEnd w:id="16"/>
+    </w:p>
+    <w:p>
+      <w:pPr>
+        <w:pStyle w:val="Ttulo2"/>
+      </w:pPr>
+      <w:bookmarkStart w:id="17" w:name="_Toc241165420"/>
+      <w:r>
+        <w:t>B/N</w:t>
+      </w:r>
+      <w:bookmarkEnd w:id="17"/>
+    </w:p>
+    <w:p>
+      <w:pPr>
+        <w:pStyle w:val="Ttulo2"/>
+      </w:pPr>
+      <w:bookmarkStart w:id="18" w:name="_Toc241165421"/>
+      <w:r>
+        <w:t>Color positivo/Color negativo</w:t>
+      </w:r>
+      <w:bookmarkEnd w:id="18"/>
+    </w:p>
+    <w:p>
+      <w:pPr>
+        <w:pStyle w:val="Ttulo2"/>
+      </w:pPr>
+      <w:bookmarkStart w:id="19" w:name="_Toc241165422"/>
+      <w:r>
+        <w:t>Otra tonalidad</w:t>
+      </w:r>
+      <w:bookmarkEnd w:id="19"/>
+    </w:p>
+    <w:p>
+      <w:r>
+        <w:t>Colores secundarios</w:t>
+      </w:r>
       <w:r>
         <w:br w:type="page"/>
       </w:r>
@@ -1448,14 +2627,14 @@
         <w:pStyle w:val="Ttulo1"/>
         <w:spacing w:after="240"/>
       </w:pPr>
-      <w:bookmarkStart w:id="6" w:name="_Toc240646882"/>
-      <w:bookmarkStart w:id="7" w:name="_Toc240655331"/>
+      <w:bookmarkStart w:id="20" w:name="_Toc240646882"/>
+      <w:bookmarkStart w:id="21" w:name="_Toc241165423"/>
       <w:r>
         <w:lastRenderedPageBreak/>
         <w:t>Bibliografía</w:t>
       </w:r>
-      <w:bookmarkEnd w:id="6"/>
-      <w:bookmarkEnd w:id="7"/>
+      <w:bookmarkEnd w:id="20"/>
+      <w:bookmarkEnd w:id="21"/>
     </w:p>
     <w:p>
       <w:pPr>
@@ -1472,7 +2651,7 @@
       <w:r>
         <w:t xml:space="preserve">: </w:t>
       </w:r>
-      <w:hyperlink r:id="rId14" w:history="1">
+      <w:hyperlink r:id="rId15" w:history="1">
         <w:r>
           <w:rPr>
             <w:rStyle w:val="Hipervnculo"/>
@@ -1493,7 +2672,7 @@
       <w:r>
         <w:t xml:space="preserve"> para las variantes del Imagotipo y el anuncio: </w:t>
       </w:r>
-      <w:hyperlink r:id="rId15" w:history="1">
+      <w:hyperlink r:id="rId16" w:history="1">
         <w:r>
           <w:rPr>
             <w:rStyle w:val="Hipervnculo"/>
@@ -1503,9 +2682,9 @@
       </w:hyperlink>
     </w:p>
     <w:sectPr>
-      <w:headerReference w:type="default" r:id="rId16"/>
-      <w:footerReference w:type="default" r:id="rId17"/>
-      <w:headerReference w:type="first" r:id="rId18"/>
+      <w:headerReference w:type="default" r:id="rId17"/>
+      <w:footerReference w:type="default" r:id="rId18"/>
+      <w:headerReference w:type="first" r:id="rId19"/>
       <w:pgSz w:w="11906" w:h="16838"/>
       <w:pgMar w:top="1417" w:right="1701" w:bottom="1417" w:left="1701" w:header="708" w:footer="708" w:gutter="0"/>
       <w:pgNumType w:start="0"/>
@@ -1551,7 +2730,6 @@
         <w:docPartUnique/>
       </w:docPartObj>
     </w:sdtPr>
-    <w:sdtEndPr/>
     <w:sdtContent>
       <w:p>
         <w:pPr>
@@ -1571,7 +2749,7 @@
           <w:rPr>
             <w:noProof/>
           </w:rPr>
-          <w:t>5</w:t>
+          <w:t>8</w:t>
         </w:r>
         <w:r>
           <w:fldChar w:fldCharType="end"/>
@@ -2200,7 +3378,6 @@
   <w:style w:type="character" w:default="1" w:styleId="Fuentedeprrafopredeter">
     <w:name w:val="Default Paragraph Font"/>
     <w:uiPriority w:val="1"/>
-    <w:semiHidden/>
     <w:unhideWhenUsed/>
   </w:style>
   <w:style w:type="table" w:default="1" w:styleId="Tablanormal">
@@ -2381,7 +3558,557 @@
       <w:contextualSpacing/>
     </w:pPr>
   </w:style>
+  <w:style w:type="paragraph" w:styleId="TDC3">
+    <w:name w:val="toc 3"/>
+    <w:basedOn w:val="Normal"/>
+    <w:next w:val="Normal"/>
+    <w:autoRedefine/>
+    <w:uiPriority w:val="39"/>
+    <w:unhideWhenUsed/>
+    <w:rsid w:val="00BC2C04"/>
+    <w:pPr>
+      <w:spacing w:after="100"/>
+      <w:ind w:left="440"/>
+    </w:pPr>
+    <w:rPr>
+      <w:rFonts w:eastAsiaTheme="minorEastAsia" w:cs="Times New Roman"/>
+      <w:lang w:eastAsia="es-ES"/>
+    </w:rPr>
+  </w:style>
 </w:styles>
+</file>
+
+<file path=word/glossary/document.xml><?xml version="1.0" encoding="utf-8"?>
+<w:glossaryDocument xmlns:wpc="http://schemas.microsoft.com/office/word/2010/wordprocessingCanvas" xmlns:cx="http://schemas.microsoft.com/office/drawing/2014/chartex" xmlns:mc="http://schemas.openxmlformats.org/markup-compatibility/2006" xmlns:o="urn:schemas-microsoft-com:office:office" xmlns:r="http://schemas.openxmlformats.org/officeDocument/2006/relationships" xmlns:m="http://schemas.openxmlformats.org/officeDocument/2006/math" xmlns:v="urn:schemas-microsoft-com:vml" xmlns:wp14="http://schemas.microsoft.com/office/word/2010/wordprocessingDrawing" xmlns:wp="http://schemas.openxmlformats.org/drawingml/2006/wordprocessingDrawing" xmlns:w10="urn:schemas-microsoft-com:office:word" xmlns:w="http://schemas.openxmlformats.org/wordprocessingml/2006/main" xmlns:w14="http://schemas.microsoft.com/office/word/2010/wordml" xmlns:w15="http://schemas.microsoft.com/office/word/2012/wordml" xmlns:w16se="http://schemas.microsoft.com/office/word/2015/wordml/symex" xmlns:wpg="http://schemas.microsoft.com/office/word/2010/wordprocessingGroup" xmlns:wpi="http://schemas.microsoft.com/office/word/2010/wordprocessingInk" xmlns:wne="http://schemas.microsoft.com/office/word/2006/wordml" xmlns:wps="http://schemas.microsoft.com/office/word/2010/wordprocessingShape" mc:Ignorable="w14 w15 w16se wp14"/>
+</file>
+
+<file path=word/glossary/fontTable.xml><?xml version="1.0" encoding="utf-8"?>
+<w:fonts xmlns:mc="http://schemas.openxmlformats.org/markup-compatibility/2006" xmlns:r="http://schemas.openxmlformats.org/officeDocument/2006/relationships" xmlns:w="http://schemas.openxmlformats.org/wordprocessingml/2006/main" xmlns:w14="http://schemas.microsoft.com/office/word/2010/wordml" xmlns:w15="http://schemas.microsoft.com/office/word/2012/wordml" xmlns:w16se="http://schemas.microsoft.com/office/word/2015/wordml/symex" mc:Ignorable="w14 w15 w16se">
+  <w:font w:name="Calibri">
+    <w:panose1 w:val="020F0502020204030204"/>
+    <w:charset w:val="00"/>
+    <w:family w:val="swiss"/>
+    <w:pitch w:val="variable"/>
+    <w:sig w:usb0="E4002EFF" w:usb1="C200247B" w:usb2="00000009" w:usb3="00000000" w:csb0="000001FF" w:csb1="00000000"/>
+  </w:font>
+  <w:font w:name="Courier New">
+    <w:panose1 w:val="02070309020205020404"/>
+    <w:charset w:val="00"/>
+    <w:family w:val="modern"/>
+    <w:pitch w:val="fixed"/>
+    <w:sig w:usb0="E0002EFF" w:usb1="C0007843" w:usb2="00000009" w:usb3="00000000" w:csb0="000001FF" w:csb1="00000000"/>
+  </w:font>
+  <w:font w:name="Times New Roman">
+    <w:panose1 w:val="02020603050405020304"/>
+    <w:charset w:val="00"/>
+    <w:family w:val="roman"/>
+    <w:pitch w:val="variable"/>
+    <w:sig w:usb0="E0002EFF" w:usb1="C000785B" w:usb2="00000009" w:usb3="00000000" w:csb0="000001FF" w:csb1="00000000"/>
+  </w:font>
+  <w:font w:name="Wingdings">
+    <w:panose1 w:val="05000000000000000000"/>
+    <w:charset w:val="02"/>
+    <w:family w:val="auto"/>
+    <w:pitch w:val="variable"/>
+    <w:sig w:usb0="00000000" w:usb1="10000000" w:usb2="00000000" w:usb3="00000000" w:csb0="80000000" w:csb1="00000000"/>
+  </w:font>
+  <w:font w:name="Symbol">
+    <w:panose1 w:val="05050102010706020507"/>
+    <w:charset w:val="02"/>
+    <w:family w:val="roman"/>
+    <w:pitch w:val="variable"/>
+    <w:sig w:usb0="00000000" w:usb1="10000000" w:usb2="00000000" w:usb3="00000000" w:csb0="80000000" w:csb1="00000000"/>
+  </w:font>
+  <w:font w:name="Calibri Light">
+    <w:panose1 w:val="020F0302020204030204"/>
+    <w:charset w:val="00"/>
+    <w:family w:val="swiss"/>
+    <w:pitch w:val="variable"/>
+    <w:sig w:usb0="E4002EFF" w:usb1="C200247B" w:usb2="00000009" w:usb3="00000000" w:csb0="000001FF" w:csb1="00000000"/>
+  </w:font>
+</w:fonts>
+</file>
+
+<file path=word/glossary/settings.xml><?xml version="1.0" encoding="utf-8"?>
+<w:settings xmlns:mc="http://schemas.openxmlformats.org/markup-compatibility/2006" xmlns:o="urn:schemas-microsoft-com:office:office" xmlns:r="http://schemas.openxmlformats.org/officeDocument/2006/relationships" xmlns:m="http://schemas.openxmlformats.org/officeDocument/2006/math" xmlns:v="urn:schemas-microsoft-com:vml" xmlns:w10="urn:schemas-microsoft-com:office:word" xmlns:w="http://schemas.openxmlformats.org/wordprocessingml/2006/main" xmlns:w14="http://schemas.microsoft.com/office/word/2010/wordml" xmlns:w15="http://schemas.microsoft.com/office/word/2012/wordml" xmlns:w16se="http://schemas.microsoft.com/office/word/2015/wordml/symex" xmlns:sl="http://schemas.openxmlformats.org/schemaLibrary/2006/main" mc:Ignorable="w14 w15 w16se">
+  <w:view w:val="normal"/>
+  <w:defaultTabStop w:val="708"/>
+  <w:hyphenationZone w:val="425"/>
+  <w:characterSpacingControl w:val="doNotCompress"/>
+  <w:compat>
+    <w:useFELayout/>
+    <w:compatSetting w:name="compatibilityMode" w:uri="http://schemas.microsoft.com/office/word" w:val="15"/>
+    <w:compatSetting w:name="overrideTableStyleFontSizeAndJustification" w:uri="http://schemas.microsoft.com/office/word" w:val="1"/>
+    <w:compatSetting w:name="enableOpenTypeFeatures" w:uri="http://schemas.microsoft.com/office/word" w:val="1"/>
+    <w:compatSetting w:name="doNotFlipMirrorIndents" w:uri="http://schemas.microsoft.com/office/word" w:val="1"/>
+    <w:compatSetting w:name="differentiateMultirowTableHeaders" w:uri="http://schemas.microsoft.com/office/word" w:val="1"/>
+  </w:compat>
+  <w:rsids>
+    <w:rsidRoot w:val="000E7956"/>
+    <w:rsid w:val="000E7956"/>
+  </w:rsids>
+  <m:mathPr>
+    <m:mathFont m:val="Cambria Math"/>
+    <m:brkBin m:val="before"/>
+    <m:brkBinSub m:val="--"/>
+    <m:smallFrac m:val="0"/>
+    <m:dispDef/>
+    <m:lMargin m:val="0"/>
+    <m:rMargin m:val="0"/>
+    <m:defJc m:val="centerGroup"/>
+    <m:wrapIndent m:val="1440"/>
+    <m:intLim m:val="subSup"/>
+    <m:naryLim m:val="undOvr"/>
+  </m:mathPr>
+  <w:themeFontLang w:val="es-ES"/>
+  <w:clrSchemeMapping w:bg1="light1" w:t1="dark1" w:bg2="light2" w:t2="dark2" w:accent1="accent1" w:accent2="accent2" w:accent3="accent3" w:accent4="accent4" w:accent5="accent5" w:accent6="accent6" w:hyperlink="hyperlink" w:followedHyperlink="followedHyperlink"/>
+  <w:decimalSymbol w:val=","/>
+  <w:listSeparator w:val=";"/>
+  <w15:chartTrackingRefBased/>
+</w:settings>
+</file>
+
+<file path=word/glossary/styles.xml><?xml version="1.0" encoding="utf-8"?>
+<w:styles xmlns:mc="http://schemas.openxmlformats.org/markup-compatibility/2006" xmlns:r="http://schemas.openxmlformats.org/officeDocument/2006/relationships" xmlns:w="http://schemas.openxmlformats.org/wordprocessingml/2006/main" xmlns:w14="http://schemas.microsoft.com/office/word/2010/wordml" xmlns:w15="http://schemas.microsoft.com/office/word/2012/wordml" xmlns:w16se="http://schemas.microsoft.com/office/word/2015/wordml/symex" mc:Ignorable="w14 w15 w16se">
+  <w:docDefaults>
+    <w:rPrDefault>
+      <w:rPr>
+        <w:rFonts w:asciiTheme="minorHAnsi" w:eastAsiaTheme="minorEastAsia" w:hAnsiTheme="minorHAnsi" w:cstheme="minorBidi"/>
+        <w:sz w:val="22"/>
+        <w:szCs w:val="22"/>
+        <w:lang w:val="es-ES" w:eastAsia="es-ES" w:bidi="ar-SA"/>
+      </w:rPr>
+    </w:rPrDefault>
+    <w:pPrDefault>
+      <w:pPr>
+        <w:spacing w:after="160" w:line="259" w:lineRule="auto"/>
+      </w:pPr>
+    </w:pPrDefault>
+  </w:docDefaults>
+  <w:latentStyles w:defLockedState="0" w:defUIPriority="99" w:defSemiHidden="0" w:defUnhideWhenUsed="0" w:defQFormat="0" w:count="371">
+    <w:lsdException w:name="Normal" w:uiPriority="0" w:qFormat="1"/>
+    <w:lsdException w:name="heading 1" w:uiPriority="9" w:qFormat="1"/>
+    <w:lsdException w:name="heading 2" w:semiHidden="1" w:uiPriority="9" w:unhideWhenUsed="1" w:qFormat="1"/>
+    <w:lsdException w:name="heading 3" w:semiHidden="1" w:uiPriority="9" w:unhideWhenUsed="1" w:qFormat="1"/>
+    <w:lsdException w:name="heading 4" w:semiHidden="1" w:uiPriority="9" w:unhideWhenUsed="1" w:qFormat="1"/>
+    <w:lsdException w:name="heading 5" w:semiHidden="1" w:uiPriority="9" w:unhideWhenUsed="1" w:qFormat="1"/>
+    <w:lsdException w:name="heading 6" w:semiHidden="1" w:uiPriority="9" w:unhideWhenUsed="1" w:qFormat="1"/>
+    <w:lsdException w:name="heading 7" w:semiHidden="1" w:uiPriority="9" w:unhideWhenUsed="1" w:qFormat="1"/>
+    <w:lsdException w:name="heading 8" w:semiHidden="1" w:uiPriority="9" w:unhideWhenUsed="1" w:qFormat="1"/>
+    <w:lsdException w:name="heading 9" w:semiHidden="1" w:uiPriority="9" w:unhideWhenUsed="1" w:qFormat="1"/>
+    <w:lsdException w:name="index 1" w:semiHidden="1" w:unhideWhenUsed="1"/>
+    <w:lsdException w:name="index 2" w:semiHidden="1" w:unhideWhenUsed="1"/>
+    <w:lsdException w:name="index 3" w:semiHidden="1" w:unhideWhenUsed="1"/>
+    <w:lsdException w:name="index 4" w:semiHidden="1" w:unhideWhenUsed="1"/>
+    <w:lsdException w:name="index 5" w:semiHidden="1" w:unhideWhenUsed="1"/>
+    <w:lsdException w:name="index 6" w:semiHidden="1" w:unhideWhenUsed="1"/>
+    <w:lsdException w:name="index 7" w:semiHidden="1" w:unhideWhenUsed="1"/>
+    <w:lsdException w:name="index 8" w:semiHidden="1" w:unhideWhenUsed="1"/>
+    <w:lsdException w:name="index 9" w:semiHidden="1" w:unhideWhenUsed="1"/>
+    <w:lsdException w:name="toc 1" w:semiHidden="1" w:uiPriority="39" w:unhideWhenUsed="1"/>
+    <w:lsdException w:name="toc 2" w:semiHidden="1" w:uiPriority="39" w:unhideWhenUsed="1"/>
+    <w:lsdException w:name="toc 3" w:semiHidden="1" w:uiPriority="39" w:unhideWhenUsed="1"/>
+    <w:lsdException w:name="toc 4" w:semiHidden="1" w:uiPriority="39" w:unhideWhenUsed="1"/>
+    <w:lsdException w:name="toc 5" w:semiHidden="1" w:uiPriority="39" w:unhideWhenUsed="1"/>
+    <w:lsdException w:name="toc 6" w:semiHidden="1" w:uiPriority="39" w:unhideWhenUsed="1"/>
+    <w:lsdException w:name="toc 7" w:semiHidden="1" w:uiPriority="39" w:unhideWhenUsed="1"/>
+    <w:lsdException w:name="toc 8" w:semiHidden="1" w:uiPriority="39" w:unhideWhenUsed="1"/>
+    <w:lsdException w:name="toc 9" w:semiHidden="1" w:uiPriority="39" w:unhideWhenUsed="1"/>
+    <w:lsdException w:name="Normal Indent" w:semiHidden="1" w:unhideWhenUsed="1"/>
+    <w:lsdException w:name="footnote text" w:semiHidden="1" w:unhideWhenUsed="1"/>
+    <w:lsdException w:name="annotation text" w:semiHidden="1" w:unhideWhenUsed="1"/>
+    <w:lsdException w:name="header" w:semiHidden="1" w:unhideWhenUsed="1"/>
+    <w:lsdException w:name="footer" w:semiHidden="1" w:unhideWhenUsed="1"/>
+    <w:lsdException w:name="index heading" w:semiHidden="1" w:unhideWhenUsed="1"/>
+    <w:lsdException w:name="caption" w:semiHidden="1" w:uiPriority="35" w:unhideWhenUsed="1" w:qFormat="1"/>
+    <w:lsdException w:name="table of figures" w:semiHidden="1" w:unhideWhenUsed="1"/>
+    <w:lsdException w:name="envelope address" w:semiHidden="1" w:unhideWhenUsed="1"/>
+    <w:lsdException w:name="envelope return" w:semiHidden="1" w:unhideWhenUsed="1"/>
+    <w:lsdException w:name="footnote reference" w:semiHidden="1" w:unhideWhenUsed="1"/>
+    <w:lsdException w:name="annotation reference" w:semiHidden="1" w:unhideWhenUsed="1"/>
+    <w:lsdException w:name="line number" w:semiHidden="1" w:unhideWhenUsed="1"/>
+    <w:lsdException w:name="page number" w:semiHidden="1" w:unhideWhenUsed="1"/>
+    <w:lsdException w:name="endnote reference" w:semiHidden="1" w:unhideWhenUsed="1"/>
+    <w:lsdException w:name="endnote text" w:semiHidden="1" w:unhideWhenUsed="1"/>
+    <w:lsdException w:name="table of authorities" w:semiHidden="1" w:unhideWhenUsed="1"/>
+    <w:lsdException w:name="macro" w:semiHidden="1" w:unhideWhenUsed="1"/>
+    <w:lsdException w:name="toa heading" w:semiHidden="1" w:unhideWhenUsed="1"/>
+    <w:lsdException w:name="List" w:semiHidden="1" w:unhideWhenUsed="1"/>
+    <w:lsdException w:name="List Bullet" w:semiHidden="1" w:unhideWhenUsed="1"/>
+    <w:lsdException w:name="List Number" w:semiHidden="1" w:unhideWhenUsed="1"/>
+    <w:lsdException w:name="List 2" w:semiHidden="1" w:unhideWhenUsed="1"/>
+    <w:lsdException w:name="List 3" w:semiHidden="1" w:unhideWhenUsed="1"/>
+    <w:lsdException w:name="List 4" w:semiHidden="1" w:unhideWhenUsed="1"/>
+    <w:lsdException w:name="List 5" w:semiHidden="1" w:unhideWhenUsed="1"/>
+    <w:lsdException w:name="List Bullet 2" w:semiHidden="1" w:unhideWhenUsed="1"/>
+    <w:lsdException w:name="List Bullet 3" w:semiHidden="1" w:unhideWhenUsed="1"/>
+    <w:lsdException w:name="List Bullet 4" w:semiHidden="1" w:unhideWhenUsed="1"/>
+    <w:lsdException w:name="List Bullet 5" w:semiHidden="1" w:unhideWhenUsed="1"/>
+    <w:lsdException w:name="List Number 2" w:semiHidden="1" w:unhideWhenUsed="1"/>
+    <w:lsdException w:name="List Number 3" w:semiHidden="1" w:unhideWhenUsed="1"/>
+    <w:lsdException w:name="List Number 4" w:semiHidden="1" w:unhideWhenUsed="1"/>
+    <w:lsdException w:name="List Number 5" w:semiHidden="1" w:unhideWhenUsed="1"/>
+    <w:lsdException w:name="Title" w:uiPriority="10" w:qFormat="1"/>
+    <w:lsdException w:name="Closing" w:semiHidden="1" w:unhideWhenUsed="1"/>
+    <w:lsdException w:name="Signature" w:semiHidden="1" w:unhideWhenUsed="1"/>
+    <w:lsdException w:name="Default Paragraph Font" w:semiHidden="1" w:uiPriority="1" w:unhideWhenUsed="1"/>
+    <w:lsdException w:name="Body Text" w:semiHidden="1" w:unhideWhenUsed="1"/>
+    <w:lsdException w:name="Body Text Indent" w:semiHidden="1" w:unhideWhenUsed="1"/>
+    <w:lsdException w:name="List Continue" w:semiHidden="1" w:unhideWhenUsed="1"/>
+    <w:lsdException w:name="List Continue 2" w:semiHidden="1" w:unhideWhenUsed="1"/>
+    <w:lsdException w:name="List Continue 3" w:semiHidden="1" w:unhideWhenUsed="1"/>
+    <w:lsdException w:name="List Continue 4" w:semiHidden="1" w:unhideWhenUsed="1"/>
+    <w:lsdException w:name="List Continue 5" w:semiHidden="1" w:unhideWhenUsed="1"/>
+    <w:lsdException w:name="Message Header" w:semiHidden="1" w:unhideWhenUsed="1"/>
+    <w:lsdException w:name="Subtitle" w:uiPriority="11" w:qFormat="1"/>
+    <w:lsdException w:name="Salutation" w:semiHidden="1" w:unhideWhenUsed="1"/>
+    <w:lsdException w:name="Date" w:semiHidden="1" w:unhideWhenUsed="1"/>
+    <w:lsdException w:name="Body Text First Indent" w:semiHidden="1" w:unhideWhenUsed="1"/>
+    <w:lsdException w:name="Body Text First Indent 2" w:semiHidden="1" w:unhideWhenUsed="1"/>
+    <w:lsdException w:name="Note Heading" w:semiHidden="1" w:unhideWhenUsed="1"/>
+    <w:lsdException w:name="Body Text 2" w:semiHidden="1" w:unhideWhenUsed="1"/>
+    <w:lsdException w:name="Body Text 3" w:semiHidden="1" w:unhideWhenUsed="1"/>
+    <w:lsdException w:name="Body Text Indent 2" w:semiHidden="1" w:unhideWhenUsed="1"/>
+    <w:lsdException w:name="Body Text Indent 3" w:semiHidden="1" w:unhideWhenUsed="1"/>
+    <w:lsdException w:name="Block Text" w:semiHidden="1" w:unhideWhenUsed="1"/>
+    <w:lsdException w:name="Hyperlink" w:semiHidden="1" w:unhideWhenUsed="1"/>
+    <w:lsdException w:name="FollowedHyperlink" w:semiHidden="1" w:unhideWhenUsed="1"/>
+    <w:lsdException w:name="Strong" w:uiPriority="22" w:qFormat="1"/>
+    <w:lsdException w:name="Emphasis" w:uiPriority="20" w:qFormat="1"/>
+    <w:lsdException w:name="Document Map" w:semiHidden="1" w:unhideWhenUsed="1"/>
+    <w:lsdException w:name="Plain Text" w:semiHidden="1" w:unhideWhenUsed="1"/>
+    <w:lsdException w:name="E-mail Signature" w:semiHidden="1" w:unhideWhenUsed="1"/>
+    <w:lsdException w:name="HTML Top of Form" w:semiHidden="1" w:unhideWhenUsed="1"/>
+    <w:lsdException w:name="HTML Bottom of Form" w:semiHidden="1" w:unhideWhenUsed="1"/>
+    <w:lsdException w:name="Normal (Web)" w:semiHidden="1" w:unhideWhenUsed="1"/>
+    <w:lsdException w:name="HTML Acronym" w:semiHidden="1" w:unhideWhenUsed="1"/>
+    <w:lsdException w:name="HTML Address" w:semiHidden="1" w:unhideWhenUsed="1"/>
+    <w:lsdException w:name="HTML Cite" w:semiHidden="1" w:unhideWhenUsed="1"/>
+    <w:lsdException w:name="HTML Code" w:semiHidden="1" w:unhideWhenUsed="1"/>
+    <w:lsdException w:name="HTML Definition" w:semiHidden="1" w:unhideWhenUsed="1"/>
+    <w:lsdException w:name="HTML Keyboard" w:semiHidden="1" w:unhideWhenUsed="1"/>
+    <w:lsdException w:name="HTML Preformatted" w:semiHidden="1" w:unhideWhenUsed="1"/>
+    <w:lsdException w:name="HTML Sample" w:semiHidden="1" w:unhideWhenUsed="1"/>
+    <w:lsdException w:name="HTML Typewriter" w:semiHidden="1" w:unhideWhenUsed="1"/>
+    <w:lsdException w:name="HTML Variable" w:semiHidden="1" w:unhideWhenUsed="1"/>
+    <w:lsdException w:name="Normal Table" w:semiHidden="1" w:unhideWhenUsed="1"/>
+    <w:lsdException w:name="annotation subject" w:semiHidden="1" w:unhideWhenUsed="1"/>
+    <w:lsdException w:name="No List" w:semiHidden="1" w:unhideWhenUsed="1"/>
+    <w:lsdException w:name="Outline List 1" w:semiHidden="1" w:unhideWhenUsed="1"/>
+    <w:lsdException w:name="Outline List 2" w:semiHidden="1" w:unhideWhenUsed="1"/>
+    <w:lsdException w:name="Outline List 3" w:semiHidden="1" w:unhideWhenUsed="1"/>
+    <w:lsdException w:name="Table Simple 1" w:semiHidden="1" w:unhideWhenUsed="1"/>
+    <w:lsdException w:name="Table Simple 2" w:semiHidden="1" w:unhideWhenUsed="1"/>
+    <w:lsdException w:name="Table Simple 3" w:semiHidden="1" w:unhideWhenUsed="1"/>
+    <w:lsdException w:name="Table Classic 1" w:semiHidden="1" w:unhideWhenUsed="1"/>
+    <w:lsdException w:name="Table Classic 2" w:semiHidden="1" w:unhideWhenUsed="1"/>
+    <w:lsdException w:name="Table Classic 3" w:semiHidden="1" w:unhideWhenUsed="1"/>
+    <w:lsdException w:name="Table Classic 4" w:semiHidden="1" w:unhideWhenUsed="1"/>
+    <w:lsdException w:name="Table Colorful 1" w:semiHidden="1" w:unhideWhenUsed="1"/>
+    <w:lsdException w:name="Table Colorful 2" w:semiHidden="1" w:unhideWhenUsed="1"/>
+    <w:lsdException w:name="Table Colorful 3" w:semiHidden="1" w:unhideWhenUsed="1"/>
+    <w:lsdException w:name="Table Columns 1" w:semiHidden="1" w:unhideWhenUsed="1"/>
+    <w:lsdException w:name="Table Columns 2" w:semiHidden="1" w:unhideWhenUsed="1"/>
+    <w:lsdException w:name="Table Columns 3" w:semiHidden="1" w:unhideWhenUsed="1"/>
+    <w:lsdException w:name="Table Columns 4" w:semiHidden="1" w:unhideWhenUsed="1"/>
+    <w:lsdException w:name="Table Columns 5" w:semiHidden="1" w:unhideWhenUsed="1"/>
+    <w:lsdException w:name="Table Grid 1" w:semiHidden="1" w:unhideWhenUsed="1"/>
+    <w:lsdException w:name="Table Grid 2" w:semiHidden="1" w:unhideWhenUsed="1"/>
+    <w:lsdException w:name="Table Grid 3" w:semiHidden="1" w:unhideWhenUsed="1"/>
+    <w:lsdException w:name="Table Grid 4" w:semiHidden="1" w:unhideWhenUsed="1"/>
+    <w:lsdException w:name="Table Grid 5" w:semiHidden="1" w:unhideWhenUsed="1"/>
+    <w:lsdException w:name="Table Grid 6" w:semiHidden="1" w:unhideWhenUsed="1"/>
+    <w:lsdException w:name="Table Grid 7" w:semiHidden="1" w:unhideWhenUsed="1"/>
+    <w:lsdException w:name="Table Grid 8" w:semiHidden="1" w:unhideWhenUsed="1"/>
+    <w:lsdException w:name="Table List 1" w:semiHidden="1" w:unhideWhenUsed="1"/>
+    <w:lsdException w:name="Table List 2" w:semiHidden="1" w:unhideWhenUsed="1"/>
+    <w:lsdException w:name="Table List 3" w:semiHidden="1" w:unhideWhenUsed="1"/>
+    <w:lsdException w:name="Table List 4" w:semiHidden="1" w:unhideWhenUsed="1"/>
+    <w:lsdException w:name="Table List 5" w:semiHidden="1" w:unhideWhenUsed="1"/>
+    <w:lsdException w:name="Table List 6" w:semiHidden="1" w:unhideWhenUsed="1"/>
+    <w:lsdException w:name="Table List 7" w:semiHidden="1" w:unhideWhenUsed="1"/>
+    <w:lsdException w:name="Table List 8" w:semiHidden="1" w:unhideWhenUsed="1"/>
+    <w:lsdException w:name="Table 3D effects 1" w:semiHidden="1" w:unhideWhenUsed="1"/>
+    <w:lsdException w:name="Table 3D effects 2" w:semiHidden="1" w:unhideWhenUsed="1"/>
+    <w:lsdException w:name="Table 3D effects 3" w:semiHidden="1" w:unhideWhenUsed="1"/>
+    <w:lsdException w:name="Table Contemporary" w:semiHidden="1" w:unhideWhenUsed="1"/>
+    <w:lsdException w:name="Table Elegant" w:semiHidden="1" w:unhideWhenUsed="1"/>
+    <w:lsdException w:name="Table Professional" w:semiHidden="1" w:unhideWhenUsed="1"/>
+    <w:lsdException w:name="Table Subtle 1" w:semiHidden="1" w:unhideWhenUsed="1"/>
+    <w:lsdException w:name="Table Subtle 2" w:semiHidden="1" w:unhideWhenUsed="1"/>
+    <w:lsdException w:name="Table Web 1" w:semiHidden="1" w:unhideWhenUsed="1"/>
+    <w:lsdException w:name="Table Web 2" w:semiHidden="1" w:unhideWhenUsed="1"/>
+    <w:lsdException w:name="Table Web 3" w:semiHidden="1" w:unhideWhenUsed="1"/>
+    <w:lsdException w:name="Balloon Text" w:semiHidden="1" w:unhideWhenUsed="1"/>
+    <w:lsdException w:name="Table Grid" w:uiPriority="39"/>
+    <w:lsdException w:name="Table Theme" w:semiHidden="1" w:unhideWhenUsed="1"/>
+    <w:lsdException w:name="Placeholder Text" w:semiHidden="1"/>
+    <w:lsdException w:name="No Spacing" w:uiPriority="1" w:qFormat="1"/>
+    <w:lsdException w:name="Light Shading" w:uiPriority="60"/>
+    <w:lsdException w:name="Light List" w:uiPriority="61"/>
+    <w:lsdException w:name="Light Grid" w:uiPriority="62"/>
+    <w:lsdException w:name="Medium Shading 1" w:uiPriority="63"/>
+    <w:lsdException w:name="Medium Shading 2" w:uiPriority="64"/>
+    <w:lsdException w:name="Medium List 1" w:uiPriority="65"/>
+    <w:lsdException w:name="Medium List 2" w:uiPriority="66"/>
+    <w:lsdException w:name="Medium Grid 1" w:uiPriority="67"/>
+    <w:lsdException w:name="Medium Grid 2" w:uiPriority="68"/>
+    <w:lsdException w:name="Medium Grid 3" w:uiPriority="69"/>
+    <w:lsdException w:name="Dark List" w:uiPriority="70"/>
+    <w:lsdException w:name="Colorful Shading" w:uiPriority="71"/>
+    <w:lsdException w:name="Colorful List" w:uiPriority="72"/>
+    <w:lsdException w:name="Colorful Grid" w:uiPriority="73"/>
+    <w:lsdException w:name="Light Shading Accent 1" w:uiPriority="60"/>
+    <w:lsdException w:name="Light List Accent 1" w:uiPriority="61"/>
+    <w:lsdException w:name="Light Grid Accent 1" w:uiPriority="62"/>
+    <w:lsdException w:name="Medium Shading 1 Accent 1" w:uiPriority="63"/>
+    <w:lsdException w:name="Medium Shading 2 Accent 1" w:uiPriority="64"/>
+    <w:lsdException w:name="Medium List 1 Accent 1" w:uiPriority="65"/>
+    <w:lsdException w:name="Revision" w:semiHidden="1"/>
+    <w:lsdException w:name="List Paragraph" w:uiPriority="34" w:qFormat="1"/>
+    <w:lsdException w:name="Quote" w:uiPriority="29" w:qFormat="1"/>
+    <w:lsdException w:name="Intense Quote" w:uiPriority="30" w:qFormat="1"/>
+    <w:lsdException w:name="Medium List 2 Accent 1" w:uiPriority="66"/>
+    <w:lsdException w:name="Medium Grid 1 Accent 1" w:uiPriority="67"/>
+    <w:lsdException w:name="Medium Grid 2 Accent 1" w:uiPriority="68"/>
+    <w:lsdException w:name="Medium Grid 3 Accent 1" w:uiPriority="69"/>
+    <w:lsdException w:name="Dark List Accent 1" w:uiPriority="70"/>
+    <w:lsdException w:name="Colorful Shading Accent 1" w:uiPriority="71"/>
+    <w:lsdException w:name="Colorful List Accent 1" w:uiPriority="72"/>
+    <w:lsdException w:name="Colorful Grid Accent 1" w:uiPriority="73"/>
+    <w:lsdException w:name="Light Shading Accent 2" w:uiPriority="60"/>
+    <w:lsdException w:name="Light List Accent 2" w:uiPriority="61"/>
+    <w:lsdException w:name="Light Grid Accent 2" w:uiPriority="62"/>
+    <w:lsdException w:name="Medium Shading 1 Accent 2" w:uiPriority="63"/>
+    <w:lsdException w:name="Medium Shading 2 Accent 2" w:uiPriority="64"/>
+    <w:lsdException w:name="Medium List 1 Accent 2" w:uiPriority="65"/>
+    <w:lsdException w:name="Medium List 2 Accent 2" w:uiPriority="66"/>
+    <w:lsdException w:name="Medium Grid 1 Accent 2" w:uiPriority="67"/>
+    <w:lsdException w:name="Medium Grid 2 Accent 2" w:uiPriority="68"/>
+    <w:lsdException w:name="Medium Grid 3 Accent 2" w:uiPriority="69"/>
+    <w:lsdException w:name="Dark List Accent 2" w:uiPriority="70"/>
+    <w:lsdException w:name="Colorful Shading Accent 2" w:uiPriority="71"/>
+    <w:lsdException w:name="Colorful List Accent 2" w:uiPriority="72"/>
+    <w:lsdException w:name="Colorful Grid Accent 2" w:uiPriority="73"/>
+    <w:lsdException w:name="Light Shading Accent 3" w:uiPriority="60"/>
+    <w:lsdException w:name="Light List Accent 3" w:uiPriority="61"/>
+    <w:lsdException w:name="Light Grid Accent 3" w:uiPriority="62"/>
+    <w:lsdException w:name="Medium Shading 1 Accent 3" w:uiPriority="63"/>
+    <w:lsdException w:name="Medium Shading 2 Accent 3" w:uiPriority="64"/>
+    <w:lsdException w:name="Medium List 1 Accent 3" w:uiPriority="65"/>
+    <w:lsdException w:name="Medium List 2 Accent 3" w:uiPriority="66"/>
+    <w:lsdException w:name="Medium Grid 1 Accent 3" w:uiPriority="67"/>
+    <w:lsdException w:name="Medium Grid 2 Accent 3" w:uiPriority="68"/>
+    <w:lsdException w:name="Medium Grid 3 Accent 3" w:uiPriority="69"/>
+    <w:lsdException w:name="Dark List Accent 3" w:uiPriority="70"/>
+    <w:lsdException w:name="Colorful Shading Accent 3" w:uiPriority="71"/>
+    <w:lsdException w:name="Colorful List Accent 3" w:uiPriority="72"/>
+    <w:lsdException w:name="Colorful Grid Accent 3" w:uiPriority="73"/>
+    <w:lsdException w:name="Light Shading Accent 4" w:uiPriority="60"/>
+    <w:lsdException w:name="Light List Accent 4" w:uiPriority="61"/>
+    <w:lsdException w:name="Light Grid Accent 4" w:uiPriority="62"/>
+    <w:lsdException w:name="Medium Shading 1 Accent 4" w:uiPriority="63"/>
+    <w:lsdException w:name="Medium Shading 2 Accent 4" w:uiPriority="64"/>
+    <w:lsdException w:name="Medium List 1 Accent 4" w:uiPriority="65"/>
+    <w:lsdException w:name="Medium List 2 Accent 4" w:uiPriority="66"/>
+    <w:lsdException w:name="Medium Grid 1 Accent 4" w:uiPriority="67"/>
+    <w:lsdException w:name="Medium Grid 2 Accent 4" w:uiPriority="68"/>
+    <w:lsdException w:name="Medium Grid 3 Accent 4" w:uiPriority="69"/>
+    <w:lsdException w:name="Dark List Accent 4" w:uiPriority="70"/>
+    <w:lsdException w:name="Colorful Shading Accent 4" w:uiPriority="71"/>
+    <w:lsdException w:name="Colorful List Accent 4" w:uiPriority="72"/>
+    <w:lsdException w:name="Colorful Grid Accent 4" w:uiPriority="73"/>
+    <w:lsdException w:name="Light Shading Accent 5" w:uiPriority="60"/>
+    <w:lsdException w:name="Light List Accent 5" w:uiPriority="61"/>
+    <w:lsdException w:name="Light Grid Accent 5" w:uiPriority="62"/>
+    <w:lsdException w:name="Medium Shading 1 Accent 5" w:uiPriority="63"/>
+    <w:lsdException w:name="Medium Shading 2 Accent 5" w:uiPriority="64"/>
+    <w:lsdException w:name="Medium List 1 Accent 5" w:uiPriority="65"/>
+    <w:lsdException w:name="Medium List 2 Accent 5" w:uiPriority="66"/>
+    <w:lsdException w:name="Medium Grid 1 Accent 5" w:uiPriority="67"/>
+    <w:lsdException w:name="Medium Grid 2 Accent 5" w:uiPriority="68"/>
+    <w:lsdException w:name="Medium Grid 3 Accent 5" w:uiPriority="69"/>
+    <w:lsdException w:name="Dark List Accent 5" w:uiPriority="70"/>
+    <w:lsdException w:name="Colorful Shading Accent 5" w:uiPriority="71"/>
+    <w:lsdException w:name="Colorful List Accent 5" w:uiPriority="72"/>
+    <w:lsdException w:name="Colorful Grid Accent 5" w:uiPriority="73"/>
+    <w:lsdException w:name="Light Shading Accent 6" w:uiPriority="60"/>
+    <w:lsdException w:name="Light List Accent 6" w:uiPriority="61"/>
+    <w:lsdException w:name="Light Grid Accent 6" w:uiPriority="62"/>
+    <w:lsdException w:name="Medium Shading 1 Accent 6" w:uiPriority="63"/>
+    <w:lsdException w:name="Medium Shading 2 Accent 6" w:uiPriority="64"/>
+    <w:lsdException w:name="Medium List 1 Accent 6" w:uiPriority="65"/>
+    <w:lsdException w:name="Medium List 2 Accent 6" w:uiPriority="66"/>
+    <w:lsdException w:name="Medium Grid 1 Accent 6" w:uiPriority="67"/>
+    <w:lsdException w:name="Medium Grid 2 Accent 6" w:uiPriority="68"/>
+    <w:lsdException w:name="Medium Grid 3 Accent 6" w:uiPriority="69"/>
+    <w:lsdException w:name="Dark List Accent 6" w:uiPriority="70"/>
+    <w:lsdException w:name="Colorful Shading Accent 6" w:uiPriority="71"/>
+    <w:lsdException w:name="Colorful List Accent 6" w:uiPriority="72"/>
+    <w:lsdException w:name="Colorful Grid Accent 6" w:uiPriority="73"/>
+    <w:lsdException w:name="Subtle Emphasis" w:uiPriority="19" w:qFormat="1"/>
+    <w:lsdException w:name="Intense Emphasis" w:uiPriority="21" w:qFormat="1"/>
+    <w:lsdException w:name="Subtle Reference" w:uiPriority="31" w:qFormat="1"/>
+    <w:lsdException w:name="Intense Reference" w:uiPriority="32" w:qFormat="1"/>
+    <w:lsdException w:name="Book Title" w:uiPriority="33" w:qFormat="1"/>
+    <w:lsdException w:name="Bibliography" w:semiHidden="1" w:uiPriority="37" w:unhideWhenUsed="1"/>
+    <w:lsdException w:name="TOC Heading" w:semiHidden="1" w:uiPriority="39" w:unhideWhenUsed="1" w:qFormat="1"/>
+    <w:lsdException w:name="Plain Table 1" w:uiPriority="41"/>
+    <w:lsdException w:name="Plain Table 2" w:uiPriority="42"/>
+    <w:lsdException w:name="Plain Table 3" w:uiPriority="43"/>
+    <w:lsdException w:name="Plain Table 4" w:uiPriority="44"/>
+    <w:lsdException w:name="Plain Table 5" w:uiPriority="45"/>
+    <w:lsdException w:name="Grid Table Light" w:uiPriority="40"/>
+    <w:lsdException w:name="Grid Table 1 Light" w:uiPriority="46"/>
+    <w:lsdException w:name="Grid Table 2" w:uiPriority="47"/>
+    <w:lsdException w:name="Grid Table 3" w:uiPriority="48"/>
+    <w:lsdException w:name="Grid Table 4" w:uiPriority="49"/>
+    <w:lsdException w:name="Grid Table 5 Dark" w:uiPriority="50"/>
+    <w:lsdException w:name="Grid Table 6 Colorful" w:uiPriority="51"/>
+    <w:lsdException w:name="Grid Table 7 Colorful" w:uiPriority="52"/>
+    <w:lsdException w:name="Grid Table 1 Light Accent 1" w:uiPriority="46"/>
+    <w:lsdException w:name="Grid Table 2 Accent 1" w:uiPriority="47"/>
+    <w:lsdException w:name="Grid Table 3 Accent 1" w:uiPriority="48"/>
+    <w:lsdException w:name="Grid Table 4 Accent 1" w:uiPriority="49"/>
+    <w:lsdException w:name="Grid Table 5 Dark Accent 1" w:uiPriority="50"/>
+    <w:lsdException w:name="Grid Table 6 Colorful Accent 1" w:uiPriority="51"/>
+    <w:lsdException w:name="Grid Table 7 Colorful Accent 1" w:uiPriority="52"/>
+    <w:lsdException w:name="Grid Table 1 Light Accent 2" w:uiPriority="46"/>
+    <w:lsdException w:name="Grid Table 2 Accent 2" w:uiPriority="47"/>
+    <w:lsdException w:name="Grid Table 3 Accent 2" w:uiPriority="48"/>
+    <w:lsdException w:name="Grid Table 4 Accent 2" w:uiPriority="49"/>
+    <w:lsdException w:name="Grid Table 5 Dark Accent 2" w:uiPriority="50"/>
+    <w:lsdException w:name="Grid Table 6 Colorful Accent 2" w:uiPriority="51"/>
+    <w:lsdException w:name="Grid Table 7 Colorful Accent 2" w:uiPriority="52"/>
+    <w:lsdException w:name="Grid Table 1 Light Accent 3" w:uiPriority="46"/>
+    <w:lsdException w:name="Grid Table 2 Accent 3" w:uiPriority="47"/>
+    <w:lsdException w:name="Grid Table 3 Accent 3" w:uiPriority="48"/>
+    <w:lsdException w:name="Grid Table 4 Accent 3" w:uiPriority="49"/>
+    <w:lsdException w:name="Grid Table 5 Dark Accent 3" w:uiPriority="50"/>
+    <w:lsdException w:name="Grid Table 6 Colorful Accent 3" w:uiPriority="51"/>
+    <w:lsdException w:name="Grid Table 7 Colorful Accent 3" w:uiPriority="52"/>
+    <w:lsdException w:name="Grid Table 1 Light Accent 4" w:uiPriority="46"/>
+    <w:lsdException w:name="Grid Table 2 Accent 4" w:uiPriority="47"/>
+    <w:lsdException w:name="Grid Table 3 Accent 4" w:uiPriority="48"/>
+    <w:lsdException w:name="Grid Table 4 Accent 4" w:uiPriority="49"/>
+    <w:lsdException w:name="Grid Table 5 Dark Accent 4" w:uiPriority="50"/>
+    <w:lsdException w:name="Grid Table 6 Colorful Accent 4" w:uiPriority="51"/>
+    <w:lsdException w:name="Grid Table 7 Colorful Accent 4" w:uiPriority="52"/>
+    <w:lsdException w:name="Grid Table 1 Light Accent 5" w:uiPriority="46"/>
+    <w:lsdException w:name="Grid Table 2 Accent 5" w:uiPriority="47"/>
+    <w:lsdException w:name="Grid Table 3 Accent 5" w:uiPriority="48"/>
+    <w:lsdException w:name="Grid Table 4 Accent 5" w:uiPriority="49"/>
+    <w:lsdException w:name="Grid Table 5 Dark Accent 5" w:uiPriority="50"/>
+    <w:lsdException w:name="Grid Table 6 Colorful Accent 5" w:uiPriority="51"/>
+    <w:lsdException w:name="Grid Table 7 Colorful Accent 5" w:uiPriority="52"/>
+    <w:lsdException w:name="Grid Table 1 Light Accent 6" w:uiPriority="46"/>
+    <w:lsdException w:name="Grid Table 2 Accent 6" w:uiPriority="47"/>
+    <w:lsdException w:name="Grid Table 3 Accent 6" w:uiPriority="48"/>
+    <w:lsdException w:name="Grid Table 4 Accent 6" w:uiPriority="49"/>
+    <w:lsdException w:name="Grid Table 5 Dark Accent 6" w:uiPriority="50"/>
+    <w:lsdException w:name="Grid Table 6 Colorful Accent 6" w:uiPriority="51"/>
+    <w:lsdException w:name="Grid Table 7 Colorful Accent 6" w:uiPriority="52"/>
+    <w:lsdException w:name="List Table 1 Light" w:uiPriority="46"/>
+    <w:lsdException w:name="List Table 2" w:uiPriority="47"/>
+    <w:lsdException w:name="List Table 3" w:uiPriority="48"/>
+    <w:lsdException w:name="List Table 4" w:uiPriority="49"/>
+    <w:lsdException w:name="List Table 5 Dark" w:uiPriority="50"/>
+    <w:lsdException w:name="List Table 6 Colorful" w:uiPriority="51"/>
+    <w:lsdException w:name="List Table 7 Colorful" w:uiPriority="52"/>
+    <w:lsdException w:name="List Table 1 Light Accent 1" w:uiPriority="46"/>
+    <w:lsdException w:name="List Table 2 Accent 1" w:uiPriority="47"/>
+    <w:lsdException w:name="List Table 3 Accent 1" w:uiPriority="48"/>
+    <w:lsdException w:name="List Table 4 Accent 1" w:uiPriority="49"/>
+    <w:lsdException w:name="List Table 5 Dark Accent 1" w:uiPriority="50"/>
+    <w:lsdException w:name="List Table 6 Colorful Accent 1" w:uiPriority="51"/>
+    <w:lsdException w:name="List Table 7 Colorful Accent 1" w:uiPriority="52"/>
+    <w:lsdException w:name="List Table 1 Light Accent 2" w:uiPriority="46"/>
+    <w:lsdException w:name="List Table 2 Accent 2" w:uiPriority="47"/>
+    <w:lsdException w:name="List Table 3 Accent 2" w:uiPriority="48"/>
+    <w:lsdException w:name="List Table 4 Accent 2" w:uiPriority="49"/>
+    <w:lsdException w:name="List Table 5 Dark Accent 2" w:uiPriority="50"/>
+    <w:lsdException w:name="List Table 6 Colorful Accent 2" w:uiPriority="51"/>
+    <w:lsdException w:name="List Table 7 Colorful Accent 2" w:uiPriority="52"/>
+    <w:lsdException w:name="List Table 1 Light Accent 3" w:uiPriority="46"/>
+    <w:lsdException w:name="List Table 2 Accent 3" w:uiPriority="47"/>
+    <w:lsdException w:name="List Table 3 Accent 3" w:uiPriority="48"/>
+    <w:lsdException w:name="List Table 4 Accent 3" w:uiPriority="49"/>
+    <w:lsdException w:name="List Table 5 Dark Accent 3" w:uiPriority="50"/>
+    <w:lsdException w:name="List Table 6 Colorful Accent 3" w:uiPriority="51"/>
+    <w:lsdException w:name="List Table 7 Colorful Accent 3" w:uiPriority="52"/>
+    <w:lsdException w:name="List Table 1 Light Accent 4" w:uiPriority="46"/>
+    <w:lsdException w:name="List Table 2 Accent 4" w:uiPriority="47"/>
+    <w:lsdException w:name="List Table 3 Accent 4" w:uiPriority="48"/>
+    <w:lsdException w:name="List Table 4 Accent 4" w:uiPriority="49"/>
+    <w:lsdException w:name="List Table 5 Dark Accent 4" w:uiPriority="50"/>
+    <w:lsdException w:name="List Table 6 Colorful Accent 4" w:uiPriority="51"/>
+    <w:lsdException w:name="List Table 7 Colorful Accent 4" w:uiPriority="52"/>
+    <w:lsdException w:name="List Table 1 Light Accent 5" w:uiPriority="46"/>
+    <w:lsdException w:name="List Table 2 Accent 5" w:uiPriority="47"/>
+    <w:lsdException w:name="List Table 3 Accent 5" w:uiPriority="48"/>
+    <w:lsdException w:name="List Table 4 Accent 5" w:uiPriority="49"/>
+    <w:lsdException w:name="List Table 5 Dark Accent 5" w:uiPriority="50"/>
+    <w:lsdException w:name="List Table 6 Colorful Accent 5" w:uiPriority="51"/>
+    <w:lsdException w:name="List Table 7 Colorful Accent 5" w:uiPriority="52"/>
+    <w:lsdException w:name="List Table 1 Light Accent 6" w:uiPriority="46"/>
+    <w:lsdException w:name="List Table 2 Accent 6" w:uiPriority="47"/>
+    <w:lsdException w:name="List Table 3 Accent 6" w:uiPriority="48"/>
+    <w:lsdException w:name="List Table 4 Accent 6" w:uiPriority="49"/>
+    <w:lsdException w:name="List Table 5 Dark Accent 6" w:uiPriority="50"/>
+    <w:lsdException w:name="List Table 6 Colorful Accent 6" w:uiPriority="51"/>
+    <w:lsdException w:name="List Table 7 Colorful Accent 6" w:uiPriority="52"/>
+  </w:latentStyles>
+  <w:style w:type="paragraph" w:default="1" w:styleId="Normal">
+    <w:name w:val="Normal"/>
+    <w:qFormat/>
+  </w:style>
+  <w:style w:type="character" w:default="1" w:styleId="Fuentedeprrafopredeter">
+    <w:name w:val="Default Paragraph Font"/>
+    <w:uiPriority w:val="1"/>
+    <w:semiHidden/>
+    <w:unhideWhenUsed/>
+  </w:style>
+  <w:style w:type="table" w:default="1" w:styleId="Tablanormal">
+    <w:name w:val="Normal Table"/>
+    <w:uiPriority w:val="99"/>
+    <w:semiHidden/>
+    <w:unhideWhenUsed/>
+    <w:tblPr>
+      <w:tblInd w:w="0" w:type="dxa"/>
+      <w:tblCellMar>
+        <w:top w:w="0" w:type="dxa"/>
+        <w:left w:w="108" w:type="dxa"/>
+        <w:bottom w:w="0" w:type="dxa"/>
+        <w:right w:w="108" w:type="dxa"/>
+      </w:tblCellMar>
+    </w:tblPr>
+  </w:style>
+  <w:style w:type="numbering" w:default="1" w:styleId="Sinlista">
+    <w:name w:val="No List"/>
+    <w:uiPriority w:val="99"/>
+    <w:semiHidden/>
+    <w:unhideWhenUsed/>
+  </w:style>
+  <w:style w:type="paragraph" w:customStyle="1" w:styleId="7A24810F1B6F4474B2C16629641E8C9B">
+    <w:name w:val="7A24810F1B6F4474B2C16629641E8C9B"/>
+    <w:rsid w:val="000E7956"/>
+  </w:style>
+  <w:style w:type="paragraph" w:customStyle="1" w:styleId="F5BF3CC382234160ABA7DC88E5EE7728">
+    <w:name w:val="F5BF3CC382234160ABA7DC88E5EE7728"/>
+    <w:rsid w:val="000E7956"/>
+  </w:style>
+  <w:style w:type="paragraph" w:customStyle="1" w:styleId="5CFA8D14A5CC4897A395170D24843F3D">
+    <w:name w:val="5CFA8D14A5CC4897A395170D24843F3D"/>
+    <w:rsid w:val="000E7956"/>
+  </w:style>
+</w:styles>
+</file>
+
+<file path=word/glossary/webSettings.xml><?xml version="1.0" encoding="utf-8"?>
+<w:webSettings xmlns:mc="http://schemas.openxmlformats.org/markup-compatibility/2006" xmlns:r="http://schemas.openxmlformats.org/officeDocument/2006/relationships" xmlns:w="http://schemas.openxmlformats.org/wordprocessingml/2006/main" xmlns:w14="http://schemas.microsoft.com/office/word/2010/wordml" xmlns:w15="http://schemas.microsoft.com/office/word/2012/wordml" xmlns:w16se="http://schemas.microsoft.com/office/word/2015/wordml/symex" mc:Ignorable="w14 w15 w16se">
+  <w:optimizeForBrowser/>
+  <w:allowPNG/>
+</w:webSettings>
 </file>
 
 <file path=word/theme/theme1.xml><?xml version="1.0" encoding="utf-8"?>
@@ -2669,7 +4396,7 @@
 </file>
 
 <file path=customXml/itemProps2.xml><?xml version="1.0" encoding="utf-8"?>
-<ds:datastoreItem xmlns:ds="http://schemas.openxmlformats.org/officeDocument/2006/customXml" ds:itemID="{492F52FB-A0AE-4869-AE86-59CB841F43A5}">
+<ds:datastoreItem xmlns:ds="http://schemas.openxmlformats.org/officeDocument/2006/customXml" ds:itemID="{EFEAF900-7139-44C2-934C-D36D13C7FACD}">
   <ds:schemaRefs>
     <ds:schemaRef ds:uri="http://schemas.openxmlformats.org/officeDocument/2006/bibliography"/>
   </ds:schemaRefs>

</xml_diff>

<commit_message>
Archivos IntelliJ y manual de marcas
</commit_message>
<xml_diff>
--- a/Trabajos/Diseño de Interfaces Web/Act1_UD1_IvanMarinViadero.docx
+++ b/Trabajos/Diseño de Interfaces Web/Act1_UD1_IvanMarinViadero.docx
@@ -10,7 +10,6 @@
           <w:docPartUnique/>
         </w:docPartObj>
       </w:sdtPr>
-      <w:sdtEndPr/>
       <w:sdtContent>
         <w:p>
           <w:pPr>
@@ -117,7 +116,6 @@
                                     <w:dataBinding w:prefixMappings="xmlns:ns0='http://purl.org/dc/elements/1.1/' xmlns:ns1='http://schemas.openxmlformats.org/package/2006/metadata/core-properties' " w:xpath="/ns1:coreProperties[1]/ns0:title[1]" w:storeItemID="{6C3C8BC8-F283-45AE-878A-BAB7291924A1}"/>
                                     <w:text/>
                                   </w:sdtPr>
-                                  <w:sdtEndPr/>
                                   <w:sdtContent>
                                     <w:r>
                                       <w:rPr>
@@ -144,7 +142,6 @@
                                   <w:dataBinding w:prefixMappings="xmlns:ns0='http://purl.org/dc/elements/1.1/' xmlns:ns1='http://schemas.openxmlformats.org/package/2006/metadata/core-properties' " w:xpath="/ns1:coreProperties[1]/ns0:subject[1]" w:storeItemID="{6C3C8BC8-F283-45AE-878A-BAB7291924A1}"/>
                                   <w:text/>
                                 </w:sdtPr>
-                                <w:sdtEndPr/>
                                 <w:sdtContent>
                                   <w:p>
                                     <w:pPr>
@@ -183,7 +180,6 @@
                                   <w:dataBinding w:prefixMappings="xmlns:ns0='http://purl.org/dc/elements/1.1/' xmlns:ns1='http://schemas.openxmlformats.org/package/2006/metadata/core-properties' " w:xpath="/ns1:coreProperties[1]/ns0:creator[1]" w:storeItemID="{6C3C8BC8-F283-45AE-878A-BAB7291924A1}"/>
                                   <w:text/>
                                 </w:sdtPr>
-                                <w:sdtEndPr/>
                                 <w:sdtContent>
                                   <w:p>
                                     <w:pPr>
@@ -260,7 +256,6 @@
                               <w:dataBinding w:prefixMappings="xmlns:ns0='http://purl.org/dc/elements/1.1/' xmlns:ns1='http://schemas.openxmlformats.org/package/2006/metadata/core-properties' " w:xpath="/ns1:coreProperties[1]/ns0:title[1]" w:storeItemID="{6C3C8BC8-F283-45AE-878A-BAB7291924A1}"/>
                               <w:text/>
                             </w:sdtPr>
-                            <w:sdtEndPr/>
                             <w:sdtContent>
                               <w:r>
                                 <w:rPr>
@@ -287,7 +282,6 @@
                             <w:dataBinding w:prefixMappings="xmlns:ns0='http://purl.org/dc/elements/1.1/' xmlns:ns1='http://schemas.openxmlformats.org/package/2006/metadata/core-properties' " w:xpath="/ns1:coreProperties[1]/ns0:subject[1]" w:storeItemID="{6C3C8BC8-F283-45AE-878A-BAB7291924A1}"/>
                             <w:text/>
                           </w:sdtPr>
-                          <w:sdtEndPr/>
                           <w:sdtContent>
                             <w:p>
                               <w:pPr>
@@ -326,7 +320,6 @@
                             <w:dataBinding w:prefixMappings="xmlns:ns0='http://purl.org/dc/elements/1.1/' xmlns:ns1='http://schemas.openxmlformats.org/package/2006/metadata/core-properties' " w:xpath="/ns1:coreProperties[1]/ns0:creator[1]" w:storeItemID="{6C3C8BC8-F283-45AE-878A-BAB7291924A1}"/>
                             <w:text/>
                           </w:sdtPr>
-                          <w:sdtEndPr/>
                           <w:sdtContent>
                             <w:p>
                               <w:pPr>
@@ -445,7 +438,6 @@
                                     <w:calendar w:val="gregorian"/>
                                   </w:date>
                                 </w:sdtPr>
-                                <w:sdtEndPr/>
                                 <w:sdtContent>
                                   <w:p>
                                     <w:pPr>
@@ -513,7 +505,6 @@
                               <w:calendar w:val="gregorian"/>
                             </w:date>
                           </w:sdtPr>
-                          <w:sdtEndPr/>
                           <w:sdtContent>
                             <w:p>
                               <w:pPr>
@@ -609,7 +600,7 @@
           <w:r>
             <w:fldChar w:fldCharType="separate"/>
           </w:r>
-          <w:hyperlink w:anchor="_Toc241259319" w:history="1">
+          <w:hyperlink w:anchor="_Toc241770112" w:history="1">
             <w:r>
               <w:rPr>
                 <w:rStyle w:val="Hipervnculo"/>
@@ -636,7 +627,7 @@
                 <w:noProof/>
                 <w:webHidden/>
               </w:rPr>
-              <w:instrText xml:space="preserve"> PAGEREF _Toc241259319 \h </w:instrText>
+              <w:instrText xml:space="preserve"> PAGEREF _Toc241770112 \h </w:instrText>
             </w:r>
             <w:r>
               <w:rPr>
@@ -679,7 +670,7 @@
               <w:lang w:eastAsia="es-ES"/>
             </w:rPr>
           </w:pPr>
-          <w:hyperlink w:anchor="_Toc241259320" w:history="1">
+          <w:hyperlink w:anchor="_Toc241770113" w:history="1">
             <w:r>
               <w:rPr>
                 <w:rStyle w:val="Hipervnculo"/>
@@ -706,7 +697,7 @@
                 <w:noProof/>
                 <w:webHidden/>
               </w:rPr>
-              <w:instrText xml:space="preserve"> PAGEREF _Toc241259320 \h </w:instrText>
+              <w:instrText xml:space="preserve"> PAGEREF _Toc241770113 \h </w:instrText>
             </w:r>
             <w:r>
               <w:rPr>
@@ -749,7 +740,7 @@
               <w:lang w:eastAsia="es-ES"/>
             </w:rPr>
           </w:pPr>
-          <w:hyperlink w:anchor="_Toc241259321" w:history="1">
+          <w:hyperlink w:anchor="_Toc241770114" w:history="1">
             <w:r>
               <w:rPr>
                 <w:rStyle w:val="Hipervnculo"/>
@@ -776,7 +767,7 @@
                 <w:noProof/>
                 <w:webHidden/>
               </w:rPr>
-              <w:instrText xml:space="preserve"> PAGEREF _Toc241259321 \h </w:instrText>
+              <w:instrText xml:space="preserve"> PAGEREF _Toc241770114 \h </w:instrText>
             </w:r>
             <w:r>
               <w:rPr>
@@ -819,7 +810,7 @@
               <w:lang w:eastAsia="es-ES"/>
             </w:rPr>
           </w:pPr>
-          <w:hyperlink w:anchor="_Toc241259322" w:history="1">
+          <w:hyperlink w:anchor="_Toc241770115" w:history="1">
             <w:r>
               <w:rPr>
                 <w:rStyle w:val="Hipervnculo"/>
@@ -846,7 +837,7 @@
                 <w:noProof/>
                 <w:webHidden/>
               </w:rPr>
-              <w:instrText xml:space="preserve"> PAGEREF _Toc241259322 \h </w:instrText>
+              <w:instrText xml:space="preserve"> PAGEREF _Toc241770115 \h </w:instrText>
             </w:r>
             <w:r>
               <w:rPr>
@@ -889,7 +880,7 @@
               <w:lang w:eastAsia="es-ES"/>
             </w:rPr>
           </w:pPr>
-          <w:hyperlink w:anchor="_Toc241259323" w:history="1">
+          <w:hyperlink w:anchor="_Toc241770116" w:history="1">
             <w:r>
               <w:rPr>
                 <w:rStyle w:val="Hipervnculo"/>
@@ -916,7 +907,7 @@
                 <w:noProof/>
                 <w:webHidden/>
               </w:rPr>
-              <w:instrText xml:space="preserve"> PAGEREF _Toc241259323 \h </w:instrText>
+              <w:instrText xml:space="preserve"> PAGEREF _Toc241770116 \h </w:instrText>
             </w:r>
             <w:r>
               <w:rPr>
@@ -959,7 +950,7 @@
               <w:lang w:eastAsia="es-ES"/>
             </w:rPr>
           </w:pPr>
-          <w:hyperlink w:anchor="_Toc241259324" w:history="1">
+          <w:hyperlink w:anchor="_Toc241770117" w:history="1">
             <w:r>
               <w:rPr>
                 <w:rStyle w:val="Hipervnculo"/>
@@ -986,7 +977,7 @@
                 <w:noProof/>
                 <w:webHidden/>
               </w:rPr>
-              <w:instrText xml:space="preserve"> PAGEREF _Toc241259324 \h </w:instrText>
+              <w:instrText xml:space="preserve"> PAGEREF _Toc241770117 \h </w:instrText>
             </w:r>
             <w:r>
               <w:rPr>
@@ -1007,6 +998,76 @@
                 <w:webHidden/>
               </w:rPr>
               <w:t>4</w:t>
+            </w:r>
+            <w:r>
+              <w:rPr>
+                <w:noProof/>
+                <w:webHidden/>
+              </w:rPr>
+              <w:fldChar w:fldCharType="end"/>
+            </w:r>
+          </w:hyperlink>
+        </w:p>
+        <w:p>
+          <w:pPr>
+            <w:pStyle w:val="TDC1"/>
+            <w:tabs>
+              <w:tab w:val="right" w:leader="dot" w:pos="8494"/>
+            </w:tabs>
+            <w:rPr>
+              <w:rFonts w:eastAsiaTheme="minorEastAsia"/>
+              <w:noProof/>
+              <w:lang w:eastAsia="es-ES"/>
+            </w:rPr>
+          </w:pPr>
+          <w:hyperlink w:anchor="_Toc241770118" w:history="1">
+            <w:r>
+              <w:rPr>
+                <w:rStyle w:val="Hipervnculo"/>
+                <w:noProof/>
+              </w:rPr>
+              <w:t>Tipografías</w:t>
+            </w:r>
+            <w:r>
+              <w:rPr>
+                <w:noProof/>
+                <w:webHidden/>
+              </w:rPr>
+              <w:tab/>
+            </w:r>
+            <w:r>
+              <w:rPr>
+                <w:noProof/>
+                <w:webHidden/>
+              </w:rPr>
+              <w:fldChar w:fldCharType="begin"/>
+            </w:r>
+            <w:r>
+              <w:rPr>
+                <w:noProof/>
+                <w:webHidden/>
+              </w:rPr>
+              <w:instrText xml:space="preserve"> PAGEREF _Toc241770118 \h </w:instrText>
+            </w:r>
+            <w:r>
+              <w:rPr>
+                <w:noProof/>
+                <w:webHidden/>
+              </w:rPr>
+            </w:r>
+            <w:r>
+              <w:rPr>
+                <w:noProof/>
+                <w:webHidden/>
+              </w:rPr>
+              <w:fldChar w:fldCharType="separate"/>
+            </w:r>
+            <w:r>
+              <w:rPr>
+                <w:noProof/>
+                <w:webHidden/>
+              </w:rPr>
+              <w:t>5</w:t>
             </w:r>
             <w:r>
               <w:rPr>
@@ -1029,12 +1090,152 @@
               <w:lang w:eastAsia="es-ES"/>
             </w:rPr>
           </w:pPr>
-          <w:hyperlink w:anchor="_Toc241259325" w:history="1">
+          <w:hyperlink w:anchor="_Toc241770119" w:history="1">
             <w:r>
               <w:rPr>
                 <w:rStyle w:val="Hipervnculo"/>
                 <w:noProof/>
               </w:rPr>
+              <w:t>Principales</w:t>
+            </w:r>
+            <w:r>
+              <w:rPr>
+                <w:noProof/>
+                <w:webHidden/>
+              </w:rPr>
+              <w:tab/>
+            </w:r>
+            <w:r>
+              <w:rPr>
+                <w:noProof/>
+                <w:webHidden/>
+              </w:rPr>
+              <w:fldChar w:fldCharType="begin"/>
+            </w:r>
+            <w:r>
+              <w:rPr>
+                <w:noProof/>
+                <w:webHidden/>
+              </w:rPr>
+              <w:instrText xml:space="preserve"> PAGEREF _Toc241770119 \h </w:instrText>
+            </w:r>
+            <w:r>
+              <w:rPr>
+                <w:noProof/>
+                <w:webHidden/>
+              </w:rPr>
+            </w:r>
+            <w:r>
+              <w:rPr>
+                <w:noProof/>
+                <w:webHidden/>
+              </w:rPr>
+              <w:fldChar w:fldCharType="separate"/>
+            </w:r>
+            <w:r>
+              <w:rPr>
+                <w:noProof/>
+                <w:webHidden/>
+              </w:rPr>
+              <w:t>5</w:t>
+            </w:r>
+            <w:r>
+              <w:rPr>
+                <w:noProof/>
+                <w:webHidden/>
+              </w:rPr>
+              <w:fldChar w:fldCharType="end"/>
+            </w:r>
+          </w:hyperlink>
+        </w:p>
+        <w:p>
+          <w:pPr>
+            <w:pStyle w:val="TDC2"/>
+            <w:tabs>
+              <w:tab w:val="right" w:leader="dot" w:pos="8494"/>
+            </w:tabs>
+            <w:rPr>
+              <w:rFonts w:eastAsiaTheme="minorEastAsia"/>
+              <w:noProof/>
+              <w:lang w:eastAsia="es-ES"/>
+            </w:rPr>
+          </w:pPr>
+          <w:hyperlink w:anchor="_Toc241770120" w:history="1">
+            <w:r>
+              <w:rPr>
+                <w:rStyle w:val="Hipervnculo"/>
+                <w:noProof/>
+              </w:rPr>
+              <w:t>Secundarias</w:t>
+            </w:r>
+            <w:r>
+              <w:rPr>
+                <w:noProof/>
+                <w:webHidden/>
+              </w:rPr>
+              <w:tab/>
+            </w:r>
+            <w:r>
+              <w:rPr>
+                <w:noProof/>
+                <w:webHidden/>
+              </w:rPr>
+              <w:fldChar w:fldCharType="begin"/>
+            </w:r>
+            <w:r>
+              <w:rPr>
+                <w:noProof/>
+                <w:webHidden/>
+              </w:rPr>
+              <w:instrText xml:space="preserve"> PAGEREF _Toc241770120 \h </w:instrText>
+            </w:r>
+            <w:r>
+              <w:rPr>
+                <w:noProof/>
+                <w:webHidden/>
+              </w:rPr>
+            </w:r>
+            <w:r>
+              <w:rPr>
+                <w:noProof/>
+                <w:webHidden/>
+              </w:rPr>
+              <w:fldChar w:fldCharType="separate"/>
+            </w:r>
+            <w:r>
+              <w:rPr>
+                <w:noProof/>
+                <w:webHidden/>
+              </w:rPr>
+              <w:t>5</w:t>
+            </w:r>
+            <w:r>
+              <w:rPr>
+                <w:noProof/>
+                <w:webHidden/>
+              </w:rPr>
+              <w:fldChar w:fldCharType="end"/>
+            </w:r>
+          </w:hyperlink>
+        </w:p>
+        <w:p>
+          <w:pPr>
+            <w:pStyle w:val="TDC2"/>
+            <w:tabs>
+              <w:tab w:val="right" w:leader="dot" w:pos="8494"/>
+            </w:tabs>
+            <w:rPr>
+              <w:rFonts w:eastAsiaTheme="minorEastAsia"/>
+              <w:noProof/>
+              <w:lang w:eastAsia="es-ES"/>
+            </w:rPr>
+          </w:pPr>
+          <w:hyperlink w:anchor="_Toc241770121" w:history="1">
+            <w:r>
+              <w:rPr>
+                <w:rStyle w:val="Hipervnculo"/>
+                <w:noProof/>
+              </w:rPr>
               <w:t>Teoría de color</w:t>
             </w:r>
             <w:r>
@@ -1056,7 +1257,7 @@
                 <w:noProof/>
                 <w:webHidden/>
               </w:rPr>
-              <w:instrText xml:space="preserve"> PAGEREF _Toc241259325 \h </w:instrText>
+              <w:instrText xml:space="preserve"> PAGEREF _Toc241770121 \h </w:instrText>
             </w:r>
             <w:r>
               <w:rPr>
@@ -1099,7 +1300,7 @@
               <w:lang w:eastAsia="es-ES"/>
             </w:rPr>
           </w:pPr>
-          <w:hyperlink w:anchor="_Toc241259326" w:history="1">
+          <w:hyperlink w:anchor="_Toc241770122" w:history="1">
             <w:r>
               <w:rPr>
                 <w:rStyle w:val="Hipervnculo"/>
@@ -1126,7 +1327,7 @@
                 <w:noProof/>
                 <w:webHidden/>
               </w:rPr>
-              <w:instrText xml:space="preserve"> PAGEREF _Toc241259326 \h </w:instrText>
+              <w:instrText xml:space="preserve"> PAGEREF _Toc241770122 \h </w:instrText>
             </w:r>
             <w:r>
               <w:rPr>
@@ -1169,7 +1370,7 @@
               <w:lang w:eastAsia="es-ES"/>
             </w:rPr>
           </w:pPr>
-          <w:hyperlink w:anchor="_Toc241259327" w:history="1">
+          <w:hyperlink w:anchor="_Toc241770123" w:history="1">
             <w:r>
               <w:rPr>
                 <w:rStyle w:val="Hipervnculo"/>
@@ -1196,7 +1397,7 @@
                 <w:noProof/>
                 <w:webHidden/>
               </w:rPr>
-              <w:instrText xml:space="preserve"> PAGEREF _Toc241259327 \h </w:instrText>
+              <w:instrText xml:space="preserve"> PAGEREF _Toc241770123 \h </w:instrText>
             </w:r>
             <w:r>
               <w:rPr>
@@ -1239,13 +1440,13 @@
               <w:lang w:eastAsia="es-ES"/>
             </w:rPr>
           </w:pPr>
-          <w:hyperlink w:anchor="_Toc241259328" w:history="1">
+          <w:hyperlink w:anchor="_Toc241770124" w:history="1">
             <w:r>
               <w:rPr>
                 <w:rStyle w:val="Hipervnculo"/>
                 <w:noProof/>
               </w:rPr>
-              <w:t>Tipografías</w:t>
+              <w:t>Colores institucionales</w:t>
             </w:r>
             <w:r>
               <w:rPr>
@@ -1266,7 +1467,7 @@
                 <w:noProof/>
                 <w:webHidden/>
               </w:rPr>
-              <w:instrText xml:space="preserve"> PAGEREF _Toc241259328 \h </w:instrText>
+              <w:instrText xml:space="preserve"> PAGEREF _Toc241770124 \h </w:instrText>
             </w:r>
             <w:r>
               <w:rPr>
@@ -1287,6 +1488,216 @@
                 <w:webHidden/>
               </w:rPr>
               <w:t>6</w:t>
+            </w:r>
+            <w:r>
+              <w:rPr>
+                <w:noProof/>
+                <w:webHidden/>
+              </w:rPr>
+              <w:fldChar w:fldCharType="end"/>
+            </w:r>
+          </w:hyperlink>
+        </w:p>
+        <w:p>
+          <w:pPr>
+            <w:pStyle w:val="TDC1"/>
+            <w:tabs>
+              <w:tab w:val="right" w:leader="dot" w:pos="8494"/>
+            </w:tabs>
+            <w:rPr>
+              <w:rFonts w:eastAsiaTheme="minorEastAsia"/>
+              <w:noProof/>
+              <w:lang w:eastAsia="es-ES"/>
+            </w:rPr>
+          </w:pPr>
+          <w:hyperlink w:anchor="_Toc241770125" w:history="1">
+            <w:r>
+              <w:rPr>
+                <w:rStyle w:val="Hipervnculo"/>
+                <w:noProof/>
+              </w:rPr>
+              <w:t>Colores secundarios</w:t>
+            </w:r>
+            <w:r>
+              <w:rPr>
+                <w:noProof/>
+                <w:webHidden/>
+              </w:rPr>
+              <w:tab/>
+            </w:r>
+            <w:r>
+              <w:rPr>
+                <w:noProof/>
+                <w:webHidden/>
+              </w:rPr>
+              <w:fldChar w:fldCharType="begin"/>
+            </w:r>
+            <w:r>
+              <w:rPr>
+                <w:noProof/>
+                <w:webHidden/>
+              </w:rPr>
+              <w:instrText xml:space="preserve"> PAGEREF _Toc241770125 \h </w:instrText>
+            </w:r>
+            <w:r>
+              <w:rPr>
+                <w:noProof/>
+                <w:webHidden/>
+              </w:rPr>
+            </w:r>
+            <w:r>
+              <w:rPr>
+                <w:noProof/>
+                <w:webHidden/>
+              </w:rPr>
+              <w:fldChar w:fldCharType="separate"/>
+            </w:r>
+            <w:r>
+              <w:rPr>
+                <w:noProof/>
+                <w:webHidden/>
+              </w:rPr>
+              <w:t>6</w:t>
+            </w:r>
+            <w:r>
+              <w:rPr>
+                <w:noProof/>
+                <w:webHidden/>
+              </w:rPr>
+              <w:fldChar w:fldCharType="end"/>
+            </w:r>
+          </w:hyperlink>
+        </w:p>
+        <w:p>
+          <w:pPr>
+            <w:pStyle w:val="TDC1"/>
+            <w:tabs>
+              <w:tab w:val="right" w:leader="dot" w:pos="8494"/>
+            </w:tabs>
+            <w:rPr>
+              <w:rFonts w:eastAsiaTheme="minorEastAsia"/>
+              <w:noProof/>
+              <w:lang w:eastAsia="es-ES"/>
+            </w:rPr>
+          </w:pPr>
+          <w:hyperlink w:anchor="_Toc241770126" w:history="1">
+            <w:r>
+              <w:rPr>
+                <w:rStyle w:val="Hipervnculo"/>
+                <w:noProof/>
+              </w:rPr>
+              <w:t>Colores complementarios</w:t>
+            </w:r>
+            <w:r>
+              <w:rPr>
+                <w:noProof/>
+                <w:webHidden/>
+              </w:rPr>
+              <w:tab/>
+            </w:r>
+            <w:r>
+              <w:rPr>
+                <w:noProof/>
+                <w:webHidden/>
+              </w:rPr>
+              <w:fldChar w:fldCharType="begin"/>
+            </w:r>
+            <w:r>
+              <w:rPr>
+                <w:noProof/>
+                <w:webHidden/>
+              </w:rPr>
+              <w:instrText xml:space="preserve"> PAGEREF _Toc241770126 \h </w:instrText>
+            </w:r>
+            <w:r>
+              <w:rPr>
+                <w:noProof/>
+                <w:webHidden/>
+              </w:rPr>
+            </w:r>
+            <w:r>
+              <w:rPr>
+                <w:noProof/>
+                <w:webHidden/>
+              </w:rPr>
+              <w:fldChar w:fldCharType="separate"/>
+            </w:r>
+            <w:r>
+              <w:rPr>
+                <w:noProof/>
+                <w:webHidden/>
+              </w:rPr>
+              <w:t>7</w:t>
+            </w:r>
+            <w:r>
+              <w:rPr>
+                <w:noProof/>
+                <w:webHidden/>
+              </w:rPr>
+              <w:fldChar w:fldCharType="end"/>
+            </w:r>
+          </w:hyperlink>
+        </w:p>
+        <w:p>
+          <w:pPr>
+            <w:pStyle w:val="TDC1"/>
+            <w:tabs>
+              <w:tab w:val="right" w:leader="dot" w:pos="8494"/>
+            </w:tabs>
+            <w:rPr>
+              <w:rFonts w:eastAsiaTheme="minorEastAsia"/>
+              <w:noProof/>
+              <w:lang w:eastAsia="es-ES"/>
+            </w:rPr>
+          </w:pPr>
+          <w:hyperlink w:anchor="_Toc241770127" w:history="1">
+            <w:r>
+              <w:rPr>
+                <w:rStyle w:val="Hipervnculo"/>
+                <w:noProof/>
+              </w:rPr>
+              <w:t>Positivos y negativos</w:t>
+            </w:r>
+            <w:r>
+              <w:rPr>
+                <w:noProof/>
+                <w:webHidden/>
+              </w:rPr>
+              <w:tab/>
+            </w:r>
+            <w:r>
+              <w:rPr>
+                <w:noProof/>
+                <w:webHidden/>
+              </w:rPr>
+              <w:fldChar w:fldCharType="begin"/>
+            </w:r>
+            <w:r>
+              <w:rPr>
+                <w:noProof/>
+                <w:webHidden/>
+              </w:rPr>
+              <w:instrText xml:space="preserve"> PAGEREF _Toc241770127 \h </w:instrText>
+            </w:r>
+            <w:r>
+              <w:rPr>
+                <w:noProof/>
+                <w:webHidden/>
+              </w:rPr>
+            </w:r>
+            <w:r>
+              <w:rPr>
+                <w:noProof/>
+                <w:webHidden/>
+              </w:rPr>
+              <w:fldChar w:fldCharType="separate"/>
+            </w:r>
+            <w:r>
+              <w:rPr>
+                <w:noProof/>
+                <w:webHidden/>
+              </w:rPr>
+              <w:t>8</w:t>
             </w:r>
             <w:r>
               <w:rPr>
@@ -1309,13 +1720,13 @@
               <w:lang w:eastAsia="es-ES"/>
             </w:rPr>
           </w:pPr>
-          <w:hyperlink w:anchor="_Toc241259329" w:history="1">
+          <w:hyperlink w:anchor="_Toc241770128" w:history="1">
             <w:r>
               <w:rPr>
                 <w:rStyle w:val="Hipervnculo"/>
                 <w:noProof/>
               </w:rPr>
-              <w:t>Principales</w:t>
+              <w:t>B/N</w:t>
             </w:r>
             <w:r>
               <w:rPr>
@@ -1336,7 +1747,7 @@
                 <w:noProof/>
                 <w:webHidden/>
               </w:rPr>
-              <w:instrText xml:space="preserve"> PAGEREF _Toc241259329 \h </w:instrText>
+              <w:instrText xml:space="preserve"> PAGEREF _Toc241770128 \h </w:instrText>
             </w:r>
             <w:r>
               <w:rPr>
@@ -1356,7 +1767,7 @@
                 <w:noProof/>
                 <w:webHidden/>
               </w:rPr>
-              <w:t>6</w:t>
+              <w:t>8</w:t>
             </w:r>
             <w:r>
               <w:rPr>
@@ -1379,13 +1790,13 @@
               <w:lang w:eastAsia="es-ES"/>
             </w:rPr>
           </w:pPr>
-          <w:hyperlink w:anchor="_Toc241259330" w:history="1">
+          <w:hyperlink w:anchor="_Toc241770129" w:history="1">
             <w:r>
               <w:rPr>
                 <w:rStyle w:val="Hipervnculo"/>
                 <w:noProof/>
               </w:rPr>
-              <w:t>Secundarias</w:t>
+              <w:t>Color positivo/Color negativo</w:t>
             </w:r>
             <w:r>
               <w:rPr>
@@ -1406,7 +1817,7 @@
                 <w:noProof/>
                 <w:webHidden/>
               </w:rPr>
-              <w:instrText xml:space="preserve"> PAGEREF _Toc241259330 \h </w:instrText>
+              <w:instrText xml:space="preserve"> PAGEREF _Toc241770129 \h </w:instrText>
             </w:r>
             <w:r>
               <w:rPr>
@@ -1426,7 +1837,77 @@
                 <w:noProof/>
                 <w:webHidden/>
               </w:rPr>
-              <w:t>6</w:t>
+              <w:t>8</w:t>
+            </w:r>
+            <w:r>
+              <w:rPr>
+                <w:noProof/>
+                <w:webHidden/>
+              </w:rPr>
+              <w:fldChar w:fldCharType="end"/>
+            </w:r>
+          </w:hyperlink>
+        </w:p>
+        <w:p>
+          <w:pPr>
+            <w:pStyle w:val="TDC2"/>
+            <w:tabs>
+              <w:tab w:val="right" w:leader="dot" w:pos="8494"/>
+            </w:tabs>
+            <w:rPr>
+              <w:rFonts w:eastAsiaTheme="minorEastAsia"/>
+              <w:noProof/>
+              <w:lang w:eastAsia="es-ES"/>
+            </w:rPr>
+          </w:pPr>
+          <w:hyperlink w:anchor="_Toc241770130" w:history="1">
+            <w:r>
+              <w:rPr>
+                <w:rStyle w:val="Hipervnculo"/>
+                <w:noProof/>
+              </w:rPr>
+              <w:t>Otra tonalidad</w:t>
+            </w:r>
+            <w:r>
+              <w:rPr>
+                <w:noProof/>
+                <w:webHidden/>
+              </w:rPr>
+              <w:tab/>
+            </w:r>
+            <w:r>
+              <w:rPr>
+                <w:noProof/>
+                <w:webHidden/>
+              </w:rPr>
+              <w:fldChar w:fldCharType="begin"/>
+            </w:r>
+            <w:r>
+              <w:rPr>
+                <w:noProof/>
+                <w:webHidden/>
+              </w:rPr>
+              <w:instrText xml:space="preserve"> PAGEREF _Toc241770130 \h </w:instrText>
+            </w:r>
+            <w:r>
+              <w:rPr>
+                <w:noProof/>
+                <w:webHidden/>
+              </w:rPr>
+            </w:r>
+            <w:r>
+              <w:rPr>
+                <w:noProof/>
+                <w:webHidden/>
+              </w:rPr>
+              <w:fldChar w:fldCharType="separate"/>
+            </w:r>
+            <w:r>
+              <w:rPr>
+                <w:noProof/>
+                <w:webHidden/>
+              </w:rPr>
+              <w:t>8</w:t>
             </w:r>
             <w:r>
               <w:rPr>
@@ -1449,13 +1930,13 @@
               <w:lang w:eastAsia="es-ES"/>
             </w:rPr>
           </w:pPr>
-          <w:hyperlink w:anchor="_Toc241259331" w:history="1">
+          <w:hyperlink w:anchor="_Toc241770131" w:history="1">
             <w:r>
               <w:rPr>
                 <w:rStyle w:val="Hipervnculo"/>
                 <w:noProof/>
               </w:rPr>
-              <w:t>Colores institucionales</w:t>
+              <w:t>Bibliografía</w:t>
             </w:r>
             <w:r>
               <w:rPr>
@@ -1476,7 +1957,7 @@
                 <w:noProof/>
                 <w:webHidden/>
               </w:rPr>
-              <w:instrText xml:space="preserve"> PAGEREF _Toc241259331 \h </w:instrText>
+              <w:instrText xml:space="preserve"> PAGEREF _Toc241770131 \h </w:instrText>
             </w:r>
             <w:r>
               <w:rPr>
@@ -1496,497 +1977,7 @@
                 <w:noProof/>
                 <w:webHidden/>
               </w:rPr>
-              <w:t>6</w:t>
-            </w:r>
-            <w:r>
-              <w:rPr>
-                <w:noProof/>
-                <w:webHidden/>
-              </w:rPr>
-              <w:fldChar w:fldCharType="end"/>
-            </w:r>
-          </w:hyperlink>
-        </w:p>
-        <w:p>
-          <w:pPr>
-            <w:pStyle w:val="TDC1"/>
-            <w:tabs>
-              <w:tab w:val="right" w:leader="dot" w:pos="8494"/>
-            </w:tabs>
-            <w:rPr>
-              <w:rFonts w:eastAsiaTheme="minorEastAsia"/>
-              <w:noProof/>
-              <w:lang w:eastAsia="es-ES"/>
-            </w:rPr>
-          </w:pPr>
-          <w:hyperlink w:anchor="_Toc241259332" w:history="1">
-            <w:r>
-              <w:rPr>
-                <w:rStyle w:val="Hipervnculo"/>
-                <w:noProof/>
-              </w:rPr>
-              <w:t>Colores secundarios</w:t>
-            </w:r>
-            <w:r>
-              <w:rPr>
-                <w:noProof/>
-                <w:webHidden/>
-              </w:rPr>
-              <w:tab/>
-            </w:r>
-            <w:r>
-              <w:rPr>
-                <w:noProof/>
-                <w:webHidden/>
-              </w:rPr>
-              <w:fldChar w:fldCharType="begin"/>
-            </w:r>
-            <w:r>
-              <w:rPr>
-                <w:noProof/>
-                <w:webHidden/>
-              </w:rPr>
-              <w:instrText xml:space="preserve"> PAGEREF _Toc241259332 \h </w:instrText>
-            </w:r>
-            <w:r>
-              <w:rPr>
-                <w:noProof/>
-                <w:webHidden/>
-              </w:rPr>
-            </w:r>
-            <w:r>
-              <w:rPr>
-                <w:noProof/>
-                <w:webHidden/>
-              </w:rPr>
-              <w:fldChar w:fldCharType="separate"/>
-            </w:r>
-            <w:r>
-              <w:rPr>
-                <w:noProof/>
-                <w:webHidden/>
-              </w:rPr>
-              <w:t>6</w:t>
-            </w:r>
-            <w:r>
-              <w:rPr>
-                <w:noProof/>
-                <w:webHidden/>
-              </w:rPr>
-              <w:fldChar w:fldCharType="end"/>
-            </w:r>
-          </w:hyperlink>
-        </w:p>
-        <w:p>
-          <w:pPr>
-            <w:pStyle w:val="TDC1"/>
-            <w:tabs>
-              <w:tab w:val="right" w:leader="dot" w:pos="8494"/>
-            </w:tabs>
-            <w:rPr>
-              <w:rFonts w:eastAsiaTheme="minorEastAsia"/>
-              <w:noProof/>
-              <w:lang w:eastAsia="es-ES"/>
-            </w:rPr>
-          </w:pPr>
-          <w:hyperlink w:anchor="_Toc241259333" w:history="1">
-            <w:r>
-              <w:rPr>
-                <w:rStyle w:val="Hipervnculo"/>
-                <w:noProof/>
-              </w:rPr>
-              <w:t>Colores complementarios</w:t>
-            </w:r>
-            <w:r>
-              <w:rPr>
-                <w:noProof/>
-                <w:webHidden/>
-              </w:rPr>
-              <w:tab/>
-            </w:r>
-            <w:r>
-              <w:rPr>
-                <w:noProof/>
-                <w:webHidden/>
-              </w:rPr>
-              <w:fldChar w:fldCharType="begin"/>
-            </w:r>
-            <w:r>
-              <w:rPr>
-                <w:noProof/>
-                <w:webHidden/>
-              </w:rPr>
-              <w:instrText xml:space="preserve"> PAGEREF _Toc241259333 \h </w:instrText>
-            </w:r>
-            <w:r>
-              <w:rPr>
-                <w:noProof/>
-                <w:webHidden/>
-              </w:rPr>
-            </w:r>
-            <w:r>
-              <w:rPr>
-                <w:noProof/>
-                <w:webHidden/>
-              </w:rPr>
-              <w:fldChar w:fldCharType="separate"/>
-            </w:r>
-            <w:r>
-              <w:rPr>
-                <w:noProof/>
-                <w:webHidden/>
-              </w:rPr>
-              <w:t>6</w:t>
-            </w:r>
-            <w:r>
-              <w:rPr>
-                <w:noProof/>
-                <w:webHidden/>
-              </w:rPr>
-              <w:fldChar w:fldCharType="end"/>
-            </w:r>
-          </w:hyperlink>
-        </w:p>
-        <w:p>
-          <w:pPr>
-            <w:pStyle w:val="TDC1"/>
-            <w:tabs>
-              <w:tab w:val="right" w:leader="dot" w:pos="8494"/>
-            </w:tabs>
-            <w:rPr>
-              <w:rFonts w:eastAsiaTheme="minorEastAsia"/>
-              <w:noProof/>
-              <w:lang w:eastAsia="es-ES"/>
-            </w:rPr>
-          </w:pPr>
-          <w:hyperlink w:anchor="_Toc241259334" w:history="1">
-            <w:r>
-              <w:rPr>
-                <w:rStyle w:val="Hipervnculo"/>
-                <w:noProof/>
-              </w:rPr>
-              <w:t>Positivos y negativos</w:t>
-            </w:r>
-            <w:r>
-              <w:rPr>
-                <w:noProof/>
-                <w:webHidden/>
-              </w:rPr>
-              <w:tab/>
-            </w:r>
-            <w:r>
-              <w:rPr>
-                <w:noProof/>
-                <w:webHidden/>
-              </w:rPr>
-              <w:fldChar w:fldCharType="begin"/>
-            </w:r>
-            <w:r>
-              <w:rPr>
-                <w:noProof/>
-                <w:webHidden/>
-              </w:rPr>
-              <w:instrText xml:space="preserve"> PAGEREF _Toc241259334 \h </w:instrText>
-            </w:r>
-            <w:r>
-              <w:rPr>
-                <w:noProof/>
-                <w:webHidden/>
-              </w:rPr>
-            </w:r>
-            <w:r>
-              <w:rPr>
-                <w:noProof/>
-                <w:webHidden/>
-              </w:rPr>
-              <w:fldChar w:fldCharType="separate"/>
-            </w:r>
-            <w:r>
-              <w:rPr>
-                <w:noProof/>
-                <w:webHidden/>
-              </w:rPr>
-              <w:t>7</w:t>
-            </w:r>
-            <w:r>
-              <w:rPr>
-                <w:noProof/>
-                <w:webHidden/>
-              </w:rPr>
-              <w:fldChar w:fldCharType="end"/>
-            </w:r>
-          </w:hyperlink>
-        </w:p>
-        <w:p>
-          <w:pPr>
-            <w:pStyle w:val="TDC2"/>
-            <w:tabs>
-              <w:tab w:val="right" w:leader="dot" w:pos="8494"/>
-            </w:tabs>
-            <w:rPr>
-              <w:rFonts w:eastAsiaTheme="minorEastAsia"/>
-              <w:noProof/>
-              <w:lang w:eastAsia="es-ES"/>
-            </w:rPr>
-          </w:pPr>
-          <w:hyperlink w:anchor="_Toc241259335" w:history="1">
-            <w:r>
-              <w:rPr>
-                <w:rStyle w:val="Hipervnculo"/>
-                <w:noProof/>
-              </w:rPr>
-              <w:t>B/N</w:t>
-            </w:r>
-            <w:r>
-              <w:rPr>
-                <w:noProof/>
-                <w:webHidden/>
-              </w:rPr>
-              <w:tab/>
-            </w:r>
-            <w:r>
-              <w:rPr>
-                <w:noProof/>
-                <w:webHidden/>
-              </w:rPr>
-              <w:fldChar w:fldCharType="begin"/>
-            </w:r>
-            <w:r>
-              <w:rPr>
-                <w:noProof/>
-                <w:webHidden/>
-              </w:rPr>
-              <w:instrText xml:space="preserve"> PAGEREF _Toc241259335 \h </w:instrText>
-            </w:r>
-            <w:r>
-              <w:rPr>
-                <w:noProof/>
-                <w:webHidden/>
-              </w:rPr>
-            </w:r>
-            <w:r>
-              <w:rPr>
-                <w:noProof/>
-                <w:webHidden/>
-              </w:rPr>
-              <w:fldChar w:fldCharType="separate"/>
-            </w:r>
-            <w:r>
-              <w:rPr>
-                <w:noProof/>
-                <w:webHidden/>
-              </w:rPr>
-              <w:t>7</w:t>
-            </w:r>
-            <w:r>
-              <w:rPr>
-                <w:noProof/>
-                <w:webHidden/>
-              </w:rPr>
-              <w:fldChar w:fldCharType="end"/>
-            </w:r>
-          </w:hyperlink>
-        </w:p>
-        <w:p>
-          <w:pPr>
-            <w:pStyle w:val="TDC2"/>
-            <w:tabs>
-              <w:tab w:val="right" w:leader="dot" w:pos="8494"/>
-            </w:tabs>
-            <w:rPr>
-              <w:rFonts w:eastAsiaTheme="minorEastAsia"/>
-              <w:noProof/>
-              <w:lang w:eastAsia="es-ES"/>
-            </w:rPr>
-          </w:pPr>
-          <w:hyperlink w:anchor="_Toc241259336" w:history="1">
-            <w:r>
-              <w:rPr>
-                <w:rStyle w:val="Hipervnculo"/>
-                <w:noProof/>
-              </w:rPr>
-              <w:t>Color positivo/Color negativo</w:t>
-            </w:r>
-            <w:r>
-              <w:rPr>
-                <w:noProof/>
-                <w:webHidden/>
-              </w:rPr>
-              <w:tab/>
-            </w:r>
-            <w:r>
-              <w:rPr>
-                <w:noProof/>
-                <w:webHidden/>
-              </w:rPr>
-              <w:fldChar w:fldCharType="begin"/>
-            </w:r>
-            <w:r>
-              <w:rPr>
-                <w:noProof/>
-                <w:webHidden/>
-              </w:rPr>
-              <w:instrText xml:space="preserve"> PAGEREF _Toc241259336 \h </w:instrText>
-            </w:r>
-            <w:r>
-              <w:rPr>
-                <w:noProof/>
-                <w:webHidden/>
-              </w:rPr>
-            </w:r>
-            <w:r>
-              <w:rPr>
-                <w:noProof/>
-                <w:webHidden/>
-              </w:rPr>
-              <w:fldChar w:fldCharType="separate"/>
-            </w:r>
-            <w:r>
-              <w:rPr>
-                <w:noProof/>
-                <w:webHidden/>
-              </w:rPr>
-              <w:t>7</w:t>
-            </w:r>
-            <w:r>
-              <w:rPr>
-                <w:noProof/>
-                <w:webHidden/>
-              </w:rPr>
-              <w:fldChar w:fldCharType="end"/>
-            </w:r>
-          </w:hyperlink>
-        </w:p>
-        <w:p>
-          <w:pPr>
-            <w:pStyle w:val="TDC2"/>
-            <w:tabs>
-              <w:tab w:val="right" w:leader="dot" w:pos="8494"/>
-            </w:tabs>
-            <w:rPr>
-              <w:rFonts w:eastAsiaTheme="minorEastAsia"/>
-              <w:noProof/>
-              <w:lang w:eastAsia="es-ES"/>
-            </w:rPr>
-          </w:pPr>
-          <w:hyperlink w:anchor="_Toc241259337" w:history="1">
-            <w:r>
-              <w:rPr>
-                <w:rStyle w:val="Hipervnculo"/>
-                <w:noProof/>
-              </w:rPr>
-              <w:t>Otra tonalidad</w:t>
-            </w:r>
-            <w:r>
-              <w:rPr>
-                <w:noProof/>
-                <w:webHidden/>
-              </w:rPr>
-              <w:tab/>
-            </w:r>
-            <w:r>
-              <w:rPr>
-                <w:noProof/>
-                <w:webHidden/>
-              </w:rPr>
-              <w:fldChar w:fldCharType="begin"/>
-            </w:r>
-            <w:r>
-              <w:rPr>
-                <w:noProof/>
-                <w:webHidden/>
-              </w:rPr>
-              <w:instrText xml:space="preserve"> PAGEREF _Toc241259337 \h </w:instrText>
-            </w:r>
-            <w:r>
-              <w:rPr>
-                <w:noProof/>
-                <w:webHidden/>
-              </w:rPr>
-            </w:r>
-            <w:r>
-              <w:rPr>
-                <w:noProof/>
-                <w:webHidden/>
-              </w:rPr>
-              <w:fldChar w:fldCharType="separate"/>
-            </w:r>
-            <w:r>
-              <w:rPr>
-                <w:noProof/>
-                <w:webHidden/>
-              </w:rPr>
-              <w:t>7</w:t>
-            </w:r>
-            <w:r>
-              <w:rPr>
-                <w:noProof/>
-                <w:webHidden/>
-              </w:rPr>
-              <w:fldChar w:fldCharType="end"/>
-            </w:r>
-          </w:hyperlink>
-        </w:p>
-        <w:p>
-          <w:pPr>
-            <w:pStyle w:val="TDC1"/>
-            <w:tabs>
-              <w:tab w:val="right" w:leader="dot" w:pos="8494"/>
-            </w:tabs>
-            <w:rPr>
-              <w:rFonts w:eastAsiaTheme="minorEastAsia"/>
-              <w:noProof/>
-              <w:lang w:eastAsia="es-ES"/>
-            </w:rPr>
-          </w:pPr>
-          <w:hyperlink w:anchor="_Toc241259338" w:history="1">
-            <w:r>
-              <w:rPr>
-                <w:rStyle w:val="Hipervnculo"/>
-                <w:noProof/>
-              </w:rPr>
-              <w:t>Bibliografía</w:t>
-            </w:r>
-            <w:r>
-              <w:rPr>
-                <w:noProof/>
-                <w:webHidden/>
-              </w:rPr>
-              <w:tab/>
-            </w:r>
-            <w:r>
-              <w:rPr>
-                <w:noProof/>
-                <w:webHidden/>
-              </w:rPr>
-              <w:fldChar w:fldCharType="begin"/>
-            </w:r>
-            <w:r>
-              <w:rPr>
-                <w:noProof/>
-                <w:webHidden/>
-              </w:rPr>
-              <w:instrText xml:space="preserve"> PAGEREF _Toc241259338 \h </w:instrText>
-            </w:r>
-            <w:r>
-              <w:rPr>
-                <w:noProof/>
-                <w:webHidden/>
-              </w:rPr>
-            </w:r>
-            <w:r>
-              <w:rPr>
-                <w:noProof/>
-                <w:webHidden/>
-              </w:rPr>
-              <w:fldChar w:fldCharType="separate"/>
-            </w:r>
-            <w:r>
-              <w:rPr>
-                <w:noProof/>
-                <w:webHidden/>
-              </w:rPr>
-              <w:t>8</w:t>
+              <w:t>9</w:t>
             </w:r>
             <w:r>
               <w:rPr>
@@ -2028,7 +2019,7 @@
         <w:pStyle w:val="Ttulo1"/>
         <w:spacing w:after="240"/>
       </w:pPr>
-      <w:bookmarkStart w:id="0" w:name="_Toc241259319"/>
+      <w:bookmarkStart w:id="0" w:name="_Toc241770112"/>
       <w:r>
         <w:lastRenderedPageBreak/>
         <w:t>Descripción de empresa</w:t>
@@ -2079,7 +2070,7 @@
           <w:lang w:eastAsia="es-ES"/>
         </w:rPr>
         <w:drawing>
-          <wp:inline distT="0" distB="0" distL="0" distR="0" wp14:anchorId="4DE7CAAF" wp14:editId="50578BAB">
+          <wp:inline distT="0" distB="0" distL="0" distR="0" wp14:anchorId="4A4B0B95" wp14:editId="3C08380F">
             <wp:extent cx="5400040" cy="6751955"/>
             <wp:effectExtent l="0" t="0" r="0" b="0"/>
             <wp:docPr id="5" name="Imagen 5"/>
@@ -2120,7 +2111,7 @@
         <w:pStyle w:val="Ttulo1"/>
         <w:spacing w:after="240"/>
       </w:pPr>
-      <w:bookmarkStart w:id="1" w:name="_Toc241259320"/>
+      <w:bookmarkStart w:id="1" w:name="_Toc241770113"/>
       <w:r>
         <w:lastRenderedPageBreak/>
         <w:t>Presentación del l</w:t>
@@ -2134,7 +2125,7 @@
       <w:pPr>
         <w:pStyle w:val="Ttulo2"/>
       </w:pPr>
-      <w:bookmarkStart w:id="2" w:name="_Toc241259321"/>
+      <w:bookmarkStart w:id="2" w:name="_Toc241770114"/>
       <w:r>
         <w:t>Logotipo</w:t>
       </w:r>
@@ -2161,7 +2152,7 @@
           <w:lang w:eastAsia="es-ES"/>
         </w:rPr>
         <w:drawing>
-          <wp:inline distT="0" distB="0" distL="0" distR="0" wp14:anchorId="4995EEC5" wp14:editId="17F5D8A1">
+          <wp:inline distT="0" distB="0" distL="0" distR="0" wp14:anchorId="225B64A1" wp14:editId="27302B6A">
             <wp:extent cx="5400040" cy="1800225"/>
             <wp:effectExtent l="0" t="0" r="0" b="9525"/>
             <wp:docPr id="1" name="Imagen 1"/>
@@ -2201,7 +2192,7 @@
       <w:pPr>
         <w:pStyle w:val="Ttulo2"/>
       </w:pPr>
-      <w:bookmarkStart w:id="3" w:name="_Toc241259322"/>
+      <w:bookmarkStart w:id="3" w:name="_Toc241770115"/>
       <w:r>
         <w:t>Isotipo</w:t>
       </w:r>
@@ -2222,7 +2213,7 @@
           <w:lang w:eastAsia="es-ES"/>
         </w:rPr>
         <w:drawing>
-          <wp:inline distT="0" distB="0" distL="0" distR="0" wp14:anchorId="4D8462E4" wp14:editId="6AD2ACD4">
+          <wp:inline distT="0" distB="0" distL="0" distR="0" wp14:anchorId="7DFE3A73" wp14:editId="1D154FC8">
             <wp:extent cx="5400040" cy="4321810"/>
             <wp:effectExtent l="0" t="0" r="0" b="2540"/>
             <wp:docPr id="8" name="Imagen 8"/>
@@ -2275,7 +2266,7 @@
       <w:pPr>
         <w:pStyle w:val="Ttulo2"/>
       </w:pPr>
-      <w:bookmarkStart w:id="4" w:name="_Toc241259323"/>
+      <w:bookmarkStart w:id="4" w:name="_Toc241770116"/>
       <w:r>
         <w:lastRenderedPageBreak/>
         <w:t>Imagotipo</w:t>
@@ -2322,7 +2313,7 @@
       <w:pPr>
         <w:pStyle w:val="Ttulo2"/>
       </w:pPr>
-      <w:bookmarkStart w:id="5" w:name="_Toc241259324"/>
+      <w:bookmarkStart w:id="5" w:name="_Toc241770117"/>
       <w:r>
         <w:t>I</w:t>
       </w:r>
@@ -2346,7 +2337,7 @@
           <w:lang w:eastAsia="es-ES"/>
         </w:rPr>
         <w:drawing>
-          <wp:inline distT="0" distB="0" distL="0" distR="0" wp14:anchorId="2F3D1F5A" wp14:editId="56E88D8B">
+          <wp:inline distT="0" distB="0" distL="0" distR="0" wp14:anchorId="55A264D3" wp14:editId="5202E332">
             <wp:extent cx="5400040" cy="4050030"/>
             <wp:effectExtent l="0" t="0" r="0" b="7620"/>
             <wp:docPr id="13" name="Imagen 13"/>
@@ -2387,14 +2378,450 @@
     </w:p>
     <w:p>
       <w:pPr>
+        <w:pStyle w:val="Ttulo1"/>
+      </w:pPr>
+      <w:bookmarkStart w:id="6" w:name="_Toc241770118"/>
+      <w:r>
+        <w:lastRenderedPageBreak/>
+        <w:t>Tipografías</w:t>
+      </w:r>
+      <w:bookmarkEnd w:id="6"/>
+    </w:p>
+    <w:p>
+      <w:pPr>
+        <w:rPr>
+          <w:b/>
+        </w:rPr>
+      </w:pPr>
+      <w:r>
+        <w:rPr>
+          <w:b/>
+        </w:rPr>
+        <w:t>Principal y secundaria</w:t>
+      </w:r>
+    </w:p>
+    <w:p>
+      <w:r>
+        <w:t xml:space="preserve">Principal: </w:t>
+      </w:r>
+      <w:r>
+        <w:t>Comfortaa</w:t>
+      </w:r>
+    </w:p>
+    <w:p>
+      <w:r>
+        <w:t xml:space="preserve">Secundaria: </w:t>
+      </w:r>
+      <w:r>
+        <w:t>Gabarito</w:t>
+      </w:r>
+    </w:p>
+    <w:p>
+      <w:pPr>
+        <w:pStyle w:val="Prrafodelista"/>
+        <w:numPr>
+          <w:ilvl w:val="0"/>
+          <w:numId w:val="1"/>
+        </w:numPr>
+      </w:pPr>
+      <w:r>
+        <w:t>Justificación de la elección (según la teoría de tipografías y el porqué de la elección)</w:t>
+      </w:r>
+    </w:p>
+    <w:p>
+      <w:r>
+        <w:t>Mostrar mayúsculas: normal, negrita, cursiva, cursiva + negrita</w:t>
+      </w:r>
+    </w:p>
+    <w:p>
+      <w:r>
+        <w:t>Mostrar minúsculas: normal, negrita, cursiva, cursiva + negrita</w:t>
+      </w:r>
+    </w:p>
+    <w:p>
+      <w:pPr>
         <w:pStyle w:val="Ttulo2"/>
       </w:pPr>
-      <w:bookmarkStart w:id="6" w:name="_Toc241259325"/>
+      <w:bookmarkStart w:id="7" w:name="_Toc241770119"/>
+      <w:r>
+        <w:t>Principal</w:t>
+      </w:r>
+      <w:bookmarkEnd w:id="7"/>
+    </w:p>
+    <w:p>
+      <w:r>
+        <w:t xml:space="preserve">La fuente principal elegida es Comfortaa. Esta fuente </w:t>
+      </w:r>
+      <w:r>
+        <w:t>tiene una apariencia y estilo similares al logotipo de la empresa, con un aspecto más redondeado y llamativo. S</w:t>
+      </w:r>
+      <w:r>
+        <w:t>e usará sobre todo e</w:t>
+      </w:r>
+      <w:r>
+        <w:t>n títulos y textos destacados de mayor tamaño</w:t>
+      </w:r>
+      <w:r>
+        <w:t>.</w:t>
+      </w:r>
+    </w:p>
+    <w:p>
+      <w:r>
+        <w:t xml:space="preserve">Normal: </w:t>
+      </w:r>
+    </w:p>
+    <w:p>
+      <w:pPr>
+        <w:rPr>
+          <w:rFonts w:ascii="Comfortaa" w:hAnsi="Comfortaa"/>
+        </w:rPr>
+      </w:pPr>
+      <w:r>
+        <w:tab/>
+      </w:r>
+      <w:r>
+        <w:rPr>
+          <w:rFonts w:ascii="Comfortaa" w:hAnsi="Comfortaa"/>
+        </w:rPr>
+        <w:t>SNOUTCORE ES UNA EMPRESA DE TECNOLOGÍA</w:t>
+      </w:r>
+    </w:p>
+    <w:p>
+      <w:pPr>
+        <w:ind w:firstLine="708"/>
+        <w:rPr>
+          <w:rFonts w:ascii="Comfortaa" w:hAnsi="Comfortaa"/>
+        </w:rPr>
+      </w:pPr>
+      <w:r>
+        <w:rPr>
+          <w:rFonts w:ascii="Comfortaa" w:hAnsi="Comfortaa"/>
+        </w:rPr>
+        <w:t>snoutcore es una empresa de tecnología</w:t>
+      </w:r>
+    </w:p>
+    <w:p>
+      <w:r>
+        <w:t xml:space="preserve">Negrita: </w:t>
+      </w:r>
+    </w:p>
+    <w:p>
+      <w:pPr>
+        <w:rPr>
+          <w:rFonts w:ascii="Comfortaa" w:hAnsi="Comfortaa"/>
+          <w:b/>
+        </w:rPr>
+      </w:pPr>
+      <w:r>
+        <w:tab/>
+      </w:r>
+      <w:r>
+        <w:rPr>
+          <w:rFonts w:ascii="Comfortaa" w:hAnsi="Comfortaa"/>
+          <w:b/>
+        </w:rPr>
+        <w:t>SNOUTCORE ES UNA EMPRESA DE TECNOLOGÍA</w:t>
+      </w:r>
+    </w:p>
+    <w:p>
+      <w:pPr>
+        <w:ind w:firstLine="708"/>
+        <w:rPr>
+          <w:rFonts w:ascii="Comfortaa" w:hAnsi="Comfortaa"/>
+        </w:rPr>
+      </w:pPr>
+      <w:r>
+        <w:rPr>
+          <w:rFonts w:ascii="Comfortaa" w:hAnsi="Comfortaa"/>
+          <w:b/>
+        </w:rPr>
+        <w:t>snoutcore es una empresa de tecnología</w:t>
+      </w:r>
+    </w:p>
+    <w:p>
+      <w:r>
+        <w:t xml:space="preserve">Cursiva: </w:t>
+      </w:r>
+    </w:p>
+    <w:p>
+      <w:pPr>
+        <w:rPr>
+          <w:rFonts w:ascii="Comfortaa" w:hAnsi="Comfortaa"/>
+          <w:i/>
+        </w:rPr>
+      </w:pPr>
+      <w:r>
+        <w:tab/>
+      </w:r>
+      <w:r>
+        <w:rPr>
+          <w:rFonts w:ascii="Comfortaa" w:hAnsi="Comfortaa"/>
+          <w:i/>
+        </w:rPr>
+        <w:t>SNOUTCORE ES UNA EMPRESA DE TECNOLOGÍA</w:t>
+      </w:r>
+    </w:p>
+    <w:p>
+      <w:pPr>
+        <w:ind w:firstLine="708"/>
+        <w:rPr>
+          <w:i/>
+        </w:rPr>
+      </w:pPr>
+      <w:r>
+        <w:rPr>
+          <w:rFonts w:ascii="Comfortaa" w:hAnsi="Comfortaa"/>
+          <w:i/>
+        </w:rPr>
+        <w:t>snoutcore es una empresa de tecnología</w:t>
+      </w:r>
+    </w:p>
+    <w:p>
+      <w:r>
+        <w:t xml:space="preserve">Negrita + Cursiva: </w:t>
+      </w:r>
+    </w:p>
+    <w:p>
+      <w:pPr>
+        <w:rPr>
+          <w:rFonts w:ascii="Comfortaa" w:hAnsi="Comfortaa"/>
+          <w:b/>
+          <w:i/>
+        </w:rPr>
+      </w:pPr>
+      <w:r>
+        <w:tab/>
+      </w:r>
+      <w:r>
+        <w:rPr>
+          <w:rFonts w:ascii="Comfortaa" w:hAnsi="Comfortaa"/>
+          <w:b/>
+          <w:i/>
+        </w:rPr>
+        <w:t>SNOUTCORE ES UNA EMPRESA DE TECNOLOGÍA</w:t>
+      </w:r>
+    </w:p>
+    <w:p>
+      <w:pPr>
+        <w:ind w:firstLine="708"/>
+        <w:rPr>
+          <w:rFonts w:ascii="Comfortaa" w:hAnsi="Comfortaa"/>
+          <w:b/>
+          <w:i/>
+        </w:rPr>
+      </w:pPr>
+      <w:r>
+        <w:rPr>
+          <w:rFonts w:ascii="Comfortaa" w:hAnsi="Comfortaa"/>
+          <w:b/>
+          <w:i/>
+        </w:rPr>
+        <w:t>snoutcore es una empresa de tecnología</w:t>
+      </w:r>
+    </w:p>
+    <w:p>
+      <w:pPr>
+        <w:rPr>
+          <w:rFonts w:asciiTheme="majorHAnsi" w:eastAsiaTheme="majorEastAsia" w:hAnsiTheme="majorHAnsi" w:cstheme="majorBidi"/>
+          <w:color w:val="2E74B5" w:themeColor="accent1" w:themeShade="BF"/>
+          <w:sz w:val="26"/>
+          <w:szCs w:val="26"/>
+        </w:rPr>
+      </w:pPr>
+      <w:bookmarkStart w:id="8" w:name="_Toc241770120"/>
+      <w:r>
+        <w:br w:type="page"/>
+      </w:r>
+    </w:p>
+    <w:p>
+      <w:pPr>
+        <w:pStyle w:val="Ttulo2"/>
+      </w:pPr>
       <w:r>
         <w:lastRenderedPageBreak/>
+        <w:t>Secundaria</w:t>
+      </w:r>
+      <w:bookmarkEnd w:id="8"/>
+    </w:p>
+    <w:p>
+      <w:r>
+        <w:t>La fuente secundaria elegida es Gabarito. Esta fuente tiene una apariencia más sencilla y agradable de leer en textos largos, con un aspecto más simple y dinámico. Se usará todos los textos, párrafos, etc.</w:t>
+      </w:r>
+    </w:p>
+    <w:p>
+      <w:r>
+        <w:t xml:space="preserve">Normal: </w:t>
+      </w:r>
+    </w:p>
+    <w:p>
+      <w:pPr>
+        <w:rPr>
+          <w:rFonts w:ascii="Gabarito" w:hAnsi="Gabarito"/>
+        </w:rPr>
+      </w:pPr>
+      <w:r>
+        <w:tab/>
+      </w:r>
+      <w:r>
+        <w:rPr>
+          <w:rFonts w:ascii="Gabarito" w:hAnsi="Gabarito"/>
+        </w:rPr>
+        <w:t>SNOUTCORE ES UNA EMPRESA DE TECNOLOGÍA</w:t>
+      </w:r>
+    </w:p>
+    <w:p>
+      <w:pPr>
+        <w:ind w:firstLine="708"/>
+        <w:rPr>
+          <w:rFonts w:ascii="Gabarito" w:hAnsi="Gabarito"/>
+        </w:rPr>
+      </w:pPr>
+      <w:r>
+        <w:rPr>
+          <w:rFonts w:ascii="Gabarito" w:hAnsi="Gabarito"/>
+        </w:rPr>
+        <w:t>snoutcore es una empresa de tecnología</w:t>
+      </w:r>
+    </w:p>
+    <w:p>
+      <w:r>
+        <w:t xml:space="preserve">Negrita: </w:t>
+      </w:r>
+    </w:p>
+    <w:p>
+      <w:pPr>
+        <w:rPr>
+          <w:rFonts w:ascii="Gabarito" w:hAnsi="Gabarito"/>
+          <w:b/>
+        </w:rPr>
+      </w:pPr>
+      <w:r>
+        <w:tab/>
+      </w:r>
+      <w:r>
+        <w:rPr>
+          <w:rFonts w:ascii="Gabarito" w:hAnsi="Gabarito"/>
+          <w:b/>
+        </w:rPr>
+        <w:t>SNOUTCORE ES UNA EMPRESA DE TECNOLOGÍA</w:t>
+      </w:r>
+    </w:p>
+    <w:p>
+      <w:pPr>
+        <w:ind w:firstLine="708"/>
+        <w:rPr>
+          <w:rFonts w:ascii="Gabarito" w:hAnsi="Gabarito"/>
+        </w:rPr>
+      </w:pPr>
+      <w:r>
+        <w:rPr>
+          <w:rFonts w:ascii="Gabarito" w:hAnsi="Gabarito"/>
+          <w:b/>
+        </w:rPr>
+        <w:t>snoutcore es una empresa de tecnología</w:t>
+      </w:r>
+    </w:p>
+    <w:p>
+      <w:r>
+        <w:t xml:space="preserve">Cursiva: </w:t>
+      </w:r>
+    </w:p>
+    <w:p>
+      <w:pPr>
+        <w:rPr>
+          <w:rFonts w:ascii="Gabarito" w:hAnsi="Gabarito"/>
+          <w:i/>
+        </w:rPr>
+      </w:pPr>
+      <w:r>
+        <w:tab/>
+      </w:r>
+      <w:r>
+        <w:rPr>
+          <w:rFonts w:ascii="Gabarito" w:hAnsi="Gabarito"/>
+          <w:i/>
+        </w:rPr>
+        <w:t>SNOUTCORE ES UNA EMPRESA DE TECNOLOGÍA</w:t>
+      </w:r>
+    </w:p>
+    <w:p>
+      <w:pPr>
+        <w:ind w:firstLine="708"/>
+        <w:rPr>
+          <w:rFonts w:ascii="Gabarito" w:hAnsi="Gabarito"/>
+          <w:i/>
+        </w:rPr>
+      </w:pPr>
+      <w:r>
+        <w:rPr>
+          <w:rFonts w:ascii="Gabarito" w:hAnsi="Gabarito"/>
+          <w:i/>
+        </w:rPr>
+        <w:t>snoutcore es una empresa de tecnología</w:t>
+      </w:r>
+    </w:p>
+    <w:p>
+      <w:r>
+        <w:t xml:space="preserve">Negrita + Cursiva: </w:t>
+      </w:r>
+    </w:p>
+    <w:p>
+      <w:pPr>
+        <w:rPr>
+          <w:rFonts w:ascii="Gabarito" w:hAnsi="Gabarito"/>
+          <w:b/>
+          <w:i/>
+        </w:rPr>
+      </w:pPr>
+      <w:r>
+        <w:tab/>
+      </w:r>
+      <w:r>
+        <w:rPr>
+          <w:rFonts w:ascii="Gabarito" w:hAnsi="Gabarito"/>
+          <w:b/>
+          <w:i/>
+        </w:rPr>
+        <w:t>SNOUTCORE ES UNA EMPRESA DE TECNOLOGÍA</w:t>
+      </w:r>
+    </w:p>
+    <w:p>
+      <w:pPr>
+        <w:ind w:firstLine="708"/>
+        <w:rPr>
+          <w:rFonts w:ascii="Gabarito" w:hAnsi="Gabarito"/>
+          <w:b/>
+          <w:i/>
+        </w:rPr>
+      </w:pPr>
+      <w:r>
+        <w:rPr>
+          <w:rFonts w:ascii="Gabarito" w:hAnsi="Gabarito"/>
+          <w:b/>
+          <w:i/>
+        </w:rPr>
+        <w:t>snoutcore es una empresa de tecnología</w:t>
+      </w:r>
+    </w:p>
+    <w:p>
+      <w:pPr>
+        <w:ind w:firstLine="708"/>
+        <w:rPr>
+          <w:rFonts w:ascii="Gabarito" w:hAnsi="Gabarito"/>
+          <w:b/>
+          <w:i/>
+        </w:rPr>
+      </w:pPr>
+    </w:p>
+    <w:p>
+      <w:pPr>
+        <w:pStyle w:val="Ttulo2"/>
+      </w:pPr>
+      <w:bookmarkStart w:id="9" w:name="_Toc241770121"/>
+      <w:r>
         <w:t>Teoría de color</w:t>
       </w:r>
-      <w:bookmarkEnd w:id="6"/>
+      <w:bookmarkEnd w:id="9"/>
     </w:p>
     <w:p>
       <w:r>
@@ -2411,7 +2838,7 @@
           <w:lang w:eastAsia="es-ES"/>
         </w:rPr>
         <w:drawing>
-          <wp:inline distT="0" distB="0" distL="0" distR="0" wp14:anchorId="328B0322" wp14:editId="1A040FF0">
+          <wp:inline distT="0" distB="0" distL="0" distR="0" wp14:anchorId="53D2C842" wp14:editId="585976AC">
             <wp:extent cx="5400040" cy="2219960"/>
             <wp:effectExtent l="0" t="0" r="0" b="8890"/>
             <wp:docPr id="7" name="Imagen 7"/>
@@ -2484,118 +2911,100 @@
     </w:p>
     <w:p>
       <w:r>
-        <w:t>Todos estos atributos se corresponden con la imagen que SnoutCore pretende dar de su propia marca: una empresa leal a sus clientes, que transmita confianza, estabilidad y seguridad y que proporcione, ante todo, calma y paz con sus productos, manteniend</w:t>
+        <w:t xml:space="preserve">Todos estos atributos se corresponden con la imagen que SnoutCore pretende dar de su propia marca: una empresa leal a sus clientes, que transmita confianza, estabilidad y seguridad </w:t>
+      </w:r>
+      <w:r>
+        <w:lastRenderedPageBreak/>
+        <w:t>y que proporcione, ante todo, calma y paz con sus productos, manteniend</w:t>
       </w:r>
       <w:r>
         <w:t>o una estética pura y sencilla.</w:t>
       </w:r>
     </w:p>
     <w:p>
-      <w:r>
-        <w:br w:type="page"/>
-      </w:r>
-    </w:p>
-    <w:p>
       <w:pPr>
         <w:pStyle w:val="Ttulo1"/>
       </w:pPr>
-      <w:bookmarkStart w:id="7" w:name="_Toc241259326"/>
-      <w:r>
-        <w:lastRenderedPageBreak/>
+      <w:bookmarkStart w:id="10" w:name="_Toc241770122"/>
+      <w:r>
         <w:t>Estructura y composición</w:t>
       </w:r>
-      <w:bookmarkEnd w:id="7"/>
+      <w:bookmarkEnd w:id="10"/>
     </w:p>
     <w:p>
       <w:pPr>
         <w:pStyle w:val="Ttulo1"/>
       </w:pPr>
-      <w:bookmarkStart w:id="8" w:name="_Toc241259327"/>
+      <w:bookmarkStart w:id="11" w:name="_Toc241770123"/>
       <w:r>
         <w:t>Área de protección</w:t>
       </w:r>
-      <w:bookmarkEnd w:id="8"/>
+      <w:bookmarkEnd w:id="11"/>
     </w:p>
     <w:p>
       <w:pPr>
         <w:pStyle w:val="Ttulo1"/>
       </w:pPr>
-      <w:bookmarkStart w:id="9" w:name="_Toc241259328"/>
-      <w:r>
-        <w:t>Tipografías</w:t>
-      </w:r>
-      <w:bookmarkEnd w:id="9"/>
-    </w:p>
-    <w:p>
-      <w:bookmarkStart w:id="10" w:name="_Toc241259329"/>
-      <w:r>
-        <w:t>Mostrar mayúsculas: normal, negrita, cursiva, cursiva + negrita</w:t>
-      </w:r>
-    </w:p>
-    <w:p>
-      <w:r>
-        <w:t>Mostrar m</w:t>
-      </w:r>
-      <w:r>
-        <w:t>in</w:t>
-      </w:r>
-      <w:bookmarkStart w:id="11" w:name="_GoBack"/>
-      <w:bookmarkEnd w:id="11"/>
-      <w:r>
-        <w:t>úsculas: normal, negrita, cursiva, cursiva + negrita</w:t>
-      </w:r>
-    </w:p>
-    <w:p>
-      <w:pPr>
-        <w:pStyle w:val="Ttulo2"/>
-      </w:pPr>
-      <w:r>
-        <w:t>Principales</w:t>
-      </w:r>
-      <w:bookmarkEnd w:id="10"/>
-    </w:p>
-    <w:p>
-      <w:pPr>
-        <w:pStyle w:val="Ttulo2"/>
-      </w:pPr>
-      <w:bookmarkStart w:id="12" w:name="_Toc241259330"/>
-      <w:r>
-        <w:t>Secundarias</w:t>
+      <w:bookmarkStart w:id="12" w:name="_Toc241770124"/>
+      <w:r>
+        <w:t>Colores institucionales</w:t>
       </w:r>
       <w:bookmarkEnd w:id="12"/>
     </w:p>
     <w:p>
-      <w:pPr>
-        <w:pStyle w:val="Ttulo1"/>
-      </w:pPr>
-      <w:bookmarkStart w:id="13" w:name="_Toc241259331"/>
-      <w:r>
-        <w:t>Colores institucionales</w:t>
-      </w:r>
-      <w:bookmarkEnd w:id="13"/>
-    </w:p>
-    <w:p>
-      <w:r>
-        <w:t>Al menos 3 colores</w:t>
-      </w:r>
-    </w:p>
-    <w:p>
-      <w:pPr>
-        <w:pStyle w:val="Ttulo1"/>
-      </w:pPr>
-      <w:bookmarkStart w:id="14" w:name="_Toc241259332"/>
-      <w:r>
-        <w:t>Colores secundarios</w:t>
-      </w:r>
-      <w:bookmarkEnd w:id="14"/>
-    </w:p>
-    <w:p>
-      <w:r>
+      <w:r>
+        <w:rPr>
+          <w:noProof/>
+          <w:lang w:eastAsia="es-ES"/>
+        </w:rPr>
         <w:drawing>
-          <wp:inline distT="0" distB="0" distL="0" distR="0" wp14:anchorId="5079039B" wp14:editId="1669E7F2">
-            <wp:extent cx="5400040" cy="2231390"/>
+          <wp:inline distT="0" distB="0" distL="0" distR="0" wp14:anchorId="7B2A977F" wp14:editId="2C02DC5F">
+            <wp:extent cx="5400040" cy="2219960"/>
+            <wp:effectExtent l="0" t="0" r="0" b="8890"/>
+            <wp:docPr id="14" name="Imagen 14"/>
+            <wp:cNvGraphicFramePr>
+              <a:graphicFrameLocks xmlns:a="http://schemas.openxmlformats.org/drawingml/2006/main" noChangeAspect="1"/>
+            </wp:cNvGraphicFramePr>
+            <a:graphic xmlns:a="http://schemas.openxmlformats.org/drawingml/2006/main">
+              <a:graphicData uri="http://schemas.openxmlformats.org/drawingml/2006/picture">
+                <pic:pic xmlns:pic="http://schemas.openxmlformats.org/drawingml/2006/picture">
+                  <pic:nvPicPr>
+                    <pic:cNvPr id="1" name=""/>
+                    <pic:cNvPicPr/>
+                  </pic:nvPicPr>
+                  <pic:blipFill>
+                    <a:blip r:embed="rId14"/>
+                    <a:stretch>
+                      <a:fillRect/>
+                    </a:stretch>
+                  </pic:blipFill>
+                  <pic:spPr>
+                    <a:xfrm>
+                      <a:off x="0" y="0"/>
+                      <a:ext cx="5400040" cy="2219960"/>
+                    </a:xfrm>
+                    <a:prstGeom prst="rect">
+                      <a:avLst/>
+                    </a:prstGeom>
+                  </pic:spPr>
+                </pic:pic>
+              </a:graphicData>
+            </a:graphic>
+          </wp:inline>
+        </w:drawing>
+      </w:r>
+    </w:p>
+    <w:p>
+      <w:r>
+        <w:rPr>
+          <w:noProof/>
+          <w:lang w:eastAsia="es-ES"/>
+        </w:rPr>
+        <w:drawing>
+          <wp:inline distT="0" distB="0" distL="0" distR="0" wp14:anchorId="04CCFE75" wp14:editId="474A8F18">
+            <wp:extent cx="5400040" cy="2217420"/>
             <wp:effectExtent l="0" t="0" r="0" b="0"/>
-            <wp:docPr id="9" name="Imagen 9"/>
+            <wp:docPr id="15" name="Imagen 15"/>
             <wp:cNvGraphicFramePr>
               <a:graphicFrameLocks xmlns:a="http://schemas.openxmlformats.org/drawingml/2006/main" noChangeAspect="1"/>
             </wp:cNvGraphicFramePr>
@@ -2615,7 +3024,7 @@
                   <pic:spPr>
                     <a:xfrm>
                       <a:off x="0" y="0"/>
-                      <a:ext cx="5400040" cy="2231390"/>
+                      <a:ext cx="5400040" cy="2217420"/>
                     </a:xfrm>
                     <a:prstGeom prst="rect">
                       <a:avLst/>
@@ -2632,16 +3041,20 @@
       <w:pPr>
         <w:pStyle w:val="Ttulo1"/>
       </w:pPr>
-      <w:bookmarkStart w:id="15" w:name="_Toc241259333"/>
-      <w:r>
-        <w:t>Colores complementarios</w:t>
-      </w:r>
-      <w:bookmarkEnd w:id="15"/>
-    </w:p>
-    <w:p>
-      <w:r>
+      <w:bookmarkStart w:id="13" w:name="_Toc241770125"/>
+      <w:r>
+        <w:t>Colores secundarios</w:t>
+      </w:r>
+      <w:bookmarkEnd w:id="13"/>
+    </w:p>
+    <w:p>
+      <w:r>
+        <w:rPr>
+          <w:noProof/>
+          <w:lang w:eastAsia="es-ES"/>
+        </w:rPr>
         <w:drawing>
-          <wp:inline distT="0" distB="0" distL="0" distR="0" wp14:anchorId="6CB715E4" wp14:editId="4BE2CE2E">
+          <wp:inline distT="0" distB="0" distL="0" distR="0" wp14:anchorId="1260553A" wp14:editId="14B24CD1">
             <wp:extent cx="5400040" cy="2219960"/>
             <wp:effectExtent l="0" t="0" r="0" b="8890"/>
             <wp:docPr id="10" name="Imagen 10"/>
@@ -2679,37 +3092,14 @@
     </w:p>
     <w:p>
       <w:pPr>
-        <w:rPr>
-          <w:rFonts w:asciiTheme="majorHAnsi" w:eastAsiaTheme="majorEastAsia" w:hAnsiTheme="majorHAnsi" w:cstheme="majorBidi"/>
-          <w:color w:val="2E74B5" w:themeColor="accent1" w:themeShade="BF"/>
-          <w:sz w:val="32"/>
-          <w:szCs w:val="32"/>
-        </w:rPr>
-      </w:pPr>
-      <w:r>
-        <w:br w:type="page"/>
-      </w:r>
-    </w:p>
-    <w:p>
-      <w:pPr>
         <w:pStyle w:val="Ttulo1"/>
       </w:pPr>
-      <w:bookmarkStart w:id="16" w:name="_Toc241259334"/>
+      <w:bookmarkStart w:id="14" w:name="_Toc241770126"/>
       <w:r>
         <w:lastRenderedPageBreak/>
-        <w:t>Positivos y negativos</w:t>
-      </w:r>
-      <w:bookmarkEnd w:id="16"/>
-    </w:p>
-    <w:p>
-      <w:pPr>
-        <w:pStyle w:val="Ttulo2"/>
-      </w:pPr>
-      <w:bookmarkStart w:id="17" w:name="_Toc241259335"/>
-      <w:r>
-        <w:t>B/N</w:t>
-      </w:r>
-      <w:bookmarkEnd w:id="17"/>
+        <w:t>Colores complementarios</w:t>
+      </w:r>
+      <w:bookmarkEnd w:id="14"/>
     </w:p>
     <w:p>
       <w:r>
@@ -2718,10 +3108,10 @@
           <w:lang w:eastAsia="es-ES"/>
         </w:rPr>
         <w:drawing>
-          <wp:inline distT="0" distB="0" distL="0" distR="0" wp14:anchorId="28E422D6" wp14:editId="53192B81">
-            <wp:extent cx="2608976" cy="2089599"/>
-            <wp:effectExtent l="0" t="0" r="1270" b="6350"/>
-            <wp:docPr id="2" name="Imagen 2"/>
+          <wp:inline distT="0" distB="0" distL="0" distR="0" wp14:anchorId="1739B0FD" wp14:editId="1B47A331">
+            <wp:extent cx="5400040" cy="2231390"/>
+            <wp:effectExtent l="0" t="0" r="0" b="0"/>
+            <wp:docPr id="9" name="Imagen 9"/>
             <wp:cNvGraphicFramePr>
               <a:graphicFrameLocks xmlns:a="http://schemas.openxmlformats.org/drawingml/2006/main" noChangeAspect="1"/>
             </wp:cNvGraphicFramePr>
@@ -2741,7 +3131,7 @@
                   <pic:spPr>
                     <a:xfrm>
                       <a:off x="0" y="0"/>
-                      <a:ext cx="2621795" cy="2099866"/>
+                      <a:ext cx="5400040" cy="2231390"/>
                     </a:xfrm>
                     <a:prstGeom prst="rect">
                       <a:avLst/>
@@ -2753,16 +3143,38 @@
           </wp:inline>
         </w:drawing>
       </w:r>
+    </w:p>
+    <w:p>
+      <w:pPr>
+        <w:pStyle w:val="Ttulo1"/>
+      </w:pPr>
+      <w:bookmarkStart w:id="15" w:name="_Toc241770127"/>
+      <w:r>
+        <w:t>Positivos y negativos</w:t>
+      </w:r>
+      <w:bookmarkEnd w:id="15"/>
+    </w:p>
+    <w:p>
+      <w:pPr>
+        <w:pStyle w:val="Ttulo2"/>
+      </w:pPr>
+      <w:bookmarkStart w:id="16" w:name="_Toc241770128"/>
+      <w:r>
+        <w:t>B/N</w:t>
+      </w:r>
+      <w:bookmarkEnd w:id="16"/>
+    </w:p>
+    <w:p>
       <w:r>
         <w:rPr>
           <w:noProof/>
           <w:lang w:eastAsia="es-ES"/>
         </w:rPr>
         <w:drawing>
-          <wp:inline distT="0" distB="0" distL="0" distR="0" wp14:anchorId="07A6E3CF" wp14:editId="287E3DEA">
-            <wp:extent cx="2617365" cy="2096315"/>
-            <wp:effectExtent l="0" t="0" r="0" b="0"/>
-            <wp:docPr id="3" name="Imagen 3"/>
+          <wp:inline distT="0" distB="0" distL="0" distR="0" wp14:anchorId="264C5B01" wp14:editId="5A4C04C9">
+            <wp:extent cx="2608976" cy="2089599"/>
+            <wp:effectExtent l="0" t="0" r="1270" b="6350"/>
+            <wp:docPr id="2" name="Imagen 2"/>
             <wp:cNvGraphicFramePr>
               <a:graphicFrameLocks xmlns:a="http://schemas.openxmlformats.org/drawingml/2006/main" noChangeAspect="1"/>
             </wp:cNvGraphicFramePr>
@@ -2782,6 +3194,47 @@
                   <pic:spPr>
                     <a:xfrm>
                       <a:off x="0" y="0"/>
+                      <a:ext cx="2621795" cy="2099866"/>
+                    </a:xfrm>
+                    <a:prstGeom prst="rect">
+                      <a:avLst/>
+                    </a:prstGeom>
+                  </pic:spPr>
+                </pic:pic>
+              </a:graphicData>
+            </a:graphic>
+          </wp:inline>
+        </w:drawing>
+      </w:r>
+      <w:r>
+        <w:rPr>
+          <w:noProof/>
+          <w:lang w:eastAsia="es-ES"/>
+        </w:rPr>
+        <w:drawing>
+          <wp:inline distT="0" distB="0" distL="0" distR="0" wp14:anchorId="3160818A" wp14:editId="5E5661E6">
+            <wp:extent cx="2617365" cy="2096315"/>
+            <wp:effectExtent l="0" t="0" r="0" b="0"/>
+            <wp:docPr id="3" name="Imagen 3"/>
+            <wp:cNvGraphicFramePr>
+              <a:graphicFrameLocks xmlns:a="http://schemas.openxmlformats.org/drawingml/2006/main" noChangeAspect="1"/>
+            </wp:cNvGraphicFramePr>
+            <a:graphic xmlns:a="http://schemas.openxmlformats.org/drawingml/2006/main">
+              <a:graphicData uri="http://schemas.openxmlformats.org/drawingml/2006/picture">
+                <pic:pic xmlns:pic="http://schemas.openxmlformats.org/drawingml/2006/picture">
+                  <pic:nvPicPr>
+                    <pic:cNvPr id="1" name=""/>
+                    <pic:cNvPicPr/>
+                  </pic:nvPicPr>
+                  <pic:blipFill>
+                    <a:blip r:embed="rId19"/>
+                    <a:stretch>
+                      <a:fillRect/>
+                    </a:stretch>
+                  </pic:blipFill>
+                  <pic:spPr>
+                    <a:xfrm>
+                      <a:off x="0" y="0"/>
                       <a:ext cx="2625657" cy="2102956"/>
                     </a:xfrm>
                     <a:prstGeom prst="rect">
@@ -2799,11 +3252,11 @@
       <w:pPr>
         <w:pStyle w:val="Ttulo2"/>
       </w:pPr>
-      <w:bookmarkStart w:id="18" w:name="_Toc241259336"/>
+      <w:bookmarkStart w:id="17" w:name="_Toc241770129"/>
       <w:r>
         <w:t>Color positivo/Color negativo</w:t>
       </w:r>
-      <w:bookmarkEnd w:id="18"/>
+      <w:bookmarkEnd w:id="17"/>
     </w:p>
     <w:p>
       <w:r>
@@ -2812,7 +3265,7 @@
           <w:lang w:eastAsia="es-ES"/>
         </w:rPr>
         <w:drawing>
-          <wp:inline distT="0" distB="0" distL="0" distR="0">
+          <wp:inline distT="0" distB="0" distL="0" distR="0" wp14:anchorId="32F69B6F" wp14:editId="39B5B3DC">
             <wp:extent cx="2608976" cy="2092663"/>
             <wp:effectExtent l="0" t="0" r="1270" b="3175"/>
             <wp:docPr id="11" name="Imagen 11" descr="SnoutCore_Imagotipo"/>
@@ -2829,7 +3282,7 @@
                     </pic:cNvPicPr>
                   </pic:nvPicPr>
                   <pic:blipFill>
-                    <a:blip r:embed="rId19">
+                    <a:blip r:embed="rId20">
                       <a:extLst>
                         <a:ext uri="{28A0092B-C50C-407E-A947-70E740481C1C}">
                           <a14:useLocalDpi xmlns:a14="http://schemas.microsoft.com/office/drawing/2010/main" val="0"/>
@@ -2866,53 +3319,10 @@
           <w:lang w:eastAsia="es-ES"/>
         </w:rPr>
         <w:drawing>
-          <wp:inline distT="0" distB="0" distL="0" distR="0" wp14:anchorId="0117897C" wp14:editId="0C54E4CA">
+          <wp:inline distT="0" distB="0" distL="0" distR="0" wp14:anchorId="0AC1E427" wp14:editId="4B5A6EDB">
             <wp:extent cx="2617365" cy="2096315"/>
             <wp:effectExtent l="0" t="0" r="0" b="0"/>
             <wp:docPr id="12" name="Imagen 12"/>
-            <wp:cNvGraphicFramePr>
-              <a:graphicFrameLocks xmlns:a="http://schemas.openxmlformats.org/drawingml/2006/main" noChangeAspect="1"/>
-            </wp:cNvGraphicFramePr>
-            <a:graphic xmlns:a="http://schemas.openxmlformats.org/drawingml/2006/main">
-              <a:graphicData uri="http://schemas.openxmlformats.org/drawingml/2006/picture">
-                <pic:pic xmlns:pic="http://schemas.openxmlformats.org/drawingml/2006/picture">
-                  <pic:nvPicPr>
-                    <pic:cNvPr id="1" name=""/>
-                    <pic:cNvPicPr/>
-                  </pic:nvPicPr>
-                  <pic:blipFill>
-                    <a:blip r:embed="rId20"/>
-                    <a:stretch>
-                      <a:fillRect/>
-                    </a:stretch>
-                  </pic:blipFill>
-                  <pic:spPr>
-                    <a:xfrm>
-                      <a:off x="0" y="0"/>
-                      <a:ext cx="2659148" cy="2129780"/>
-                    </a:xfrm>
-                    <a:prstGeom prst="rect">
-                      <a:avLst/>
-                    </a:prstGeom>
-                  </pic:spPr>
-                </pic:pic>
-              </a:graphicData>
-            </a:graphic>
-          </wp:inline>
-        </w:drawing>
-      </w:r>
-    </w:p>
-    <w:p>
-      <w:r>
-        <w:rPr>
-          <w:noProof/>
-          <w:lang w:eastAsia="es-ES"/>
-        </w:rPr>
-        <w:drawing>
-          <wp:inline distT="0" distB="0" distL="0" distR="0" wp14:anchorId="7B37BAF9" wp14:editId="1B40F7A9">
-            <wp:extent cx="2639006" cy="2113647"/>
-            <wp:effectExtent l="0" t="0" r="9525" b="1270"/>
-            <wp:docPr id="4" name="Imagen 4"/>
             <wp:cNvGraphicFramePr>
               <a:graphicFrameLocks xmlns:a="http://schemas.openxmlformats.org/drawingml/2006/main" noChangeAspect="1"/>
             </wp:cNvGraphicFramePr>
@@ -2932,7 +3342,7 @@
                   <pic:spPr>
                     <a:xfrm>
                       <a:off x="0" y="0"/>
-                      <a:ext cx="2661867" cy="2131957"/>
+                      <a:ext cx="2659148" cy="2129780"/>
                     </a:xfrm>
                     <a:prstGeom prst="rect">
                       <a:avLst/>
@@ -2944,16 +3354,19 @@
           </wp:inline>
         </w:drawing>
       </w:r>
+    </w:p>
+    <w:p>
       <w:r>
         <w:rPr>
           <w:noProof/>
           <w:lang w:eastAsia="es-ES"/>
         </w:rPr>
+        <w:lastRenderedPageBreak/>
         <w:drawing>
-          <wp:inline distT="0" distB="0" distL="0" distR="0" wp14:anchorId="455E30E2" wp14:editId="3A07C21D">
-            <wp:extent cx="2634143" cy="2109755"/>
-            <wp:effectExtent l="0" t="0" r="0" b="5080"/>
-            <wp:docPr id="6" name="Imagen 6"/>
+          <wp:inline distT="0" distB="0" distL="0" distR="0" wp14:anchorId="675B945C" wp14:editId="3F576E3B">
+            <wp:extent cx="2639006" cy="2113647"/>
+            <wp:effectExtent l="0" t="0" r="9525" b="1270"/>
+            <wp:docPr id="4" name="Imagen 4"/>
             <wp:cNvGraphicFramePr>
               <a:graphicFrameLocks xmlns:a="http://schemas.openxmlformats.org/drawingml/2006/main" noChangeAspect="1"/>
             </wp:cNvGraphicFramePr>
@@ -2973,6 +3386,47 @@
                   <pic:spPr>
                     <a:xfrm>
                       <a:off x="0" y="0"/>
+                      <a:ext cx="2661867" cy="2131957"/>
+                    </a:xfrm>
+                    <a:prstGeom prst="rect">
+                      <a:avLst/>
+                    </a:prstGeom>
+                  </pic:spPr>
+                </pic:pic>
+              </a:graphicData>
+            </a:graphic>
+          </wp:inline>
+        </w:drawing>
+      </w:r>
+      <w:r>
+        <w:rPr>
+          <w:noProof/>
+          <w:lang w:eastAsia="es-ES"/>
+        </w:rPr>
+        <w:drawing>
+          <wp:inline distT="0" distB="0" distL="0" distR="0" wp14:anchorId="182C9AFD" wp14:editId="02428F51">
+            <wp:extent cx="2634143" cy="2109755"/>
+            <wp:effectExtent l="0" t="0" r="0" b="5080"/>
+            <wp:docPr id="6" name="Imagen 6"/>
+            <wp:cNvGraphicFramePr>
+              <a:graphicFrameLocks xmlns:a="http://schemas.openxmlformats.org/drawingml/2006/main" noChangeAspect="1"/>
+            </wp:cNvGraphicFramePr>
+            <a:graphic xmlns:a="http://schemas.openxmlformats.org/drawingml/2006/main">
+              <a:graphicData uri="http://schemas.openxmlformats.org/drawingml/2006/picture">
+                <pic:pic xmlns:pic="http://schemas.openxmlformats.org/drawingml/2006/picture">
+                  <pic:nvPicPr>
+                    <pic:cNvPr id="1" name=""/>
+                    <pic:cNvPicPr/>
+                  </pic:nvPicPr>
+                  <pic:blipFill>
+                    <a:blip r:embed="rId23"/>
+                    <a:stretch>
+                      <a:fillRect/>
+                    </a:stretch>
+                  </pic:blipFill>
+                  <pic:spPr>
+                    <a:xfrm>
+                      <a:off x="0" y="0"/>
                       <a:ext cx="2655832" cy="2127126"/>
                     </a:xfrm>
                     <a:prstGeom prst="rect">
@@ -2990,16 +3444,18 @@
       <w:pPr>
         <w:pStyle w:val="Ttulo2"/>
       </w:pPr>
-      <w:bookmarkStart w:id="19" w:name="_Toc241259337"/>
+      <w:bookmarkStart w:id="18" w:name="_Toc241770130"/>
       <w:r>
         <w:t>Otra tonalidad</w:t>
       </w:r>
+      <w:bookmarkEnd w:id="18"/>
+    </w:p>
+    <w:p>
+      <w:r>
+        <w:t>Colores secundarios</w:t>
+      </w:r>
+      <w:bookmarkStart w:id="19" w:name="_GoBack"/>
       <w:bookmarkEnd w:id="19"/>
-    </w:p>
-    <w:p>
-      <w:r>
-        <w:t>Colores secundarios</w:t>
-      </w:r>
       <w:r>
         <w:br w:type="page"/>
       </w:r>
@@ -3010,7 +3466,7 @@
         <w:spacing w:after="240"/>
       </w:pPr>
       <w:bookmarkStart w:id="20" w:name="_Toc240646882"/>
-      <w:bookmarkStart w:id="21" w:name="_Toc241259338"/>
+      <w:bookmarkStart w:id="21" w:name="_Toc241770131"/>
       <w:r>
         <w:lastRenderedPageBreak/>
         <w:t>Bibliografía</w:t>
@@ -3023,17 +3479,9 @@
         <w:spacing w:after="240"/>
       </w:pPr>
       <w:r>
-        <w:t xml:space="preserve">Design.com para el concepto inicial del </w:t>
-      </w:r>
-      <w:proofErr w:type="spellStart"/>
-      <w:r>
-        <w:t>imagotipo</w:t>
-      </w:r>
-      <w:proofErr w:type="spellEnd"/>
-      <w:r>
-        <w:t xml:space="preserve">: </w:t>
-      </w:r>
-      <w:hyperlink r:id="rId23" w:history="1">
+        <w:t xml:space="preserve">Design.com para el concepto inicial del imagotipo: </w:t>
+      </w:r>
+      <w:hyperlink r:id="rId24" w:history="1">
         <w:r>
           <w:rPr>
             <w:rStyle w:val="Hipervnculo"/>
@@ -3049,15 +3497,10 @@
           <w:rStyle w:val="Hipervnculo"/>
         </w:rPr>
       </w:pPr>
-      <w:proofErr w:type="spellStart"/>
-      <w:r>
-        <w:t>Gemini</w:t>
-      </w:r>
-      <w:proofErr w:type="spellEnd"/>
-      <w:r>
-        <w:t xml:space="preserve"> para las variantes del Imagotipo y el anuncio: </w:t>
-      </w:r>
-      <w:hyperlink r:id="rId24" w:history="1">
+      <w:r>
+        <w:t xml:space="preserve">Gemini para las variantes del Imagotipo y el anuncio: </w:t>
+      </w:r>
+      <w:hyperlink r:id="rId25" w:history="1">
         <w:r>
           <w:rPr>
             <w:rStyle w:val="Hipervnculo"/>
@@ -3070,15 +3513,10 @@
       <w:pPr>
         <w:spacing w:after="240"/>
       </w:pPr>
-      <w:proofErr w:type="spellStart"/>
-      <w:r>
-        <w:t>Coolors</w:t>
-      </w:r>
-      <w:proofErr w:type="spellEnd"/>
-      <w:r>
-        <w:t xml:space="preserve"> para las referencias de las paletas de colores: </w:t>
-      </w:r>
-      <w:hyperlink r:id="rId25" w:history="1">
+      <w:r>
+        <w:t xml:space="preserve">Coolors para las referencias de las paletas de colores: </w:t>
+      </w:r>
+      <w:hyperlink r:id="rId26" w:history="1">
         <w:r>
           <w:rPr>
             <w:rStyle w:val="Hipervnculo"/>
@@ -3093,9 +3531,9 @@
       </w:pPr>
     </w:p>
     <w:sectPr>
-      <w:headerReference w:type="default" r:id="rId26"/>
-      <w:footerReference w:type="default" r:id="rId27"/>
-      <w:headerReference w:type="first" r:id="rId28"/>
+      <w:headerReference w:type="default" r:id="rId27"/>
+      <w:footerReference w:type="default" r:id="rId28"/>
+      <w:headerReference w:type="first" r:id="rId29"/>
       <w:pgSz w:w="11906" w:h="16838"/>
       <w:pgMar w:top="1417" w:right="1701" w:bottom="1417" w:left="1701" w:header="708" w:footer="708" w:gutter="0"/>
       <w:pgNumType w:start="0"/>
@@ -3141,7 +3579,6 @@
         <w:docPartUnique/>
       </w:docPartObj>
     </w:sdtPr>
-    <w:sdtEndPr/>
     <w:sdtContent>
       <w:p>
         <w:pPr>
@@ -3161,7 +3598,7 @@
           <w:rPr>
             <w:noProof/>
           </w:rPr>
-          <w:t>6</w:t>
+          <w:t>7</w:t>
         </w:r>
         <w:r>
           <w:fldChar w:fldCharType="end"/>
@@ -3742,7 +4179,7 @@
   <w:style w:type="paragraph" w:default="1" w:styleId="Normal">
     <w:name w:val="Normal"/>
     <w:qFormat/>
-    <w:rsid w:val="005D411B"/>
+    <w:rsid w:val="008E1933"/>
   </w:style>
   <w:style w:type="paragraph" w:styleId="Ttulo1">
     <w:name w:val="heading 1"/>
@@ -3790,7 +4227,6 @@
   <w:style w:type="character" w:default="1" w:styleId="Fuentedeprrafopredeter">
     <w:name w:val="Default Paragraph Font"/>
     <w:uiPriority w:val="1"/>
-    <w:semiHidden/>
     <w:unhideWhenUsed/>
   </w:style>
   <w:style w:type="table" w:default="1" w:styleId="Tablanormal">
@@ -4276,7 +4712,7 @@
 </file>
 
 <file path=customXml/itemProps2.xml><?xml version="1.0" encoding="utf-8"?>
-<ds:datastoreItem xmlns:ds="http://schemas.openxmlformats.org/officeDocument/2006/customXml" ds:itemID="{2BF143C0-CCEB-4406-8059-A0102FF031B4}">
+<ds:datastoreItem xmlns:ds="http://schemas.openxmlformats.org/officeDocument/2006/customXml" ds:itemID="{EB2FF66B-06F2-4BEA-8E1D-9CF006DF184A}">
   <ds:schemaRefs>
     <ds:schemaRef ds:uri="http://schemas.openxmlformats.org/officeDocument/2006/bibliography"/>
   </ds:schemaRefs>

</xml_diff>